<commit_message>
Changed somethings in my Resume
</commit_message>
<xml_diff>
--- a/images/Data Analyst - Resume.docx
+++ b/images/Data Analyst - Resume.docx
@@ -1,6 +1,6 @@
 
 <file path=word/document.xml><?xml version="1.0" encoding="utf-8"?>
-<w:document xmlns:wpc="http://schemas.microsoft.com/office/word/2010/wordprocessingCanvas" xmlns:cx="http://schemas.microsoft.com/office/drawing/2014/chartex" xmlns:cx1="http://schemas.microsoft.com/office/drawing/2015/9/8/chartex" xmlns:cx2="http://schemas.microsoft.com/office/drawing/2015/10/21/chartex" xmlns:cx3="http://schemas.microsoft.com/office/drawing/2016/5/9/chartex" xmlns:cx4="http://schemas.microsoft.com/office/drawing/2016/5/10/chartex" xmlns:cx5="http://schemas.microsoft.com/office/drawing/2016/5/11/chartex" xmlns:cx6="http://schemas.microsoft.com/office/drawing/2016/5/12/chartex" xmlns:cx7="http://schemas.microsoft.com/office/drawing/2016/5/13/chartex" xmlns:cx8="http://schemas.microsoft.com/office/drawing/2016/5/14/chartex" xmlns:mc="http://schemas.openxmlformats.org/markup-compatibility/2006" xmlns:aink="http://schemas.microsoft.com/office/drawing/2016/ink" xmlns:am3d="http://schemas.microsoft.com/office/drawing/2017/model3d" xmlns:o="urn:schemas-microsoft-com:office:office" xmlns:oel="http://schemas.microsoft.com/office/2019/extlst" xmlns:r="http://schemas.openxmlformats.org/officeDocument/2006/relationships" xmlns:m="http://schemas.openxmlformats.org/officeDocument/2006/math" xmlns:v="urn:schemas-microsoft-com:vml" xmlns:wp14="http://schemas.microsoft.com/office/word/2010/wordprocessingDrawing" xmlns:wp="http://schemas.openxmlformats.org/drawingml/2006/wordprocessingDrawing" xmlns:w10="urn:schemas-microsoft-com:office:word" xmlns:w="http://schemas.openxmlformats.org/wordprocessingml/2006/main" xmlns:w14="http://schemas.microsoft.com/office/word/2010/wordml" xmlns:w15="http://schemas.microsoft.com/office/word/2012/wordml" xmlns:w16cex="http://schemas.microsoft.com/office/word/2018/wordml/cex" xmlns:w16cid="http://schemas.microsoft.com/office/word/2016/wordml/cid" xmlns:w16="http://schemas.microsoft.com/office/word/2018/wordml" xmlns:w16du="http://schemas.microsoft.com/office/word/2023/wordml/word16du" xmlns:w16sdtdh="http://schemas.microsoft.com/office/word/2020/wordml/sdtdatahash" xmlns:w16sdtfl="http://schemas.microsoft.com/office/word/2024/wordml/sdtformatlock" xmlns:w16se="http://schemas.microsoft.com/office/word/2015/wordml/symex" xmlns:wpg="http://schemas.microsoft.com/office/word/2010/wordprocessingGroup" xmlns:wpi="http://schemas.microsoft.com/office/word/2010/wordprocessingInk" xmlns:wne="http://schemas.microsoft.com/office/word/2006/wordml" xmlns:wps="http://schemas.microsoft.com/office/word/2010/wordprocessingShape" mc:Ignorable="w14 w15 w16se w16cid w16 w16cex w16sdtdh w16sdtfl w16du wp14">
+<w:document xmlns:wpc="http://schemas.microsoft.com/office/word/2010/wordprocessingCanvas" xmlns:mc="http://schemas.openxmlformats.org/markup-compatibility/2006" xmlns:o="urn:schemas-microsoft-com:office:office" xmlns:r="http://schemas.openxmlformats.org/officeDocument/2006/relationships" xmlns:m="http://schemas.openxmlformats.org/officeDocument/2006/math" xmlns:v="urn:schemas-microsoft-com:vml" xmlns:wp14="http://schemas.microsoft.com/office/word/2010/wordprocessingDrawing" xmlns:wp="http://schemas.openxmlformats.org/drawingml/2006/wordprocessingDrawing" xmlns:w="http://schemas.openxmlformats.org/wordprocessingml/2006/main" xmlns:w14="http://schemas.microsoft.com/office/word/2010/wordml" xmlns:w10="urn:schemas-microsoft-com:office:word" xmlns:w15="http://schemas.microsoft.com/office/word/2012/wordml" xmlns:wpg="http://schemas.microsoft.com/office/word/2010/wordprocessingGroup" xmlns:wpi="http://schemas.microsoft.com/office/word/2010/wordprocessingInk" xmlns:wne="http://schemas.microsoft.com/office/word/2006/wordml" xmlns:wps="http://schemas.microsoft.com/office/word/2010/wordprocessingShape" xmlns:wpsCustomData="http://www.wps.cn/officeDocument/2013/wpsCustomData" mc:Ignorable="w14 w15 wp14">
   <w:body>
     <w:p>
       <w:pPr>
@@ -26,58 +26,115 @@
         <w:rPr>
           <w:sz w:val="24"/>
         </w:rPr>
-        <w:t>muriithijasan@gmail.com | +</w:t>
+        <w:t xml:space="preserve">muriithijasan@gmail.com | +254 743 258 629 | Nairobi, ke | </w:t>
       </w:r>
       <w:r>
         <w:rPr>
-          <w:sz w:val="24"/>
+          <w:rFonts w:hint="eastAsia" w:ascii="Calibri" w:hAnsi="Calibri" w:eastAsia="Calibri" w:cs="Times New Roman"/>
+          <w:sz w:val="22"/>
+          <w:szCs w:val="22"/>
+          <w:lang w:val="en-US" w:eastAsia="en-US" w:bidi="ar"/>
         </w:rPr>
-        <w:t>254 743 258 629</w:t>
+        <w:fldChar w:fldCharType="begin"/>
       </w:r>
       <w:r>
         <w:rPr>
-          <w:sz w:val="24"/>
+          <w:rFonts w:hint="eastAsia" w:ascii="Calibri" w:hAnsi="Calibri" w:eastAsia="Calibri" w:cs="Times New Roman"/>
+          <w:sz w:val="22"/>
+          <w:szCs w:val="22"/>
+          <w:lang w:val="en-US" w:eastAsia="en-US" w:bidi="ar"/>
+        </w:rPr>
+        <w:instrText xml:space="preserve"> HYPERLINK "https://www.linkedin.com/in/jasan-muriithi-625503319/" \t "_blank" </w:instrText>
+      </w:r>
+      <w:r>
+        <w:rPr>
+          <w:rFonts w:hint="eastAsia" w:ascii="Calibri" w:hAnsi="Calibri" w:eastAsia="Calibri" w:cs="Times New Roman"/>
+          <w:sz w:val="22"/>
+          <w:szCs w:val="22"/>
+          <w:lang w:val="en-US" w:eastAsia="en-US" w:bidi="ar"/>
+        </w:rPr>
+        <w:fldChar w:fldCharType="separate"/>
+      </w:r>
+      <w:r>
+        <w:rPr>
+          <w:rStyle w:val="5"/>
+          <w:rFonts w:hint="eastAsia" w:ascii="Calibri" w:hAnsi="Calibri" w:eastAsia="Calibri" w:cs="Times New Roman"/>
+          <w:sz w:val="22"/>
+          <w:szCs w:val="22"/>
+          <w:u w:val="single"/>
+          <w:lang w:val="en-US" w:eastAsia="en-US" w:bidi="ar"/>
+        </w:rPr>
+        <w:t>LinkedIn</w:t>
+      </w:r>
+      <w:r>
+        <w:rPr>
+          <w:rFonts w:hint="eastAsia" w:ascii="Calibri" w:hAnsi="Calibri" w:eastAsia="Calibri" w:cs="Times New Roman"/>
+          <w:sz w:val="22"/>
+          <w:szCs w:val="22"/>
+          <w:lang w:val="en-US" w:eastAsia="en-US" w:bidi="ar"/>
+        </w:rPr>
+        <w:fldChar w:fldCharType="end"/>
+      </w:r>
+      <w:r>
+        <w:rPr>
+          <w:rFonts w:hint="eastAsia" w:ascii="Calibri" w:hAnsi="Calibri" w:eastAsia="Calibri" w:cs="Times New Roman"/>
+          <w:sz w:val="22"/>
+          <w:szCs w:val="22"/>
+          <w:lang w:val="en-US" w:eastAsia="en-US" w:bidi="ar"/>
         </w:rPr>
         <w:t xml:space="preserve"> | </w:t>
       </w:r>
       <w:r>
         <w:rPr>
-          <w:sz w:val="24"/>
+          <w:rFonts w:hint="eastAsia" w:ascii="Calibri" w:hAnsi="Calibri" w:eastAsia="Calibri" w:cs="Times New Roman"/>
+          <w:sz w:val="22"/>
+          <w:szCs w:val="22"/>
+          <w:lang w:val="en-US" w:eastAsia="en-US" w:bidi="ar"/>
         </w:rPr>
-        <w:t>Nairobi</w:t>
+        <w:fldChar w:fldCharType="begin"/>
       </w:r>
       <w:r>
         <w:rPr>
-          <w:sz w:val="24"/>
+          <w:rFonts w:hint="eastAsia" w:ascii="Calibri" w:hAnsi="Calibri" w:eastAsia="Calibri" w:cs="Times New Roman"/>
+          <w:sz w:val="22"/>
+          <w:szCs w:val="22"/>
+          <w:lang w:val="en-US" w:eastAsia="en-US" w:bidi="ar"/>
         </w:rPr>
-        <w:t xml:space="preserve">, </w:t>
-      </w:r>
-      <w:proofErr w:type="spellStart"/>
+        <w:instrText xml:space="preserve"> HYPERLINK "https://github.com/nasaj1284" \t "_blank" </w:instrText>
+      </w:r>
       <w:r>
         <w:rPr>
-          <w:sz w:val="24"/>
+          <w:rFonts w:hint="eastAsia" w:ascii="Calibri" w:hAnsi="Calibri" w:eastAsia="Calibri" w:cs="Times New Roman"/>
+          <w:sz w:val="22"/>
+          <w:szCs w:val="22"/>
+          <w:lang w:val="en-US" w:eastAsia="en-US" w:bidi="ar"/>
         </w:rPr>
-        <w:t>ke</w:t>
-      </w:r>
-      <w:proofErr w:type="spellEnd"/>
+        <w:fldChar w:fldCharType="separate"/>
+      </w:r>
       <w:r>
         <w:rPr>
-          <w:sz w:val="24"/>
+          <w:rStyle w:val="6"/>
+          <w:rFonts w:hint="eastAsia" w:ascii="Calibri" w:hAnsi="Calibri" w:eastAsia="Calibri" w:cs="Times New Roman"/>
+          <w:sz w:val="22"/>
+          <w:szCs w:val="22"/>
+          <w:u w:val="single"/>
+          <w:lang w:val="en-US" w:eastAsia="en-US" w:bidi="ar"/>
         </w:rPr>
-        <w:t xml:space="preserve"> | Jasan </w:t>
-      </w:r>
-      <w:proofErr w:type="spellStart"/>
+        <w:t>GitHub</w:t>
+      </w:r>
       <w:r>
         <w:rPr>
-          <w:sz w:val="24"/>
+          <w:rFonts w:hint="eastAsia" w:ascii="Calibri" w:hAnsi="Calibri" w:eastAsia="Calibri" w:cs="Times New Roman"/>
+          <w:sz w:val="22"/>
+          <w:szCs w:val="22"/>
+          <w:lang w:val="en-US" w:eastAsia="en-US" w:bidi="ar"/>
         </w:rPr>
-        <w:t>Muriithi@linkedin</w:t>
-      </w:r>
-      <w:proofErr w:type="spellEnd"/>
-    </w:p>
-    <w:p>
-      <w:pPr>
-        <w:pStyle w:val="Heading1"/>
+        <w:fldChar w:fldCharType="end"/>
+      </w:r>
+    </w:p>
+    <w:p>
+      <w:pPr>
+        <w:pStyle w:val="2"/>
         <w:ind w:left="-5"/>
       </w:pPr>
       <w:r>
@@ -92,14 +149,13 @@
       </w:pPr>
       <w:r>
         <w:rPr>
-          <w:rFonts w:ascii="Calibri" w:eastAsia="Calibri" w:hAnsi="Calibri" w:cs="Calibri"/>
-          <w:noProof/>
+          <w:rFonts w:ascii="Calibri" w:hAnsi="Calibri" w:eastAsia="Calibri" w:cs="Calibri"/>
           <w:sz w:val="22"/>
         </w:rPr>
         <mc:AlternateContent>
           <mc:Choice Requires="wpg">
             <w:drawing>
-              <wp:inline distT="0" distB="0" distL="0" distR="0" wp14:anchorId="70882562" wp14:editId="320F1411">
+              <wp:inline distT="0" distB="0" distL="0" distR="0">
                 <wp:extent cx="5943600" cy="12700"/>
                 <wp:effectExtent l="0" t="0" r="0" b="0"/>
                 <wp:docPr id="1243" name="Group 1243"/>
@@ -177,13 +233,18 @@
               </wp:inline>
             </w:drawing>
           </mc:Choice>
-          <mc:Fallback xmlns:a="http://schemas.openxmlformats.org/drawingml/2006/main">
+          <mc:Fallback>
             <w:pict>
-              <v:group id="Group 1243" style="width:468pt;height:1pt;mso-position-horizontal-relative:char;mso-position-vertical-relative:line" coordsize="59436,127">
-                <v:shape id="Shape 16" style="position:absolute;width:59436;height:0;left:0;top:0;" coordsize="5943600,0" path="m5943600,0c5943600,0,5943600,0,5943600,0l0,0c0,0,0,0,0,0">
-                  <v:stroke weight="1pt" endcap="flat" joinstyle="miter" miterlimit="10" on="true" color="#000000"/>
-                  <v:fill on="false" color="#000000" opacity="0"/>
+              <v:group id="_x0000_s1026" o:spid="_x0000_s1026" o:spt="203" style="height:1pt;width:468pt;" coordsize="5943600,12700" o:gfxdata="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">
+                <o:lock v:ext="edit" aspectratio="f"/>
+                <v:shape id="Shape 16" o:spid="_x0000_s1026" o:spt="100" style="position:absolute;left:0;top:0;height:0;width:5943600;" filled="f" stroked="t" coordsize="5943600,1" o:gfxdata="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" path="m5943600,0c5943600,0,5943600,0,5943600,0l0,0c0,0,0,0,0,0e">
+                  <v:fill on="f" focussize="0,0"/>
+                  <v:stroke weight="1pt" color="#000000" miterlimit="1" joinstyle="miter"/>
+                  <v:imagedata o:title=""/>
+                  <o:lock v:ext="edit" aspectratio="f"/>
                 </v:shape>
+                <w10:wrap type="none"/>
+                <w10:anchorlock/>
               </v:group>
             </w:pict>
           </mc:Fallback>
@@ -204,12 +265,24 @@
         <w:ind w:right="227"/>
       </w:pPr>
       <w:r>
-        <w:t>Digital Marketing. Skilled in problem-solving, attention to detail, and adaptability. Adept at utilizing Microsoft Office, Cloud Computing, and CRM systems to streamline business operations. Passionate about leveraging AI, IoT, and Big Data for innovation and strategic decision-making. Seeking opportunities to apply my skills in a dynamic environment.</w:t>
-      </w:r>
-    </w:p>
-    <w:p>
-      <w:pPr>
-        <w:pStyle w:val="Heading1"/>
+        <w:t>Digital Marketing. Skilled in problem-solving, attention to detail, and adaptability. Adept at utilizing Microsoft Office, Cloud Computing, and CRM systems to streamline business operations. Passionate about leveraging AI, IoT,</w:t>
+      </w:r>
+      <w:r>
+        <w:rPr>
+          <w:rFonts w:hint="default"/>
+          <w:lang w:val="en-US"/>
+        </w:rPr>
+        <w:t xml:space="preserve"> cybersecurity,</w:t>
+      </w:r>
+      <w:r>
+        <w:t xml:space="preserve"> and Big Data for innovation and strategic decision-making. Seeking opportunities to apply my skills in a dynamic environment.</w:t>
+      </w:r>
+      <w:bookmarkStart w:id="0" w:name="_GoBack"/>
+      <w:bookmarkEnd w:id="0"/>
+    </w:p>
+    <w:p>
+      <w:pPr>
+        <w:pStyle w:val="2"/>
         <w:ind w:left="-5"/>
       </w:pPr>
       <w:r>
@@ -224,14 +297,13 @@
       </w:pPr>
       <w:r>
         <w:rPr>
-          <w:rFonts w:ascii="Calibri" w:eastAsia="Calibri" w:hAnsi="Calibri" w:cs="Calibri"/>
-          <w:noProof/>
+          <w:rFonts w:ascii="Calibri" w:hAnsi="Calibri" w:eastAsia="Calibri" w:cs="Calibri"/>
           <w:sz w:val="22"/>
         </w:rPr>
         <mc:AlternateContent>
           <mc:Choice Requires="wpg">
             <w:drawing>
-              <wp:inline distT="0" distB="0" distL="0" distR="0" wp14:anchorId="0781A692" wp14:editId="13DFF314">
+              <wp:inline distT="0" distB="0" distL="0" distR="0">
                 <wp:extent cx="5943600" cy="12700"/>
                 <wp:effectExtent l="0" t="0" r="0" b="0"/>
                 <wp:docPr id="1244" name="Group 1244"/>
@@ -309,13 +381,18 @@
               </wp:inline>
             </w:drawing>
           </mc:Choice>
-          <mc:Fallback xmlns:a="http://schemas.openxmlformats.org/drawingml/2006/main">
+          <mc:Fallback>
             <w:pict>
-              <v:group id="Group 1244" style="width:468pt;height:1pt;mso-position-horizontal-relative:char;mso-position-vertical-relative:line" coordsize="59436,127">
-                <v:shape id="Shape 23" style="position:absolute;width:59436;height:0;left:0;top:0;" coordsize="5943600,0" path="m5943600,0c5943600,0,5943600,0,5943600,0l0,0c0,0,0,0,0,0">
-                  <v:stroke weight="1pt" endcap="flat" joinstyle="miter" miterlimit="10" on="true" color="#000000"/>
-                  <v:fill on="false" color="#000000" opacity="0"/>
+              <v:group id="_x0000_s1026" o:spid="_x0000_s1026" o:spt="203" style="height:1pt;width:468pt;" coordsize="5943600,12700" o:gfxdata="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">
+                <o:lock v:ext="edit" aspectratio="f"/>
+                <v:shape id="Shape 23" o:spid="_x0000_s1026" o:spt="100" style="position:absolute;left:0;top:0;height:0;width:5943600;" filled="f" stroked="t" coordsize="5943600,1" o:gfxdata="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" path="m5943600,0c5943600,0,5943600,0,5943600,0l0,0c0,0,0,0,0,0e">
+                  <v:fill on="f" focussize="0,0"/>
+                  <v:stroke weight="1pt" color="#000000" miterlimit="1" joinstyle="miter"/>
+                  <v:imagedata o:title=""/>
+                  <o:lock v:ext="edit" aspectratio="f"/>
                 </v:shape>
+                <w10:wrap type="none"/>
+                <w10:anchorlock/>
               </v:group>
             </w:pict>
           </mc:Fallback>
@@ -358,6 +435,8 @@
       </w:r>
       <w:r>
         <w:tab/>
+      </w:r>
+      <w:r>
         <w:t>Aug 2024 - Present</w:t>
       </w:r>
     </w:p>
@@ -424,7 +503,7 @@
     </w:p>
     <w:p>
       <w:pPr>
-        <w:pStyle w:val="Heading1"/>
+        <w:pStyle w:val="2"/>
         <w:tabs>
           <w:tab w:val="center" w:pos="8968"/>
         </w:tabs>
@@ -456,6 +535,8 @@
       </w:r>
       <w:r>
         <w:tab/>
+      </w:r>
+      <w:r>
         <w:t>May 2022 - Aug 2022</w:t>
       </w:r>
     </w:p>
@@ -498,7 +579,7 @@
     </w:p>
     <w:p>
       <w:pPr>
-        <w:pStyle w:val="Heading1"/>
+        <w:pStyle w:val="2"/>
         <w:ind w:left="-5"/>
       </w:pPr>
       <w:r>
@@ -513,14 +594,13 @@
       </w:pPr>
       <w:r>
         <w:rPr>
-          <w:rFonts w:ascii="Calibri" w:eastAsia="Calibri" w:hAnsi="Calibri" w:cs="Calibri"/>
-          <w:noProof/>
+          <w:rFonts w:ascii="Calibri" w:hAnsi="Calibri" w:eastAsia="Calibri" w:cs="Calibri"/>
           <w:sz w:val="22"/>
         </w:rPr>
         <mc:AlternateContent>
           <mc:Choice Requires="wpg">
             <w:drawing>
-              <wp:inline distT="0" distB="0" distL="0" distR="0" wp14:anchorId="117CF70C" wp14:editId="021E445B">
+              <wp:inline distT="0" distB="0" distL="0" distR="0">
                 <wp:extent cx="5943600" cy="12700"/>
                 <wp:effectExtent l="0" t="0" r="0" b="0"/>
                 <wp:docPr id="1245" name="Group 1245"/>
@@ -598,13 +678,18 @@
               </wp:inline>
             </w:drawing>
           </mc:Choice>
-          <mc:Fallback xmlns:a="http://schemas.openxmlformats.org/drawingml/2006/main">
+          <mc:Fallback>
             <w:pict>
-              <v:group id="Group 1245" style="width:468pt;height:1pt;mso-position-horizontal-relative:char;mso-position-vertical-relative:line" coordsize="59436,127">
-                <v:shape id="Shape 56" style="position:absolute;width:59436;height:0;left:0;top:0;" coordsize="5943600,0" path="m5943600,0c5943600,0,5943600,0,5943600,0l0,0c0,0,0,0,0,0">
-                  <v:stroke weight="1pt" endcap="flat" joinstyle="miter" miterlimit="10" on="true" color="#000000"/>
-                  <v:fill on="false" color="#000000" opacity="0"/>
+              <v:group id="_x0000_s1026" o:spid="_x0000_s1026" o:spt="203" style="height:1pt;width:468pt;" coordsize="5943600,12700" o:gfxdata="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">
+                <o:lock v:ext="edit" aspectratio="f"/>
+                <v:shape id="Shape 56" o:spid="_x0000_s1026" o:spt="100" style="position:absolute;left:0;top:0;height:0;width:5943600;" filled="f" stroked="t" coordsize="5943600,1" o:gfxdata="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" path="m5943600,0c5943600,0,5943600,0,5943600,0l0,0c0,0,0,0,0,0e">
+                  <v:fill on="f" focussize="0,0"/>
+                  <v:stroke weight="1pt" color="#000000" miterlimit="1" joinstyle="miter"/>
+                  <v:imagedata o:title=""/>
+                  <o:lock v:ext="edit" aspectratio="f"/>
                 </v:shape>
+                <w10:wrap type="none"/>
+                <w10:anchorlock/>
               </v:group>
             </w:pict>
           </mc:Fallback>
@@ -613,24 +698,1261 @@
     </w:p>
     <w:p>
       <w:pPr>
-        <w:tabs>
-          <w:tab w:val="center" w:pos="9158"/>
-        </w:tabs>
-        <w:spacing w:after="249"/>
-        <w:ind w:left="0" w:firstLine="0"/>
+        <w:keepNext w:val="0"/>
+        <w:keepLines w:val="0"/>
+        <w:widowControl/>
+        <w:suppressLineNumbers w:val="0"/>
+        <w:spacing w:before="0" w:beforeAutospacing="0" w:after="160" w:afterAutospacing="0" w:line="256" w:lineRule="auto"/>
+        <w:ind w:left="0" w:right="0"/>
         <w:jc w:val="left"/>
-      </w:pPr>
-      <w:r>
-        <w:t>ICDL Professional Certification Courses, ICDL</w:t>
-      </w:r>
-      <w:r>
-        <w:tab/>
-        <w:t>2024</w:t>
-      </w:r>
-    </w:p>
-    <w:p>
-      <w:pPr>
-        <w:pStyle w:val="Heading1"/>
+        <w:rPr>
+          <w:lang w:val="en-US"/>
+        </w:rPr>
+      </w:pPr>
+      <w:r>
+        <w:rPr>
+          <w:rFonts w:hint="eastAsia" w:ascii="Calibri" w:hAnsi="Calibri" w:eastAsia="Calibri" w:cs="Times New Roman"/>
+          <w:b/>
+          <w:bCs/>
+          <w:color w:val="000000"/>
+          <w:kern w:val="0"/>
+          <w:sz w:val="22"/>
+          <w:szCs w:val="22"/>
+          <w:lang w:val="en-US" w:eastAsia="zh-CN" w:bidi="ar"/>
+          <w14:ligatures w14:val="standardContextual"/>
+        </w:rPr>
+        <w:t>Table</w:t>
+      </w:r>
+    </w:p>
+    <w:tbl>
+      <w:tblPr>
+        <w:tblStyle w:val="4"/>
+        <w:tblpPr w:leftFromText="180" w:rightFromText="180" w:vertAnchor="text" w:tblpXSpec="left" w:tblpY="1"/>
+        <w:tblOverlap w:val="never"/>
+        <w:tblW w:w="0" w:type="auto"/>
+        <w:tblInd w:w="0" w:type="dxa"/>
+        <w:tblBorders>
+          <w:top w:val="none" w:color="auto" w:sz="0" w:space="0"/>
+          <w:left w:val="none" w:color="auto" w:sz="0" w:space="0"/>
+          <w:bottom w:val="none" w:color="auto" w:sz="0" w:space="0"/>
+          <w:right w:val="none" w:color="auto" w:sz="0" w:space="0"/>
+          <w:insideH w:val="none" w:color="auto" w:sz="0" w:space="0"/>
+          <w:insideV w:val="none" w:color="auto" w:sz="0" w:space="0"/>
+        </w:tblBorders>
+        <w:shd w:val="clear"/>
+        <w:tblLayout w:type="autofit"/>
+        <w:tblCellMar>
+          <w:top w:w="0" w:type="dxa"/>
+          <w:left w:w="0" w:type="dxa"/>
+          <w:bottom w:w="0" w:type="dxa"/>
+          <w:right w:w="0" w:type="dxa"/>
+        </w:tblCellMar>
+      </w:tblPr>
+      <w:tblGrid>
+        <w:gridCol w:w="4194"/>
+        <w:gridCol w:w="2724"/>
+        <w:gridCol w:w="737"/>
+      </w:tblGrid>
+      <w:tr>
+        <w:tblPrEx>
+          <w:tblBorders>
+            <w:top w:val="none" w:color="auto" w:sz="0" w:space="0"/>
+            <w:left w:val="none" w:color="auto" w:sz="0" w:space="0"/>
+            <w:bottom w:val="none" w:color="auto" w:sz="0" w:space="0"/>
+            <w:right w:val="none" w:color="auto" w:sz="0" w:space="0"/>
+            <w:insideH w:val="none" w:color="auto" w:sz="0" w:space="0"/>
+            <w:insideV w:val="none" w:color="auto" w:sz="0" w:space="0"/>
+          </w:tblBorders>
+          <w:shd w:val="clear"/>
+          <w:tblCellMar>
+            <w:top w:w="0" w:type="dxa"/>
+            <w:left w:w="0" w:type="dxa"/>
+            <w:bottom w:w="0" w:type="dxa"/>
+            <w:right w:w="0" w:type="dxa"/>
+          </w:tblCellMar>
+        </w:tblPrEx>
+        <w:trPr>
+          <w:tblHeader/>
+        </w:trPr>
+        <w:tc>
+          <w:tcPr>
+            <w:tcW w:w="0" w:type="auto"/>
+            <w:tcBorders>
+              <w:top w:val="single" w:color="auto" w:sz="4" w:space="0"/>
+              <w:left w:val="nil"/>
+              <w:bottom w:val="nil"/>
+              <w:right w:val="nil"/>
+            </w:tcBorders>
+            <w:shd w:val="clear"/>
+            <w:tcMar>
+              <w:top w:w="150" w:type="dxa"/>
+              <w:left w:w="150" w:type="dxa"/>
+              <w:bottom w:w="150" w:type="dxa"/>
+              <w:right w:w="150" w:type="dxa"/>
+            </w:tcMar>
+            <w:vAlign w:val="bottom"/>
+          </w:tcPr>
+          <w:p>
+            <w:pPr>
+              <w:keepNext w:val="0"/>
+              <w:keepLines w:val="0"/>
+              <w:widowControl/>
+              <w:suppressLineNumbers w:val="0"/>
+              <w:spacing w:before="0" w:beforeAutospacing="0" w:after="160" w:afterAutospacing="0" w:line="256" w:lineRule="auto"/>
+              <w:ind w:left="0" w:right="0"/>
+              <w:jc w:val="left"/>
+              <w:rPr>
+                <w:b/>
+                <w:bCs/>
+                <w:bdr w:val="none" w:color="auto" w:sz="0" w:space="0"/>
+                <w:lang w:val="en-US"/>
+              </w:rPr>
+            </w:pPr>
+            <w:r>
+              <w:rPr>
+                <w:rFonts w:hint="eastAsia" w:ascii="Calibri" w:hAnsi="Calibri" w:eastAsia="Calibri" w:cs="Times New Roman"/>
+                <w:b/>
+                <w:bCs/>
+                <w:color w:val="000000"/>
+                <w:kern w:val="0"/>
+                <w:sz w:val="22"/>
+                <w:szCs w:val="22"/>
+                <w:bdr w:val="none" w:color="auto" w:sz="0" w:space="0"/>
+                <w:lang w:val="en-US" w:eastAsia="zh-CN" w:bidi="ar"/>
+                <w14:ligatures w14:val="standardContextual"/>
+              </w:rPr>
+              <w:t>Certification</w:t>
+            </w:r>
+          </w:p>
+        </w:tc>
+        <w:tc>
+          <w:tcPr>
+            <w:tcW w:w="0" w:type="auto"/>
+            <w:tcBorders>
+              <w:top w:val="single" w:color="auto" w:sz="4" w:space="0"/>
+              <w:left w:val="single" w:color="auto" w:sz="4" w:space="0"/>
+              <w:bottom w:val="nil"/>
+              <w:right w:val="nil"/>
+            </w:tcBorders>
+            <w:shd w:val="clear"/>
+            <w:tcMar>
+              <w:top w:w="150" w:type="dxa"/>
+              <w:left w:w="150" w:type="dxa"/>
+              <w:bottom w:w="150" w:type="dxa"/>
+              <w:right w:w="150" w:type="dxa"/>
+            </w:tcMar>
+            <w:vAlign w:val="bottom"/>
+          </w:tcPr>
+          <w:p>
+            <w:pPr>
+              <w:keepNext w:val="0"/>
+              <w:keepLines w:val="0"/>
+              <w:widowControl/>
+              <w:suppressLineNumbers w:val="0"/>
+              <w:spacing w:before="0" w:beforeAutospacing="0" w:after="160" w:afterAutospacing="0" w:line="256" w:lineRule="auto"/>
+              <w:ind w:left="0" w:right="0"/>
+              <w:jc w:val="left"/>
+              <w:rPr>
+                <w:b/>
+                <w:bCs/>
+                <w:bdr w:val="none" w:color="auto" w:sz="0" w:space="0"/>
+                <w:lang w:val="en-US"/>
+              </w:rPr>
+            </w:pPr>
+            <w:r>
+              <w:rPr>
+                <w:rFonts w:hint="eastAsia" w:ascii="Calibri" w:hAnsi="Calibri" w:eastAsia="Calibri" w:cs="Times New Roman"/>
+                <w:b/>
+                <w:bCs/>
+                <w:color w:val="000000"/>
+                <w:kern w:val="0"/>
+                <w:sz w:val="22"/>
+                <w:szCs w:val="22"/>
+                <w:bdr w:val="none" w:color="auto" w:sz="0" w:space="0"/>
+                <w:lang w:val="en-US" w:eastAsia="zh-CN" w:bidi="ar"/>
+                <w14:ligatures w14:val="standardContextual"/>
+              </w:rPr>
+              <w:t>Provider</w:t>
+            </w:r>
+          </w:p>
+        </w:tc>
+        <w:tc>
+          <w:tcPr>
+            <w:tcW w:w="0" w:type="auto"/>
+            <w:tcBorders>
+              <w:top w:val="single" w:color="auto" w:sz="4" w:space="0"/>
+              <w:left w:val="single" w:color="auto" w:sz="4" w:space="0"/>
+              <w:bottom w:val="nil"/>
+              <w:right w:val="nil"/>
+            </w:tcBorders>
+            <w:shd w:val="clear"/>
+            <w:tcMar>
+              <w:top w:w="150" w:type="dxa"/>
+              <w:left w:w="150" w:type="dxa"/>
+              <w:bottom w:w="150" w:type="dxa"/>
+              <w:right w:w="150" w:type="dxa"/>
+            </w:tcMar>
+            <w:vAlign w:val="bottom"/>
+          </w:tcPr>
+          <w:p>
+            <w:pPr>
+              <w:keepNext w:val="0"/>
+              <w:keepLines w:val="0"/>
+              <w:widowControl/>
+              <w:suppressLineNumbers w:val="0"/>
+              <w:spacing w:before="0" w:beforeAutospacing="0" w:after="160" w:afterAutospacing="0" w:line="256" w:lineRule="auto"/>
+              <w:ind w:left="0" w:right="0"/>
+              <w:jc w:val="left"/>
+              <w:rPr>
+                <w:b/>
+                <w:bCs/>
+                <w:bdr w:val="none" w:color="auto" w:sz="0" w:space="0"/>
+                <w:lang w:val="en-US"/>
+              </w:rPr>
+            </w:pPr>
+            <w:r>
+              <w:rPr>
+                <w:rFonts w:hint="eastAsia" w:ascii="Calibri" w:hAnsi="Calibri" w:eastAsia="Calibri" w:cs="Times New Roman"/>
+                <w:b/>
+                <w:bCs/>
+                <w:color w:val="000000"/>
+                <w:kern w:val="0"/>
+                <w:sz w:val="22"/>
+                <w:szCs w:val="22"/>
+                <w:bdr w:val="none" w:color="auto" w:sz="0" w:space="0"/>
+                <w:lang w:val="en-US" w:eastAsia="zh-CN" w:bidi="ar"/>
+                <w14:ligatures w14:val="standardContextual"/>
+              </w:rPr>
+              <w:t>Year</w:t>
+            </w:r>
+          </w:p>
+        </w:tc>
+      </w:tr>
+      <w:tr>
+        <w:tblPrEx>
+          <w:tblBorders>
+            <w:top w:val="none" w:color="auto" w:sz="0" w:space="0"/>
+            <w:left w:val="none" w:color="auto" w:sz="0" w:space="0"/>
+            <w:bottom w:val="none" w:color="auto" w:sz="0" w:space="0"/>
+            <w:right w:val="none" w:color="auto" w:sz="0" w:space="0"/>
+            <w:insideH w:val="none" w:color="auto" w:sz="0" w:space="0"/>
+            <w:insideV w:val="none" w:color="auto" w:sz="0" w:space="0"/>
+          </w:tblBorders>
+          <w:shd w:val="clear"/>
+          <w:tblCellMar>
+            <w:top w:w="0" w:type="dxa"/>
+            <w:left w:w="0" w:type="dxa"/>
+            <w:bottom w:w="0" w:type="dxa"/>
+            <w:right w:w="0" w:type="dxa"/>
+          </w:tblCellMar>
+        </w:tblPrEx>
+        <w:tc>
+          <w:tcPr>
+            <w:tcW w:w="0" w:type="auto"/>
+            <w:tcBorders>
+              <w:top w:val="single" w:color="auto" w:sz="4" w:space="0"/>
+              <w:left w:val="nil"/>
+              <w:bottom w:val="nil"/>
+              <w:right w:val="nil"/>
+            </w:tcBorders>
+            <w:shd w:val="clear"/>
+            <w:tcMar>
+              <w:top w:w="150" w:type="dxa"/>
+              <w:left w:w="150" w:type="dxa"/>
+              <w:bottom w:w="150" w:type="dxa"/>
+              <w:right w:w="150" w:type="dxa"/>
+            </w:tcMar>
+            <w:vAlign w:val="bottom"/>
+          </w:tcPr>
+          <w:p>
+            <w:pPr>
+              <w:keepNext w:val="0"/>
+              <w:keepLines w:val="0"/>
+              <w:widowControl/>
+              <w:suppressLineNumbers w:val="0"/>
+              <w:spacing w:before="0" w:beforeAutospacing="0" w:after="160" w:afterAutospacing="0" w:line="256" w:lineRule="auto"/>
+              <w:ind w:left="0" w:right="0"/>
+              <w:jc w:val="left"/>
+              <w:rPr>
+                <w:bdr w:val="none" w:color="auto" w:sz="0" w:space="0"/>
+                <w:lang w:val="en-US"/>
+              </w:rPr>
+            </w:pPr>
+            <w:r>
+              <w:rPr>
+                <w:rFonts w:hint="eastAsia" w:ascii="Calibri" w:hAnsi="Calibri" w:eastAsia="Calibri" w:cs="Times New Roman"/>
+                <w:color w:val="000000"/>
+                <w:kern w:val="0"/>
+                <w:sz w:val="22"/>
+                <w:szCs w:val="22"/>
+                <w:bdr w:val="none" w:color="auto" w:sz="0" w:space="0"/>
+                <w:lang w:val="en-US" w:eastAsia="zh-CN" w:bidi="ar"/>
+                <w14:ligatures w14:val="standardContextual"/>
+              </w:rPr>
+              <w:t>Junior Cybersecurity Analytics</w:t>
+            </w:r>
+          </w:p>
+        </w:tc>
+        <w:tc>
+          <w:tcPr>
+            <w:tcW w:w="0" w:type="auto"/>
+            <w:tcBorders>
+              <w:top w:val="single" w:color="auto" w:sz="4" w:space="0"/>
+              <w:left w:val="single" w:color="auto" w:sz="4" w:space="0"/>
+              <w:bottom w:val="nil"/>
+              <w:right w:val="nil"/>
+            </w:tcBorders>
+            <w:shd w:val="clear"/>
+            <w:tcMar>
+              <w:top w:w="150" w:type="dxa"/>
+              <w:left w:w="150" w:type="dxa"/>
+              <w:bottom w:w="150" w:type="dxa"/>
+              <w:right w:w="150" w:type="dxa"/>
+            </w:tcMar>
+            <w:vAlign w:val="bottom"/>
+          </w:tcPr>
+          <w:p>
+            <w:pPr>
+              <w:keepNext w:val="0"/>
+              <w:keepLines w:val="0"/>
+              <w:widowControl/>
+              <w:suppressLineNumbers w:val="0"/>
+              <w:spacing w:before="0" w:beforeAutospacing="0" w:after="160" w:afterAutospacing="0" w:line="256" w:lineRule="auto"/>
+              <w:ind w:left="0" w:right="0"/>
+              <w:jc w:val="left"/>
+              <w:rPr>
+                <w:bdr w:val="none" w:color="auto" w:sz="0" w:space="0"/>
+                <w:lang w:val="en-US"/>
+              </w:rPr>
+            </w:pPr>
+            <w:r>
+              <w:rPr>
+                <w:rFonts w:hint="eastAsia" w:ascii="Calibri" w:hAnsi="Calibri" w:eastAsia="Calibri" w:cs="Times New Roman"/>
+                <w:color w:val="000000"/>
+                <w:kern w:val="0"/>
+                <w:sz w:val="22"/>
+                <w:szCs w:val="22"/>
+                <w:bdr w:val="none" w:color="auto" w:sz="0" w:space="0"/>
+                <w:lang w:val="en-US" w:eastAsia="zh-CN" w:bidi="ar"/>
+                <w14:ligatures w14:val="standardContextual"/>
+              </w:rPr>
+              <w:t>Cisco Networking Academy</w:t>
+            </w:r>
+          </w:p>
+        </w:tc>
+        <w:tc>
+          <w:tcPr>
+            <w:tcW w:w="0" w:type="auto"/>
+            <w:tcBorders>
+              <w:top w:val="single" w:color="auto" w:sz="4" w:space="0"/>
+              <w:left w:val="single" w:color="auto" w:sz="4" w:space="0"/>
+              <w:bottom w:val="nil"/>
+              <w:right w:val="nil"/>
+            </w:tcBorders>
+            <w:shd w:val="clear"/>
+            <w:tcMar>
+              <w:top w:w="150" w:type="dxa"/>
+              <w:left w:w="150" w:type="dxa"/>
+              <w:bottom w:w="150" w:type="dxa"/>
+              <w:right w:w="150" w:type="dxa"/>
+            </w:tcMar>
+            <w:vAlign w:val="bottom"/>
+          </w:tcPr>
+          <w:p>
+            <w:pPr>
+              <w:keepNext w:val="0"/>
+              <w:keepLines w:val="0"/>
+              <w:widowControl/>
+              <w:suppressLineNumbers w:val="0"/>
+              <w:spacing w:before="0" w:beforeAutospacing="0" w:after="160" w:afterAutospacing="0" w:line="256" w:lineRule="auto"/>
+              <w:ind w:left="0" w:right="0"/>
+              <w:jc w:val="left"/>
+              <w:rPr>
+                <w:bdr w:val="none" w:color="auto" w:sz="0" w:space="0"/>
+                <w:lang w:val="en-US"/>
+              </w:rPr>
+            </w:pPr>
+            <w:r>
+              <w:rPr>
+                <w:rFonts w:hint="eastAsia" w:ascii="Calibri" w:hAnsi="Calibri" w:eastAsia="Calibri" w:cs="Times New Roman"/>
+                <w:color w:val="000000"/>
+                <w:kern w:val="0"/>
+                <w:sz w:val="22"/>
+                <w:szCs w:val="22"/>
+                <w:bdr w:val="none" w:color="auto" w:sz="0" w:space="0"/>
+                <w:lang w:val="en-US" w:eastAsia="zh-CN" w:bidi="ar"/>
+                <w14:ligatures w14:val="standardContextual"/>
+              </w:rPr>
+              <w:t>2025</w:t>
+            </w:r>
+          </w:p>
+        </w:tc>
+      </w:tr>
+      <w:tr>
+        <w:tblPrEx>
+          <w:tblBorders>
+            <w:top w:val="none" w:color="auto" w:sz="0" w:space="0"/>
+            <w:left w:val="none" w:color="auto" w:sz="0" w:space="0"/>
+            <w:bottom w:val="none" w:color="auto" w:sz="0" w:space="0"/>
+            <w:right w:val="none" w:color="auto" w:sz="0" w:space="0"/>
+            <w:insideH w:val="none" w:color="auto" w:sz="0" w:space="0"/>
+            <w:insideV w:val="none" w:color="auto" w:sz="0" w:space="0"/>
+          </w:tblBorders>
+          <w:shd w:val="clear"/>
+          <w:tblCellMar>
+            <w:top w:w="0" w:type="dxa"/>
+            <w:left w:w="0" w:type="dxa"/>
+            <w:bottom w:w="0" w:type="dxa"/>
+            <w:right w:w="0" w:type="dxa"/>
+          </w:tblCellMar>
+        </w:tblPrEx>
+        <w:tc>
+          <w:tcPr>
+            <w:tcW w:w="0" w:type="auto"/>
+            <w:tcBorders>
+              <w:top w:val="single" w:color="auto" w:sz="4" w:space="0"/>
+              <w:left w:val="nil"/>
+              <w:bottom w:val="nil"/>
+              <w:right w:val="nil"/>
+            </w:tcBorders>
+            <w:shd w:val="clear"/>
+            <w:tcMar>
+              <w:top w:w="150" w:type="dxa"/>
+              <w:left w:w="150" w:type="dxa"/>
+              <w:bottom w:w="150" w:type="dxa"/>
+              <w:right w:w="150" w:type="dxa"/>
+            </w:tcMar>
+            <w:vAlign w:val="bottom"/>
+          </w:tcPr>
+          <w:p>
+            <w:pPr>
+              <w:keepNext w:val="0"/>
+              <w:keepLines w:val="0"/>
+              <w:widowControl/>
+              <w:suppressLineNumbers w:val="0"/>
+              <w:spacing w:before="0" w:beforeAutospacing="0" w:after="160" w:afterAutospacing="0" w:line="256" w:lineRule="auto"/>
+              <w:ind w:left="0" w:right="0"/>
+              <w:jc w:val="left"/>
+              <w:rPr>
+                <w:bdr w:val="none" w:color="auto" w:sz="0" w:space="0"/>
+                <w:lang w:val="en-US"/>
+              </w:rPr>
+            </w:pPr>
+            <w:r>
+              <w:rPr>
+                <w:rFonts w:hint="eastAsia" w:ascii="Calibri" w:hAnsi="Calibri" w:eastAsia="Calibri" w:cs="Times New Roman"/>
+                <w:color w:val="000000"/>
+                <w:kern w:val="0"/>
+                <w:sz w:val="22"/>
+                <w:szCs w:val="22"/>
+                <w:bdr w:val="none" w:color="auto" w:sz="0" w:space="0"/>
+                <w:lang w:val="en-US" w:eastAsia="zh-CN" w:bidi="ar"/>
+                <w14:ligatures w14:val="standardContextual"/>
+              </w:rPr>
+              <w:t>Data Analytics Essentials</w:t>
+            </w:r>
+          </w:p>
+        </w:tc>
+        <w:tc>
+          <w:tcPr>
+            <w:tcW w:w="0" w:type="auto"/>
+            <w:tcBorders>
+              <w:top w:val="single" w:color="auto" w:sz="4" w:space="0"/>
+              <w:left w:val="single" w:color="auto" w:sz="4" w:space="0"/>
+              <w:bottom w:val="nil"/>
+              <w:right w:val="nil"/>
+            </w:tcBorders>
+            <w:shd w:val="clear"/>
+            <w:tcMar>
+              <w:top w:w="150" w:type="dxa"/>
+              <w:left w:w="150" w:type="dxa"/>
+              <w:bottom w:w="150" w:type="dxa"/>
+              <w:right w:w="150" w:type="dxa"/>
+            </w:tcMar>
+            <w:vAlign w:val="bottom"/>
+          </w:tcPr>
+          <w:p>
+            <w:pPr>
+              <w:keepNext w:val="0"/>
+              <w:keepLines w:val="0"/>
+              <w:widowControl/>
+              <w:suppressLineNumbers w:val="0"/>
+              <w:spacing w:before="0" w:beforeAutospacing="0" w:after="160" w:afterAutospacing="0" w:line="256" w:lineRule="auto"/>
+              <w:ind w:left="0" w:right="0"/>
+              <w:jc w:val="left"/>
+              <w:rPr>
+                <w:bdr w:val="none" w:color="auto" w:sz="0" w:space="0"/>
+                <w:lang w:val="en-US"/>
+              </w:rPr>
+            </w:pPr>
+            <w:r>
+              <w:rPr>
+                <w:rFonts w:hint="eastAsia" w:ascii="Calibri" w:hAnsi="Calibri" w:eastAsia="Calibri" w:cs="Times New Roman"/>
+                <w:color w:val="000000"/>
+                <w:kern w:val="0"/>
+                <w:sz w:val="22"/>
+                <w:szCs w:val="22"/>
+                <w:bdr w:val="none" w:color="auto" w:sz="0" w:space="0"/>
+                <w:lang w:val="en-US" w:eastAsia="zh-CN" w:bidi="ar"/>
+                <w14:ligatures w14:val="standardContextual"/>
+              </w:rPr>
+              <w:t>Cisco Networking Academy</w:t>
+            </w:r>
+          </w:p>
+        </w:tc>
+        <w:tc>
+          <w:tcPr>
+            <w:tcW w:w="0" w:type="auto"/>
+            <w:tcBorders>
+              <w:top w:val="single" w:color="auto" w:sz="4" w:space="0"/>
+              <w:left w:val="single" w:color="auto" w:sz="4" w:space="0"/>
+              <w:bottom w:val="nil"/>
+              <w:right w:val="nil"/>
+            </w:tcBorders>
+            <w:shd w:val="clear"/>
+            <w:tcMar>
+              <w:top w:w="150" w:type="dxa"/>
+              <w:left w:w="150" w:type="dxa"/>
+              <w:bottom w:w="150" w:type="dxa"/>
+              <w:right w:w="150" w:type="dxa"/>
+            </w:tcMar>
+            <w:vAlign w:val="bottom"/>
+          </w:tcPr>
+          <w:p>
+            <w:pPr>
+              <w:keepNext w:val="0"/>
+              <w:keepLines w:val="0"/>
+              <w:widowControl/>
+              <w:suppressLineNumbers w:val="0"/>
+              <w:spacing w:before="0" w:beforeAutospacing="0" w:after="160" w:afterAutospacing="0" w:line="256" w:lineRule="auto"/>
+              <w:ind w:left="0" w:right="0"/>
+              <w:jc w:val="left"/>
+              <w:rPr>
+                <w:bdr w:val="none" w:color="auto" w:sz="0" w:space="0"/>
+                <w:lang w:val="en-US"/>
+              </w:rPr>
+            </w:pPr>
+            <w:r>
+              <w:rPr>
+                <w:rFonts w:hint="eastAsia" w:ascii="Calibri" w:hAnsi="Calibri" w:eastAsia="Calibri" w:cs="Times New Roman"/>
+                <w:color w:val="000000"/>
+                <w:kern w:val="0"/>
+                <w:sz w:val="22"/>
+                <w:szCs w:val="22"/>
+                <w:bdr w:val="none" w:color="auto" w:sz="0" w:space="0"/>
+                <w:lang w:val="en-US" w:eastAsia="zh-CN" w:bidi="ar"/>
+                <w14:ligatures w14:val="standardContextual"/>
+              </w:rPr>
+              <w:t>2025</w:t>
+            </w:r>
+          </w:p>
+        </w:tc>
+      </w:tr>
+      <w:tr>
+        <w:tblPrEx>
+          <w:tblBorders>
+            <w:top w:val="none" w:color="auto" w:sz="0" w:space="0"/>
+            <w:left w:val="none" w:color="auto" w:sz="0" w:space="0"/>
+            <w:bottom w:val="none" w:color="auto" w:sz="0" w:space="0"/>
+            <w:right w:val="none" w:color="auto" w:sz="0" w:space="0"/>
+            <w:insideH w:val="none" w:color="auto" w:sz="0" w:space="0"/>
+            <w:insideV w:val="none" w:color="auto" w:sz="0" w:space="0"/>
+          </w:tblBorders>
+          <w:shd w:val="clear"/>
+          <w:tblCellMar>
+            <w:top w:w="0" w:type="dxa"/>
+            <w:left w:w="0" w:type="dxa"/>
+            <w:bottom w:w="0" w:type="dxa"/>
+            <w:right w:w="0" w:type="dxa"/>
+          </w:tblCellMar>
+        </w:tblPrEx>
+        <w:tc>
+          <w:tcPr>
+            <w:tcW w:w="0" w:type="auto"/>
+            <w:tcBorders>
+              <w:top w:val="single" w:color="auto" w:sz="4" w:space="0"/>
+              <w:left w:val="nil"/>
+              <w:bottom w:val="nil"/>
+              <w:right w:val="nil"/>
+            </w:tcBorders>
+            <w:shd w:val="clear"/>
+            <w:tcMar>
+              <w:top w:w="150" w:type="dxa"/>
+              <w:left w:w="150" w:type="dxa"/>
+              <w:bottom w:w="150" w:type="dxa"/>
+              <w:right w:w="150" w:type="dxa"/>
+            </w:tcMar>
+            <w:vAlign w:val="bottom"/>
+          </w:tcPr>
+          <w:p>
+            <w:pPr>
+              <w:keepNext w:val="0"/>
+              <w:keepLines w:val="0"/>
+              <w:widowControl/>
+              <w:suppressLineNumbers w:val="0"/>
+              <w:spacing w:before="0" w:beforeAutospacing="0" w:after="160" w:afterAutospacing="0" w:line="256" w:lineRule="auto"/>
+              <w:ind w:left="0" w:right="0"/>
+              <w:jc w:val="left"/>
+              <w:rPr>
+                <w:bdr w:val="none" w:color="auto" w:sz="0" w:space="0"/>
+                <w:lang w:val="en-US"/>
+              </w:rPr>
+            </w:pPr>
+            <w:r>
+              <w:rPr>
+                <w:rFonts w:hint="eastAsia" w:ascii="Calibri" w:hAnsi="Calibri" w:eastAsia="Calibri" w:cs="Times New Roman"/>
+                <w:color w:val="000000"/>
+                <w:kern w:val="0"/>
+                <w:sz w:val="22"/>
+                <w:szCs w:val="22"/>
+                <w:bdr w:val="none" w:color="auto" w:sz="0" w:space="0"/>
+                <w:lang w:val="en-US" w:eastAsia="zh-CN" w:bidi="ar"/>
+                <w14:ligatures w14:val="standardContextual"/>
+              </w:rPr>
+              <w:t>Python Programming</w:t>
+            </w:r>
+          </w:p>
+        </w:tc>
+        <w:tc>
+          <w:tcPr>
+            <w:tcW w:w="0" w:type="auto"/>
+            <w:tcBorders>
+              <w:top w:val="single" w:color="auto" w:sz="4" w:space="0"/>
+              <w:left w:val="single" w:color="auto" w:sz="4" w:space="0"/>
+              <w:bottom w:val="nil"/>
+              <w:right w:val="nil"/>
+            </w:tcBorders>
+            <w:shd w:val="clear"/>
+            <w:tcMar>
+              <w:top w:w="150" w:type="dxa"/>
+              <w:left w:w="150" w:type="dxa"/>
+              <w:bottom w:w="150" w:type="dxa"/>
+              <w:right w:w="150" w:type="dxa"/>
+            </w:tcMar>
+            <w:vAlign w:val="bottom"/>
+          </w:tcPr>
+          <w:p>
+            <w:pPr>
+              <w:keepNext w:val="0"/>
+              <w:keepLines w:val="0"/>
+              <w:widowControl/>
+              <w:suppressLineNumbers w:val="0"/>
+              <w:spacing w:before="0" w:beforeAutospacing="0" w:after="160" w:afterAutospacing="0" w:line="256" w:lineRule="auto"/>
+              <w:ind w:left="0" w:right="0"/>
+              <w:jc w:val="left"/>
+              <w:rPr>
+                <w:bdr w:val="none" w:color="auto" w:sz="0" w:space="0"/>
+                <w:lang w:val="en-US"/>
+              </w:rPr>
+            </w:pPr>
+            <w:r>
+              <w:rPr>
+                <w:rFonts w:hint="eastAsia" w:ascii="Calibri" w:hAnsi="Calibri" w:eastAsia="Calibri" w:cs="Times New Roman"/>
+                <w:color w:val="000000"/>
+                <w:kern w:val="0"/>
+                <w:sz w:val="22"/>
+                <w:szCs w:val="22"/>
+                <w:bdr w:val="none" w:color="auto" w:sz="0" w:space="0"/>
+                <w:lang w:val="en-US" w:eastAsia="zh-CN" w:bidi="ar"/>
+                <w14:ligatures w14:val="standardContextual"/>
+              </w:rPr>
+              <w:t>Cisco Networking Academy</w:t>
+            </w:r>
+          </w:p>
+        </w:tc>
+        <w:tc>
+          <w:tcPr>
+            <w:tcW w:w="0" w:type="auto"/>
+            <w:tcBorders>
+              <w:top w:val="single" w:color="auto" w:sz="4" w:space="0"/>
+              <w:left w:val="single" w:color="auto" w:sz="4" w:space="0"/>
+              <w:bottom w:val="nil"/>
+              <w:right w:val="nil"/>
+            </w:tcBorders>
+            <w:shd w:val="clear"/>
+            <w:tcMar>
+              <w:top w:w="150" w:type="dxa"/>
+              <w:left w:w="150" w:type="dxa"/>
+              <w:bottom w:w="150" w:type="dxa"/>
+              <w:right w:w="150" w:type="dxa"/>
+            </w:tcMar>
+            <w:vAlign w:val="bottom"/>
+          </w:tcPr>
+          <w:p>
+            <w:pPr>
+              <w:keepNext w:val="0"/>
+              <w:keepLines w:val="0"/>
+              <w:widowControl/>
+              <w:suppressLineNumbers w:val="0"/>
+              <w:spacing w:before="0" w:beforeAutospacing="0" w:after="160" w:afterAutospacing="0" w:line="256" w:lineRule="auto"/>
+              <w:ind w:left="0" w:right="0"/>
+              <w:jc w:val="left"/>
+              <w:rPr>
+                <w:bdr w:val="none" w:color="auto" w:sz="0" w:space="0"/>
+                <w:lang w:val="en-US"/>
+              </w:rPr>
+            </w:pPr>
+            <w:r>
+              <w:rPr>
+                <w:rFonts w:hint="eastAsia" w:ascii="Calibri" w:hAnsi="Calibri" w:eastAsia="Calibri" w:cs="Times New Roman"/>
+                <w:color w:val="000000"/>
+                <w:kern w:val="0"/>
+                <w:sz w:val="22"/>
+                <w:szCs w:val="22"/>
+                <w:bdr w:val="none" w:color="auto" w:sz="0" w:space="0"/>
+                <w:lang w:val="en-US" w:eastAsia="zh-CN" w:bidi="ar"/>
+                <w14:ligatures w14:val="standardContextual"/>
+              </w:rPr>
+              <w:t>2025</w:t>
+            </w:r>
+          </w:p>
+        </w:tc>
+      </w:tr>
+      <w:tr>
+        <w:tblPrEx>
+          <w:tblBorders>
+            <w:top w:val="none" w:color="auto" w:sz="0" w:space="0"/>
+            <w:left w:val="none" w:color="auto" w:sz="0" w:space="0"/>
+            <w:bottom w:val="none" w:color="auto" w:sz="0" w:space="0"/>
+            <w:right w:val="none" w:color="auto" w:sz="0" w:space="0"/>
+            <w:insideH w:val="none" w:color="auto" w:sz="0" w:space="0"/>
+            <w:insideV w:val="none" w:color="auto" w:sz="0" w:space="0"/>
+          </w:tblBorders>
+          <w:shd w:val="clear"/>
+          <w:tblCellMar>
+            <w:top w:w="0" w:type="dxa"/>
+            <w:left w:w="0" w:type="dxa"/>
+            <w:bottom w:w="0" w:type="dxa"/>
+            <w:right w:w="0" w:type="dxa"/>
+          </w:tblCellMar>
+        </w:tblPrEx>
+        <w:tc>
+          <w:tcPr>
+            <w:tcW w:w="0" w:type="auto"/>
+            <w:tcBorders>
+              <w:top w:val="single" w:color="auto" w:sz="4" w:space="0"/>
+              <w:left w:val="nil"/>
+              <w:bottom w:val="nil"/>
+              <w:right w:val="nil"/>
+            </w:tcBorders>
+            <w:shd w:val="clear"/>
+            <w:tcMar>
+              <w:top w:w="150" w:type="dxa"/>
+              <w:left w:w="150" w:type="dxa"/>
+              <w:bottom w:w="150" w:type="dxa"/>
+              <w:right w:w="150" w:type="dxa"/>
+            </w:tcMar>
+            <w:vAlign w:val="bottom"/>
+          </w:tcPr>
+          <w:p>
+            <w:pPr>
+              <w:keepNext w:val="0"/>
+              <w:keepLines w:val="0"/>
+              <w:widowControl/>
+              <w:suppressLineNumbers w:val="0"/>
+              <w:spacing w:before="0" w:beforeAutospacing="0" w:after="160" w:afterAutospacing="0" w:line="256" w:lineRule="auto"/>
+              <w:ind w:left="0" w:right="0"/>
+              <w:jc w:val="left"/>
+              <w:rPr>
+                <w:bdr w:val="none" w:color="auto" w:sz="0" w:space="0"/>
+                <w:lang w:val="en-US"/>
+              </w:rPr>
+            </w:pPr>
+            <w:r>
+              <w:rPr>
+                <w:rFonts w:hint="eastAsia" w:ascii="Calibri" w:hAnsi="Calibri" w:eastAsia="Calibri" w:cs="Times New Roman"/>
+                <w:color w:val="000000"/>
+                <w:kern w:val="0"/>
+                <w:sz w:val="22"/>
+                <w:szCs w:val="22"/>
+                <w:bdr w:val="none" w:color="auto" w:sz="0" w:space="0"/>
+                <w:lang w:val="en-US" w:eastAsia="zh-CN" w:bidi="ar"/>
+                <w14:ligatures w14:val="standardContextual"/>
+              </w:rPr>
+              <w:t>Agile Project Management</w:t>
+            </w:r>
+          </w:p>
+        </w:tc>
+        <w:tc>
+          <w:tcPr>
+            <w:tcW w:w="0" w:type="auto"/>
+            <w:tcBorders>
+              <w:top w:val="single" w:color="auto" w:sz="4" w:space="0"/>
+              <w:left w:val="single" w:color="auto" w:sz="4" w:space="0"/>
+              <w:bottom w:val="nil"/>
+              <w:right w:val="nil"/>
+            </w:tcBorders>
+            <w:shd w:val="clear"/>
+            <w:tcMar>
+              <w:top w:w="150" w:type="dxa"/>
+              <w:left w:w="150" w:type="dxa"/>
+              <w:bottom w:w="150" w:type="dxa"/>
+              <w:right w:w="150" w:type="dxa"/>
+            </w:tcMar>
+            <w:vAlign w:val="bottom"/>
+          </w:tcPr>
+          <w:p>
+            <w:pPr>
+              <w:keepNext w:val="0"/>
+              <w:keepLines w:val="0"/>
+              <w:widowControl/>
+              <w:suppressLineNumbers w:val="0"/>
+              <w:spacing w:before="0" w:beforeAutospacing="0" w:after="160" w:afterAutospacing="0" w:line="256" w:lineRule="auto"/>
+              <w:ind w:left="0" w:right="0"/>
+              <w:jc w:val="left"/>
+              <w:rPr>
+                <w:bdr w:val="none" w:color="auto" w:sz="0" w:space="0"/>
+                <w:lang w:val="en-US"/>
+              </w:rPr>
+            </w:pPr>
+            <w:r>
+              <w:rPr>
+                <w:rFonts w:hint="eastAsia" w:ascii="Calibri" w:hAnsi="Calibri" w:eastAsia="Calibri" w:cs="Times New Roman"/>
+                <w:color w:val="000000"/>
+                <w:kern w:val="0"/>
+                <w:sz w:val="22"/>
+                <w:szCs w:val="22"/>
+                <w:bdr w:val="none" w:color="auto" w:sz="0" w:space="0"/>
+                <w:lang w:val="en-US" w:eastAsia="zh-CN" w:bidi="ar"/>
+                <w14:ligatures w14:val="standardContextual"/>
+              </w:rPr>
+              <w:t>HP LIFE</w:t>
+            </w:r>
+          </w:p>
+        </w:tc>
+        <w:tc>
+          <w:tcPr>
+            <w:tcW w:w="0" w:type="auto"/>
+            <w:tcBorders>
+              <w:top w:val="single" w:color="auto" w:sz="4" w:space="0"/>
+              <w:left w:val="single" w:color="auto" w:sz="4" w:space="0"/>
+              <w:bottom w:val="nil"/>
+              <w:right w:val="nil"/>
+            </w:tcBorders>
+            <w:shd w:val="clear"/>
+            <w:tcMar>
+              <w:top w:w="150" w:type="dxa"/>
+              <w:left w:w="150" w:type="dxa"/>
+              <w:bottom w:w="150" w:type="dxa"/>
+              <w:right w:w="150" w:type="dxa"/>
+            </w:tcMar>
+            <w:vAlign w:val="bottom"/>
+          </w:tcPr>
+          <w:p>
+            <w:pPr>
+              <w:keepNext w:val="0"/>
+              <w:keepLines w:val="0"/>
+              <w:widowControl/>
+              <w:suppressLineNumbers w:val="0"/>
+              <w:spacing w:before="0" w:beforeAutospacing="0" w:after="160" w:afterAutospacing="0" w:line="256" w:lineRule="auto"/>
+              <w:ind w:left="0" w:right="0"/>
+              <w:jc w:val="left"/>
+              <w:rPr>
+                <w:bdr w:val="none" w:color="auto" w:sz="0" w:space="0"/>
+                <w:lang w:val="en-US"/>
+              </w:rPr>
+            </w:pPr>
+            <w:r>
+              <w:rPr>
+                <w:rFonts w:hint="eastAsia" w:ascii="Calibri" w:hAnsi="Calibri" w:eastAsia="Calibri" w:cs="Times New Roman"/>
+                <w:color w:val="000000"/>
+                <w:kern w:val="0"/>
+                <w:sz w:val="22"/>
+                <w:szCs w:val="22"/>
+                <w:bdr w:val="none" w:color="auto" w:sz="0" w:space="0"/>
+                <w:lang w:val="en-US" w:eastAsia="zh-CN" w:bidi="ar"/>
+                <w14:ligatures w14:val="standardContextual"/>
+              </w:rPr>
+              <w:t>2025</w:t>
+            </w:r>
+          </w:p>
+        </w:tc>
+      </w:tr>
+      <w:tr>
+        <w:tblPrEx>
+          <w:tblBorders>
+            <w:top w:val="none" w:color="auto" w:sz="0" w:space="0"/>
+            <w:left w:val="none" w:color="auto" w:sz="0" w:space="0"/>
+            <w:bottom w:val="none" w:color="auto" w:sz="0" w:space="0"/>
+            <w:right w:val="none" w:color="auto" w:sz="0" w:space="0"/>
+            <w:insideH w:val="none" w:color="auto" w:sz="0" w:space="0"/>
+            <w:insideV w:val="none" w:color="auto" w:sz="0" w:space="0"/>
+          </w:tblBorders>
+          <w:shd w:val="clear"/>
+          <w:tblCellMar>
+            <w:top w:w="0" w:type="dxa"/>
+            <w:left w:w="0" w:type="dxa"/>
+            <w:bottom w:w="0" w:type="dxa"/>
+            <w:right w:w="0" w:type="dxa"/>
+          </w:tblCellMar>
+        </w:tblPrEx>
+        <w:tc>
+          <w:tcPr>
+            <w:tcW w:w="0" w:type="auto"/>
+            <w:tcBorders>
+              <w:top w:val="single" w:color="auto" w:sz="4" w:space="0"/>
+              <w:left w:val="nil"/>
+              <w:bottom w:val="nil"/>
+              <w:right w:val="nil"/>
+            </w:tcBorders>
+            <w:shd w:val="clear"/>
+            <w:tcMar>
+              <w:top w:w="150" w:type="dxa"/>
+              <w:left w:w="150" w:type="dxa"/>
+              <w:bottom w:w="150" w:type="dxa"/>
+              <w:right w:w="150" w:type="dxa"/>
+            </w:tcMar>
+            <w:vAlign w:val="bottom"/>
+          </w:tcPr>
+          <w:p>
+            <w:pPr>
+              <w:keepNext w:val="0"/>
+              <w:keepLines w:val="0"/>
+              <w:widowControl/>
+              <w:suppressLineNumbers w:val="0"/>
+              <w:spacing w:before="0" w:beforeAutospacing="0" w:after="160" w:afterAutospacing="0" w:line="256" w:lineRule="auto"/>
+              <w:ind w:left="0" w:right="0"/>
+              <w:jc w:val="left"/>
+              <w:rPr>
+                <w:bdr w:val="none" w:color="auto" w:sz="0" w:space="0"/>
+                <w:lang w:val="en-US"/>
+              </w:rPr>
+            </w:pPr>
+            <w:r>
+              <w:rPr>
+                <w:rFonts w:hint="eastAsia" w:ascii="Calibri" w:hAnsi="Calibri" w:eastAsia="Calibri" w:cs="Times New Roman"/>
+                <w:color w:val="000000"/>
+                <w:kern w:val="0"/>
+                <w:sz w:val="22"/>
+                <w:szCs w:val="22"/>
+                <w:bdr w:val="none" w:color="auto" w:sz="0" w:space="0"/>
+                <w:lang w:val="en-US" w:eastAsia="zh-CN" w:bidi="ar"/>
+                <w14:ligatures w14:val="standardContextual"/>
+              </w:rPr>
+              <w:t>Data Science &amp; Analytics</w:t>
+            </w:r>
+          </w:p>
+        </w:tc>
+        <w:tc>
+          <w:tcPr>
+            <w:tcW w:w="0" w:type="auto"/>
+            <w:tcBorders>
+              <w:top w:val="single" w:color="auto" w:sz="4" w:space="0"/>
+              <w:left w:val="single" w:color="auto" w:sz="4" w:space="0"/>
+              <w:bottom w:val="nil"/>
+              <w:right w:val="nil"/>
+            </w:tcBorders>
+            <w:shd w:val="clear"/>
+            <w:tcMar>
+              <w:top w:w="150" w:type="dxa"/>
+              <w:left w:w="150" w:type="dxa"/>
+              <w:bottom w:w="150" w:type="dxa"/>
+              <w:right w:w="150" w:type="dxa"/>
+            </w:tcMar>
+            <w:vAlign w:val="bottom"/>
+          </w:tcPr>
+          <w:p>
+            <w:pPr>
+              <w:keepNext w:val="0"/>
+              <w:keepLines w:val="0"/>
+              <w:widowControl/>
+              <w:suppressLineNumbers w:val="0"/>
+              <w:spacing w:before="0" w:beforeAutospacing="0" w:after="160" w:afterAutospacing="0" w:line="256" w:lineRule="auto"/>
+              <w:ind w:left="0" w:right="0"/>
+              <w:jc w:val="left"/>
+              <w:rPr>
+                <w:bdr w:val="none" w:color="auto" w:sz="0" w:space="0"/>
+                <w:lang w:val="en-US"/>
+              </w:rPr>
+            </w:pPr>
+            <w:r>
+              <w:rPr>
+                <w:rFonts w:hint="eastAsia" w:ascii="Calibri" w:hAnsi="Calibri" w:eastAsia="Calibri" w:cs="Times New Roman"/>
+                <w:color w:val="000000"/>
+                <w:kern w:val="0"/>
+                <w:sz w:val="22"/>
+                <w:szCs w:val="22"/>
+                <w:bdr w:val="none" w:color="auto" w:sz="0" w:space="0"/>
+                <w:lang w:val="en-US" w:eastAsia="zh-CN" w:bidi="ar"/>
+                <w14:ligatures w14:val="standardContextual"/>
+              </w:rPr>
+              <w:t>HP LIFE</w:t>
+            </w:r>
+          </w:p>
+        </w:tc>
+        <w:tc>
+          <w:tcPr>
+            <w:tcW w:w="0" w:type="auto"/>
+            <w:tcBorders>
+              <w:top w:val="single" w:color="auto" w:sz="4" w:space="0"/>
+              <w:left w:val="single" w:color="auto" w:sz="4" w:space="0"/>
+              <w:bottom w:val="nil"/>
+              <w:right w:val="nil"/>
+            </w:tcBorders>
+            <w:shd w:val="clear"/>
+            <w:tcMar>
+              <w:top w:w="150" w:type="dxa"/>
+              <w:left w:w="150" w:type="dxa"/>
+              <w:bottom w:w="150" w:type="dxa"/>
+              <w:right w:w="150" w:type="dxa"/>
+            </w:tcMar>
+            <w:vAlign w:val="bottom"/>
+          </w:tcPr>
+          <w:p>
+            <w:pPr>
+              <w:keepNext w:val="0"/>
+              <w:keepLines w:val="0"/>
+              <w:widowControl/>
+              <w:suppressLineNumbers w:val="0"/>
+              <w:spacing w:before="0" w:beforeAutospacing="0" w:after="160" w:afterAutospacing="0" w:line="256" w:lineRule="auto"/>
+              <w:ind w:left="0" w:right="0"/>
+              <w:jc w:val="left"/>
+              <w:rPr>
+                <w:bdr w:val="none" w:color="auto" w:sz="0" w:space="0"/>
+                <w:lang w:val="en-US"/>
+              </w:rPr>
+            </w:pPr>
+            <w:r>
+              <w:rPr>
+                <w:rFonts w:hint="eastAsia" w:ascii="Calibri" w:hAnsi="Calibri" w:eastAsia="Calibri" w:cs="Times New Roman"/>
+                <w:color w:val="000000"/>
+                <w:kern w:val="0"/>
+                <w:sz w:val="22"/>
+                <w:szCs w:val="22"/>
+                <w:bdr w:val="none" w:color="auto" w:sz="0" w:space="0"/>
+                <w:lang w:val="en-US" w:eastAsia="zh-CN" w:bidi="ar"/>
+                <w14:ligatures w14:val="standardContextual"/>
+              </w:rPr>
+              <w:t>2025</w:t>
+            </w:r>
+          </w:p>
+        </w:tc>
+      </w:tr>
+      <w:tr>
+        <w:tblPrEx>
+          <w:tblBorders>
+            <w:top w:val="none" w:color="auto" w:sz="0" w:space="0"/>
+            <w:left w:val="none" w:color="auto" w:sz="0" w:space="0"/>
+            <w:bottom w:val="none" w:color="auto" w:sz="0" w:space="0"/>
+            <w:right w:val="none" w:color="auto" w:sz="0" w:space="0"/>
+            <w:insideH w:val="none" w:color="auto" w:sz="0" w:space="0"/>
+            <w:insideV w:val="none" w:color="auto" w:sz="0" w:space="0"/>
+          </w:tblBorders>
+          <w:shd w:val="clear"/>
+          <w:tblCellMar>
+            <w:top w:w="0" w:type="dxa"/>
+            <w:left w:w="0" w:type="dxa"/>
+            <w:bottom w:w="0" w:type="dxa"/>
+            <w:right w:w="0" w:type="dxa"/>
+          </w:tblCellMar>
+        </w:tblPrEx>
+        <w:tc>
+          <w:tcPr>
+            <w:tcW w:w="0" w:type="auto"/>
+            <w:tcBorders>
+              <w:top w:val="single" w:color="auto" w:sz="4" w:space="0"/>
+              <w:left w:val="nil"/>
+              <w:bottom w:val="nil"/>
+              <w:right w:val="nil"/>
+            </w:tcBorders>
+            <w:shd w:val="clear"/>
+            <w:tcMar>
+              <w:top w:w="150" w:type="dxa"/>
+              <w:left w:w="150" w:type="dxa"/>
+              <w:bottom w:w="150" w:type="dxa"/>
+              <w:right w:w="150" w:type="dxa"/>
+            </w:tcMar>
+            <w:vAlign w:val="bottom"/>
+          </w:tcPr>
+          <w:p>
+            <w:pPr>
+              <w:keepNext w:val="0"/>
+              <w:keepLines w:val="0"/>
+              <w:widowControl/>
+              <w:suppressLineNumbers w:val="0"/>
+              <w:spacing w:before="0" w:beforeAutospacing="0" w:after="160" w:afterAutospacing="0" w:line="256" w:lineRule="auto"/>
+              <w:ind w:left="0" w:right="0"/>
+              <w:jc w:val="left"/>
+              <w:rPr>
+                <w:bdr w:val="none" w:color="auto" w:sz="0" w:space="0"/>
+                <w:lang w:val="en-US"/>
+              </w:rPr>
+            </w:pPr>
+            <w:r>
+              <w:rPr>
+                <w:rFonts w:hint="eastAsia" w:ascii="Calibri" w:hAnsi="Calibri" w:eastAsia="Calibri" w:cs="Times New Roman"/>
+                <w:color w:val="000000"/>
+                <w:kern w:val="0"/>
+                <w:sz w:val="22"/>
+                <w:szCs w:val="22"/>
+                <w:bdr w:val="none" w:color="auto" w:sz="0" w:space="0"/>
+                <w:lang w:val="en-US" w:eastAsia="zh-CN" w:bidi="ar"/>
+                <w14:ligatures w14:val="standardContextual"/>
+              </w:rPr>
+              <w:t>Certified Forensic Fraud Examination (CFFE)</w:t>
+            </w:r>
+          </w:p>
+        </w:tc>
+        <w:tc>
+          <w:tcPr>
+            <w:tcW w:w="0" w:type="auto"/>
+            <w:tcBorders>
+              <w:top w:val="single" w:color="auto" w:sz="4" w:space="0"/>
+              <w:left w:val="single" w:color="auto" w:sz="4" w:space="0"/>
+              <w:bottom w:val="nil"/>
+              <w:right w:val="nil"/>
+            </w:tcBorders>
+            <w:shd w:val="clear"/>
+            <w:tcMar>
+              <w:top w:w="150" w:type="dxa"/>
+              <w:left w:w="150" w:type="dxa"/>
+              <w:bottom w:w="150" w:type="dxa"/>
+              <w:right w:w="150" w:type="dxa"/>
+            </w:tcMar>
+            <w:vAlign w:val="bottom"/>
+          </w:tcPr>
+          <w:p>
+            <w:pPr>
+              <w:keepNext w:val="0"/>
+              <w:keepLines w:val="0"/>
+              <w:widowControl/>
+              <w:suppressLineNumbers w:val="0"/>
+              <w:spacing w:before="0" w:beforeAutospacing="0" w:after="160" w:afterAutospacing="0" w:line="256" w:lineRule="auto"/>
+              <w:ind w:left="0" w:right="0"/>
+              <w:jc w:val="left"/>
+              <w:rPr>
+                <w:bdr w:val="none" w:color="auto" w:sz="0" w:space="0"/>
+                <w:lang w:val="en-US"/>
+              </w:rPr>
+            </w:pPr>
+            <w:r>
+              <w:rPr>
+                <w:rFonts w:hint="eastAsia" w:ascii="Calibri" w:hAnsi="Calibri" w:eastAsia="Calibri" w:cs="Times New Roman"/>
+                <w:i/>
+                <w:iCs/>
+                <w:color w:val="000000"/>
+                <w:kern w:val="0"/>
+                <w:sz w:val="22"/>
+                <w:szCs w:val="22"/>
+                <w:bdr w:val="none" w:color="auto" w:sz="0" w:space="0"/>
+                <w:lang w:val="en-US" w:eastAsia="zh-CN" w:bidi="ar"/>
+                <w14:ligatures w14:val="standardContextual"/>
+              </w:rPr>
+              <w:t>In Progress</w:t>
+            </w:r>
+          </w:p>
+        </w:tc>
+        <w:tc>
+          <w:tcPr>
+            <w:tcW w:w="0" w:type="auto"/>
+            <w:tcBorders>
+              <w:top w:val="single" w:color="auto" w:sz="4" w:space="0"/>
+              <w:left w:val="single" w:color="auto" w:sz="4" w:space="0"/>
+              <w:bottom w:val="nil"/>
+              <w:right w:val="nil"/>
+            </w:tcBorders>
+            <w:shd w:val="clear"/>
+            <w:tcMar>
+              <w:top w:w="150" w:type="dxa"/>
+              <w:left w:w="150" w:type="dxa"/>
+              <w:bottom w:w="150" w:type="dxa"/>
+              <w:right w:w="150" w:type="dxa"/>
+            </w:tcMar>
+            <w:vAlign w:val="bottom"/>
+          </w:tcPr>
+          <w:p>
+            <w:pPr>
+              <w:keepNext w:val="0"/>
+              <w:keepLines w:val="0"/>
+              <w:widowControl/>
+              <w:suppressLineNumbers w:val="0"/>
+              <w:spacing w:before="0" w:beforeAutospacing="0" w:after="160" w:afterAutospacing="0" w:line="256" w:lineRule="auto"/>
+              <w:ind w:left="0" w:right="0"/>
+              <w:jc w:val="left"/>
+              <w:rPr>
+                <w:bdr w:val="none" w:color="auto" w:sz="0" w:space="0"/>
+                <w:lang w:val="en-US"/>
+              </w:rPr>
+            </w:pPr>
+            <w:r>
+              <w:rPr>
+                <w:rFonts w:hint="eastAsia" w:ascii="Calibri" w:hAnsi="Calibri" w:eastAsia="Calibri" w:cs="Times New Roman"/>
+                <w:color w:val="000000"/>
+                <w:kern w:val="0"/>
+                <w:sz w:val="22"/>
+                <w:szCs w:val="22"/>
+                <w:bdr w:val="none" w:color="auto" w:sz="0" w:space="0"/>
+                <w:lang w:val="en-US" w:eastAsia="zh-CN" w:bidi="ar"/>
+                <w14:ligatures w14:val="standardContextual"/>
+              </w:rPr>
+              <w:t>2026</w:t>
+            </w:r>
+          </w:p>
+        </w:tc>
+      </w:tr>
+    </w:tbl>
+    <w:p>
+      <w:pPr>
+        <w:pStyle w:val="2"/>
+        <w:ind w:left="-5"/>
+        <w:rPr>
+          <w:rFonts w:hint="eastAsia" w:ascii="Calibri" w:hAnsi="Calibri" w:eastAsia="Calibri" w:cs="Times New Roman"/>
+          <w:b/>
+          <w:bCs/>
+          <w:color w:val="000000"/>
+          <w:kern w:val="0"/>
+          <w:sz w:val="22"/>
+          <w:szCs w:val="22"/>
+          <w:lang w:val="en-US" w:eastAsia="zh-CN" w:bidi="ar"/>
+          <w14:ligatures w14:val="standardContextual"/>
+        </w:rPr>
+      </w:pPr>
+    </w:p>
+    <w:p>
+      <w:pPr>
+        <w:pStyle w:val="2"/>
+        <w:ind w:left="-5"/>
+      </w:pPr>
+    </w:p>
+    <w:p>
+      <w:pPr>
+        <w:pStyle w:val="2"/>
+        <w:ind w:left="-5"/>
+      </w:pPr>
+    </w:p>
+    <w:p>
+      <w:pPr>
+        <w:pStyle w:val="2"/>
+        <w:ind w:left="-5"/>
+      </w:pPr>
+    </w:p>
+    <w:p>
+      <w:pPr>
+        <w:pStyle w:val="2"/>
+        <w:ind w:left="-5"/>
+      </w:pPr>
+    </w:p>
+    <w:p>
+      <w:pPr>
+        <w:pStyle w:val="2"/>
+        <w:ind w:left="-5"/>
+      </w:pPr>
+    </w:p>
+    <w:p>
+      <w:pPr>
+        <w:pStyle w:val="2"/>
+        <w:ind w:left="-5"/>
+      </w:pPr>
+    </w:p>
+    <w:p>
+      <w:pPr>
+        <w:pStyle w:val="2"/>
+        <w:ind w:left="-5"/>
+      </w:pPr>
+    </w:p>
+    <w:p>
+      <w:pPr>
+        <w:pStyle w:val="2"/>
         <w:ind w:left="-5"/>
       </w:pPr>
       <w:r>
@@ -645,14 +1967,13 @@
       </w:pPr>
       <w:r>
         <w:rPr>
-          <w:rFonts w:ascii="Calibri" w:eastAsia="Calibri" w:hAnsi="Calibri" w:cs="Calibri"/>
-          <w:noProof/>
+          <w:rFonts w:ascii="Calibri" w:hAnsi="Calibri" w:eastAsia="Calibri" w:cs="Calibri"/>
           <w:sz w:val="22"/>
         </w:rPr>
         <mc:AlternateContent>
           <mc:Choice Requires="wpg">
             <w:drawing>
-              <wp:inline distT="0" distB="0" distL="0" distR="0" wp14:anchorId="5E3104FD" wp14:editId="19994504">
+              <wp:inline distT="0" distB="0" distL="0" distR="0">
                 <wp:extent cx="5943600" cy="12700"/>
                 <wp:effectExtent l="0" t="0" r="0" b="0"/>
                 <wp:docPr id="1246" name="Group 1246"/>
@@ -730,13 +2051,18 @@
               </wp:inline>
             </w:drawing>
           </mc:Choice>
-          <mc:Fallback xmlns:a="http://schemas.openxmlformats.org/drawingml/2006/main">
+          <mc:Fallback>
             <w:pict>
-              <v:group id="Group 1246" style="width:468pt;height:1pt;mso-position-horizontal-relative:char;mso-position-vertical-relative:line" coordsize="59436,127">
-                <v:shape id="Shape 61" style="position:absolute;width:59436;height:0;left:0;top:0;" coordsize="5943600,0" path="m5943600,0c5943600,0,5943600,0,5943600,0l0,0c0,0,0,0,0,0">
-                  <v:stroke weight="1pt" endcap="flat" joinstyle="miter" miterlimit="10" on="true" color="#000000"/>
-                  <v:fill on="false" color="#000000" opacity="0"/>
+              <v:group id="_x0000_s1026" o:spid="_x0000_s1026" o:spt="203" style="height:1pt;width:468pt;" coordsize="5943600,12700" o:gfxdata="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">
+                <o:lock v:ext="edit" aspectratio="f"/>
+                <v:shape id="Shape 61" o:spid="_x0000_s1026" o:spt="100" style="position:absolute;left:0;top:0;height:0;width:5943600;" filled="f" stroked="t" coordsize="5943600,1" o:gfxdata="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" path="m5943600,0c5943600,0,5943600,0,5943600,0l0,0c0,0,0,0,0,0e">
+                  <v:fill on="f" focussize="0,0"/>
+                  <v:stroke weight="1pt" color="#000000" miterlimit="1" joinstyle="miter"/>
+                  <v:imagedata o:title=""/>
+                  <o:lock v:ext="edit" aspectratio="f"/>
                 </v:shape>
+                <w10:wrap type="none"/>
+                <w10:anchorlock/>
               </v:group>
             </w:pict>
           </mc:Fallback>
@@ -757,18 +2083,12 @@
         <w:ind w:right="227"/>
       </w:pPr>
       <w:r>
-        <w:t xml:space="preserve">Problem-Solving • Adaptability • Basic IT Literacy Skills • Computer and online </w:t>
-      </w:r>
-      <w:r>
-        <w:t>Essentials •</w:t>
-      </w:r>
-      <w:r>
-        <w:t xml:space="preserve"> Cyber Security • ICT for Education • Data Analytics • Digital Marketing • Relation Marketing (CRM) System) • Cloud Computing • Internet of Things • Artificial Intelligence • Big Data Development • Excel Expertise</w:t>
-      </w:r>
-    </w:p>
-    <w:p>
-      <w:pPr>
-        <w:pStyle w:val="Heading1"/>
+        <w:t>Problem-Solving • Adaptability • Basic IT Literacy Skills • Computer and online Essentials • Cyber Security • ICT for Education • Data Analytics • Digital Marketing • Relation Marketing (CRM) System) • Cloud Computing • Internet of Things • Artificial Intelligence • Big Data Development • Excel Expertise</w:t>
+      </w:r>
+    </w:p>
+    <w:p>
+      <w:pPr>
+        <w:pStyle w:val="2"/>
         <w:ind w:left="-5"/>
       </w:pPr>
       <w:r>
@@ -783,14 +2103,13 @@
       </w:pPr>
       <w:r>
         <w:rPr>
-          <w:rFonts w:ascii="Calibri" w:eastAsia="Calibri" w:hAnsi="Calibri" w:cs="Calibri"/>
-          <w:noProof/>
+          <w:rFonts w:ascii="Calibri" w:hAnsi="Calibri" w:eastAsia="Calibri" w:cs="Calibri"/>
           <w:sz w:val="22"/>
         </w:rPr>
         <mc:AlternateContent>
           <mc:Choice Requires="wpg">
             <w:drawing>
-              <wp:inline distT="0" distB="0" distL="0" distR="0" wp14:anchorId="27F97289" wp14:editId="27ABC192">
+              <wp:inline distT="0" distB="0" distL="0" distR="0">
                 <wp:extent cx="5943600" cy="12700"/>
                 <wp:effectExtent l="0" t="0" r="0" b="0"/>
                 <wp:docPr id="1247" name="Group 1247"/>
@@ -868,13 +2187,18 @@
               </wp:inline>
             </w:drawing>
           </mc:Choice>
-          <mc:Fallback xmlns:a="http://schemas.openxmlformats.org/drawingml/2006/main">
+          <mc:Fallback>
             <w:pict>
-              <v:group id="Group 1247" style="width:468pt;height:1pt;mso-position-horizontal-relative:char;mso-position-vertical-relative:line" coordsize="59436,127">
-                <v:shape id="Shape 68" style="position:absolute;width:59436;height:0;left:0;top:0;" coordsize="5943600,0" path="m5943600,0c5943600,0,5943600,0,5943600,0l0,0c0,0,0,0,0,0">
-                  <v:stroke weight="1pt" endcap="flat" joinstyle="miter" miterlimit="10" on="true" color="#000000"/>
-                  <v:fill on="false" color="#000000" opacity="0"/>
+              <v:group id="_x0000_s1026" o:spid="_x0000_s1026" o:spt="203" style="height:1pt;width:468pt;" coordsize="5943600,12700" o:gfxdata="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">
+                <o:lock v:ext="edit" aspectratio="f"/>
+                <v:shape id="Shape 68" o:spid="_x0000_s1026" o:spt="100" style="position:absolute;left:0;top:0;height:0;width:5943600;" filled="f" stroked="t" coordsize="5943600,1" o:gfxdata="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" path="m5943600,0c5943600,0,5943600,0,5943600,0l0,0c0,0,0,0,0,0e">
+                  <v:fill on="f" focussize="0,0"/>
+                  <v:stroke weight="1pt" color="#000000" miterlimit="1" joinstyle="miter"/>
+                  <v:imagedata o:title=""/>
+                  <o:lock v:ext="edit" aspectratio="f"/>
                 </v:shape>
+                <w10:wrap type="none"/>
+                <w10:anchorlock/>
               </v:group>
             </w:pict>
           </mc:Fallback>
@@ -900,6 +2224,8 @@
       </w:r>
       <w:r>
         <w:tab/>
+      </w:r>
+      <w:r>
         <w:t>May 2023 - Aug 2024</w:t>
       </w:r>
     </w:p>
@@ -937,7 +2263,6 @@
         <w:ind w:hanging="233"/>
       </w:pPr>
       <w:r>
-        <w:lastRenderedPageBreak/>
         <w:t>Role: As a freelance data analyst, I was hired by an e-commerce business to optimize their sales data and improve decision-making. I was responsible for gathering, cleaning, analyzing, and visualizing sales data to identify trends and insights that would drive business growth.</w:t>
       </w:r>
     </w:p>
@@ -965,22 +2290,404 @@
         <w:t>Impact/Outcome:  Successfully cleaned and organized over 500,000 rows of sales data, reducing errors by 25% and ensuring a more accurate dataset for analysis. Developed interactive dashboards in Tableau that allowed the client to track key performance indicators (KPIs) in real-time, improving decision-making speed by 30%. Delivered actionable insights that helped the business optimize its marketing strategy, resulting in a 15% increase in sales within the first month post-implementation. Provided training to the client’s internal team, empowering them to manage and analyze data independently moving forward.</w:t>
       </w:r>
     </w:p>
+    <w:p>
+      <w:pPr>
+        <w:numPr>
+          <w:numId w:val="0"/>
+        </w:numPr>
+        <w:spacing w:after="48" w:line="268" w:lineRule="auto"/>
+        <w:jc w:val="both"/>
+      </w:pPr>
+    </w:p>
+    <w:p>
+      <w:pPr>
+        <w:spacing w:after="80" w:line="259" w:lineRule="auto"/>
+        <w:ind w:left="0" w:firstLine="0"/>
+        <w:jc w:val="left"/>
+      </w:pPr>
+      <w:r>
+        <w:rPr>
+          <w:rFonts w:ascii="Calibri" w:hAnsi="Calibri" w:eastAsia="Calibri" w:cs="Calibri"/>
+          <w:sz w:val="22"/>
+        </w:rPr>
+        <mc:AlternateContent>
+          <mc:Choice Requires="wpg">
+            <w:drawing>
+              <wp:inline distT="0" distB="0" distL="0" distR="0">
+                <wp:extent cx="5943600" cy="12700"/>
+                <wp:effectExtent l="0" t="6350" r="0" b="0"/>
+                <wp:docPr id="1" name="Group 1"/>
+                <wp:cNvGraphicFramePr/>
+                <a:graphic xmlns:a="http://schemas.openxmlformats.org/drawingml/2006/main">
+                  <a:graphicData uri="http://schemas.microsoft.com/office/word/2010/wordprocessingGroup">
+                    <wpg:wgp>
+                      <wpg:cNvGrpSpPr/>
+                      <wpg:grpSpPr>
+                        <a:xfrm>
+                          <a:off x="0" y="0"/>
+                          <a:ext cx="5943600" cy="12700"/>
+                          <a:chOff x="0" y="0"/>
+                          <a:chExt cx="5943600" cy="12700"/>
+                        </a:xfrm>
+                      </wpg:grpSpPr>
+                      <wps:wsp>
+                        <wps:cNvPr id="2" name="Shape 68"/>
+                        <wps:cNvSpPr/>
+                        <wps:spPr>
+                          <a:xfrm>
+                            <a:off x="0" y="0"/>
+                            <a:ext cx="5943600" cy="0"/>
+                          </a:xfrm>
+                          <a:custGeom>
+                            <a:avLst/>
+                            <a:gdLst/>
+                            <a:ahLst/>
+                            <a:cxnLst/>
+                            <a:rect l="0" t="0" r="0" b="0"/>
+                            <a:pathLst>
+                              <a:path w="5943600">
+                                <a:moveTo>
+                                  <a:pt x="5943600" y="0"/>
+                                </a:moveTo>
+                                <a:cubicBezTo>
+                                  <a:pt x="5943600" y="0"/>
+                                  <a:pt x="5943600" y="0"/>
+                                  <a:pt x="5943600" y="0"/>
+                                </a:cubicBezTo>
+                                <a:lnTo>
+                                  <a:pt x="0" y="0"/>
+                                </a:lnTo>
+                                <a:cubicBezTo>
+                                  <a:pt x="0" y="0"/>
+                                  <a:pt x="0" y="0"/>
+                                  <a:pt x="0" y="0"/>
+                                </a:cubicBezTo>
+                              </a:path>
+                            </a:pathLst>
+                          </a:custGeom>
+                          <a:ln w="12700" cap="flat">
+                            <a:miter lim="127000"/>
+                          </a:ln>
+                        </wps:spPr>
+                        <wps:style>
+                          <a:lnRef idx="1">
+                            <a:srgbClr val="000000"/>
+                          </a:lnRef>
+                          <a:fillRef idx="0">
+                            <a:srgbClr val="000000">
+                              <a:alpha val="0"/>
+                            </a:srgbClr>
+                          </a:fillRef>
+                          <a:effectRef idx="0">
+                            <a:scrgbClr r="0" g="0" b="0"/>
+                          </a:effectRef>
+                          <a:fontRef idx="none"/>
+                        </wps:style>
+                        <wps:bodyPr/>
+                      </wps:wsp>
+                    </wpg:wgp>
+                  </a:graphicData>
+                </a:graphic>
+              </wp:inline>
+            </w:drawing>
+          </mc:Choice>
+          <mc:Fallback>
+            <w:pict>
+              <v:group id="_x0000_s1026" o:spid="_x0000_s1026" o:spt="203" style="height:1pt;width:468pt;" coordsize="5943600,12700" o:gfxdata="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">
+                <o:lock v:ext="edit" aspectratio="f"/>
+                <v:shape id="Shape 68" o:spid="_x0000_s1026" o:spt="100" style="position:absolute;left:0;top:0;height:0;width:5943600;" filled="f" stroked="t" coordsize="5943600,1" o:gfxdata="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" path="m5943600,0c5943600,0,5943600,0,5943600,0l0,0c0,0,0,0,0,0e">
+                  <v:fill on="f" focussize="0,0"/>
+                  <v:stroke weight="1pt" color="#000000" miterlimit="1" joinstyle="miter"/>
+                  <v:imagedata o:title=""/>
+                  <o:lock v:ext="edit" aspectratio="f"/>
+                </v:shape>
+                <w10:wrap type="none"/>
+                <w10:anchorlock/>
+              </v:group>
+            </w:pict>
+          </mc:Fallback>
+        </mc:AlternateContent>
+      </w:r>
+    </w:p>
+    <w:p>
+      <w:pPr>
+        <w:numPr>
+          <w:numId w:val="0"/>
+        </w:numPr>
+        <w:spacing w:after="48" w:line="268" w:lineRule="auto"/>
+        <w:jc w:val="both"/>
+        <w:rPr>
+          <w:rFonts w:hint="default"/>
+          <w:b/>
+          <w:bCs/>
+        </w:rPr>
+      </w:pPr>
+    </w:p>
+    <w:p>
+      <w:pPr>
+        <w:numPr>
+          <w:numId w:val="0"/>
+        </w:numPr>
+        <w:spacing w:after="48" w:line="268" w:lineRule="auto"/>
+        <w:jc w:val="both"/>
+        <w:rPr>
+          <w:rFonts w:hint="default"/>
+          <w:b/>
+          <w:bCs/>
+        </w:rPr>
+      </w:pPr>
+      <w:r>
+        <w:rPr>
+          <w:rFonts w:hint="default"/>
+          <w:b/>
+          <w:bCs/>
+        </w:rPr>
+        <w:t>INTERESTS</w:t>
+      </w:r>
+    </w:p>
+    <w:p>
+      <w:pPr>
+        <w:numPr>
+          <w:numId w:val="0"/>
+        </w:numPr>
+        <w:spacing w:after="48" w:line="268" w:lineRule="auto"/>
+        <w:jc w:val="both"/>
+        <w:rPr>
+          <w:rFonts w:hint="default"/>
+        </w:rPr>
+      </w:pPr>
+      <w:r>
+        <w:rPr>
+          <w:rFonts w:hint="default"/>
+        </w:rPr>
+        <w:t>Cybersecurity trends | Artificial Intelligence &amp; Machine Learning | Digital forensics | Fraud examination | Open-source contribution</w:t>
+      </w:r>
+    </w:p>
+    <w:p>
+      <w:pPr>
+        <w:spacing w:after="80" w:line="259" w:lineRule="auto"/>
+        <w:ind w:left="0" w:firstLine="0"/>
+        <w:jc w:val="left"/>
+      </w:pPr>
+      <w:r>
+        <w:rPr>
+          <w:rFonts w:ascii="Calibri" w:hAnsi="Calibri" w:eastAsia="Calibri" w:cs="Calibri"/>
+          <w:sz w:val="22"/>
+        </w:rPr>
+        <mc:AlternateContent>
+          <mc:Choice Requires="wpg">
+            <w:drawing>
+              <wp:inline distT="0" distB="0" distL="0" distR="0">
+                <wp:extent cx="5943600" cy="12700"/>
+                <wp:effectExtent l="0" t="6350" r="0" b="0"/>
+                <wp:docPr id="3" name="Group 3"/>
+                <wp:cNvGraphicFramePr/>
+                <a:graphic xmlns:a="http://schemas.openxmlformats.org/drawingml/2006/main">
+                  <a:graphicData uri="http://schemas.microsoft.com/office/word/2010/wordprocessingGroup">
+                    <wpg:wgp>
+                      <wpg:cNvGrpSpPr/>
+                      <wpg:grpSpPr>
+                        <a:xfrm>
+                          <a:off x="0" y="0"/>
+                          <a:ext cx="5943600" cy="12700"/>
+                          <a:chOff x="0" y="0"/>
+                          <a:chExt cx="5943600" cy="12700"/>
+                        </a:xfrm>
+                      </wpg:grpSpPr>
+                      <wps:wsp>
+                        <wps:cNvPr id="4" name="Shape 68"/>
+                        <wps:cNvSpPr/>
+                        <wps:spPr>
+                          <a:xfrm>
+                            <a:off x="0" y="0"/>
+                            <a:ext cx="5943600" cy="0"/>
+                          </a:xfrm>
+                          <a:custGeom>
+                            <a:avLst/>
+                            <a:gdLst/>
+                            <a:ahLst/>
+                            <a:cxnLst/>
+                            <a:rect l="0" t="0" r="0" b="0"/>
+                            <a:pathLst>
+                              <a:path w="5943600">
+                                <a:moveTo>
+                                  <a:pt x="5943600" y="0"/>
+                                </a:moveTo>
+                                <a:cubicBezTo>
+                                  <a:pt x="5943600" y="0"/>
+                                  <a:pt x="5943600" y="0"/>
+                                  <a:pt x="5943600" y="0"/>
+                                </a:cubicBezTo>
+                                <a:lnTo>
+                                  <a:pt x="0" y="0"/>
+                                </a:lnTo>
+                                <a:cubicBezTo>
+                                  <a:pt x="0" y="0"/>
+                                  <a:pt x="0" y="0"/>
+                                  <a:pt x="0" y="0"/>
+                                </a:cubicBezTo>
+                              </a:path>
+                            </a:pathLst>
+                          </a:custGeom>
+                          <a:ln w="12700" cap="flat">
+                            <a:miter lim="127000"/>
+                          </a:ln>
+                        </wps:spPr>
+                        <wps:style>
+                          <a:lnRef idx="1">
+                            <a:srgbClr val="000000"/>
+                          </a:lnRef>
+                          <a:fillRef idx="0">
+                            <a:srgbClr val="000000">
+                              <a:alpha val="0"/>
+                            </a:srgbClr>
+                          </a:fillRef>
+                          <a:effectRef idx="0">
+                            <a:scrgbClr r="0" g="0" b="0"/>
+                          </a:effectRef>
+                          <a:fontRef idx="none"/>
+                        </wps:style>
+                        <wps:bodyPr/>
+                      </wps:wsp>
+                    </wpg:wgp>
+                  </a:graphicData>
+                </a:graphic>
+              </wp:inline>
+            </w:drawing>
+          </mc:Choice>
+          <mc:Fallback>
+            <w:pict>
+              <v:group id="_x0000_s1026" o:spid="_x0000_s1026" o:spt="203" style="height:1pt;width:468pt;" coordsize="5943600,12700" o:gfxdata="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">
+                <o:lock v:ext="edit" aspectratio="f"/>
+                <v:shape id="Shape 68" o:spid="_x0000_s1026" o:spt="100" style="position:absolute;left:0;top:0;height:0;width:5943600;" filled="f" stroked="t" coordsize="5943600,1" o:gfxdata="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" path="m5943600,0c5943600,0,5943600,0,5943600,0l0,0c0,0,0,0,0,0e">
+                  <v:fill on="f" focussize="0,0"/>
+                  <v:stroke weight="1pt" color="#000000" miterlimit="1" joinstyle="miter"/>
+                  <v:imagedata o:title=""/>
+                  <o:lock v:ext="edit" aspectratio="f"/>
+                </v:shape>
+                <w10:wrap type="none"/>
+                <w10:anchorlock/>
+              </v:group>
+            </w:pict>
+          </mc:Fallback>
+        </mc:AlternateContent>
+      </w:r>
+    </w:p>
+    <w:p>
+      <w:pPr>
+        <w:numPr>
+          <w:numId w:val="0"/>
+        </w:numPr>
+        <w:spacing w:after="48" w:line="268" w:lineRule="auto"/>
+        <w:jc w:val="both"/>
+        <w:rPr>
+          <w:rFonts w:hint="default"/>
+          <w:b/>
+          <w:bCs/>
+        </w:rPr>
+      </w:pPr>
+      <w:r>
+        <w:rPr>
+          <w:rFonts w:hint="default"/>
+          <w:b/>
+          <w:bCs/>
+        </w:rPr>
+        <w:t>REFERENCES</w:t>
+      </w:r>
+    </w:p>
+    <w:p>
+      <w:pPr>
+        <w:numPr>
+          <w:numId w:val="0"/>
+        </w:numPr>
+        <w:spacing w:after="48" w:line="268" w:lineRule="auto"/>
+        <w:jc w:val="both"/>
+        <w:rPr>
+          <w:rFonts w:hint="default"/>
+        </w:rPr>
+      </w:pPr>
+      <w:r>
+        <w:rPr>
+          <w:rFonts w:hint="default"/>
+        </w:rPr>
+        <w:t>Available upon request</w:t>
+      </w:r>
+    </w:p>
+    <w:p>
+      <w:pPr>
+        <w:numPr>
+          <w:numId w:val="0"/>
+        </w:numPr>
+        <w:spacing w:after="48" w:line="268" w:lineRule="auto"/>
+        <w:jc w:val="both"/>
+      </w:pPr>
+    </w:p>
     <w:sectPr>
       <w:pgSz w:w="12240" w:h="15840"/>
       <w:pgMar w:top="1080" w:right="1213" w:bottom="1356" w:left="1440" w:header="720" w:footer="720" w:gutter="0"/>
-      <w:cols w:space="720"/>
+      <w:cols w:space="720" w:num="1"/>
     </w:sectPr>
   </w:body>
 </w:document>
 </file>
 
+<file path=word/endnotes.xml><?xml version="1.0" encoding="utf-8"?>
+<w:endnotes xmlns:wpc="http://schemas.microsoft.com/office/word/2010/wordprocessingCanvas" xmlns:mc="http://schemas.openxmlformats.org/markup-compatibility/2006" xmlns:o="urn:schemas-microsoft-com:office:office" xmlns:r="http://schemas.openxmlformats.org/officeDocument/2006/relationships" xmlns:m="http://schemas.openxmlformats.org/officeDocument/2006/math" xmlns:v="urn:schemas-microsoft-com:vml" xmlns:wp14="http://schemas.microsoft.com/office/word/2010/wordprocessingDrawing" xmlns:wp="http://schemas.openxmlformats.org/drawingml/2006/wordprocessingDrawing" xmlns:w="http://schemas.openxmlformats.org/wordprocessingml/2006/main" xmlns:w14="http://schemas.microsoft.com/office/word/2010/wordml" xmlns:w15="http://schemas.microsoft.com/office/word/2012/wordml" xmlns:w10="urn:schemas-microsoft-com:office:word" xmlns:wpg="http://schemas.microsoft.com/office/word/2010/wordprocessingGroup" xmlns:wpi="http://schemas.microsoft.com/office/word/2010/wordprocessingInk" xmlns:wne="http://schemas.microsoft.com/office/word/2006/wordml" xmlns:wps="http://schemas.microsoft.com/office/word/2010/wordprocessingShape" xmlns:wpsCustomData="http://www.wps.cn/officeDocument/2013/wpsCustomData" mc:Ignorable="w14 w15 wp14">
+  <w:endnote w:type="separator" w:id="0">
+    <w:p>
+      <w:pPr>
+        <w:spacing w:line="240" w:lineRule="auto"/>
+      </w:pPr>
+      <w:r>
+        <w:separator/>
+      </w:r>
+    </w:p>
+  </w:endnote>
+  <w:endnote w:type="continuationSeparator" w:id="1">
+    <w:p>
+      <w:pPr>
+        <w:spacing w:line="240" w:lineRule="auto"/>
+      </w:pPr>
+      <w:r>
+        <w:continuationSeparator/>
+      </w:r>
+    </w:p>
+  </w:endnote>
+</w:endnotes>
+</file>
+
+<file path=word/footnotes.xml><?xml version="1.0" encoding="utf-8"?>
+<w:footnotes xmlns:wpc="http://schemas.microsoft.com/office/word/2010/wordprocessingCanvas" xmlns:mc="http://schemas.openxmlformats.org/markup-compatibility/2006" xmlns:o="urn:schemas-microsoft-com:office:office" xmlns:r="http://schemas.openxmlformats.org/officeDocument/2006/relationships" xmlns:m="http://schemas.openxmlformats.org/officeDocument/2006/math" xmlns:v="urn:schemas-microsoft-com:vml" xmlns:wp14="http://schemas.microsoft.com/office/word/2010/wordprocessingDrawing" xmlns:wp="http://schemas.openxmlformats.org/drawingml/2006/wordprocessingDrawing" xmlns:w="http://schemas.openxmlformats.org/wordprocessingml/2006/main" xmlns:w14="http://schemas.microsoft.com/office/word/2010/wordml" xmlns:w15="http://schemas.microsoft.com/office/word/2012/wordml" xmlns:w10="urn:schemas-microsoft-com:office:word" xmlns:wpg="http://schemas.microsoft.com/office/word/2010/wordprocessingGroup" xmlns:wpi="http://schemas.microsoft.com/office/word/2010/wordprocessingInk" xmlns:wne="http://schemas.microsoft.com/office/word/2006/wordml" xmlns:wps="http://schemas.microsoft.com/office/word/2010/wordprocessingShape" xmlns:wpsCustomData="http://www.wps.cn/officeDocument/2013/wpsCustomData" mc:Ignorable="w14 w15 wp14">
+  <w:footnote w:type="separator" w:id="0">
+    <w:p>
+      <w:pPr>
+        <w:spacing w:before="0" w:after="0" w:line="268" w:lineRule="auto"/>
+      </w:pPr>
+      <w:r>
+        <w:separator/>
+      </w:r>
+    </w:p>
+  </w:footnote>
+  <w:footnote w:type="continuationSeparator" w:id="1">
+    <w:p>
+      <w:pPr>
+        <w:spacing w:before="0" w:after="0" w:line="268" w:lineRule="auto"/>
+      </w:pPr>
+      <w:r>
+        <w:continuationSeparator/>
+      </w:r>
+    </w:p>
+  </w:footnote>
+</w:footnotes>
+</file>
+
 <file path=word/numbering.xml><?xml version="1.0" encoding="utf-8"?>
-<w:numbering xmlns:wpc="http://schemas.microsoft.com/office/word/2010/wordprocessingCanvas" xmlns:cx="http://schemas.microsoft.com/office/drawing/2014/chartex" xmlns:cx1="http://schemas.microsoft.com/office/drawing/2015/9/8/chartex" xmlns:cx2="http://schemas.microsoft.com/office/drawing/2015/10/21/chartex" xmlns:cx3="http://schemas.microsoft.com/office/drawing/2016/5/9/chartex" xmlns:cx4="http://schemas.microsoft.com/office/drawing/2016/5/10/chartex" xmlns:cx5="http://schemas.microsoft.com/office/drawing/2016/5/11/chartex" xmlns:cx6="http://schemas.microsoft.com/office/drawing/2016/5/12/chartex" xmlns:cx7="http://schemas.microsoft.com/office/drawing/2016/5/13/chartex" xmlns:cx8="http://schemas.microsoft.com/office/drawing/2016/5/14/chartex" xmlns:mc="http://schemas.openxmlformats.org/markup-compatibility/2006" xmlns:aink="http://schemas.microsoft.com/office/drawing/2016/ink" xmlns:am3d="http://schemas.microsoft.com/office/drawing/2017/model3d" xmlns:o="urn:schemas-microsoft-com:office:office" xmlns:oel="http://schemas.microsoft.com/office/2019/extlst" xmlns:r="http://schemas.openxmlformats.org/officeDocument/2006/relationships" xmlns:m="http://schemas.openxmlformats.org/officeDocument/2006/math" xmlns:v="urn:schemas-microsoft-com:vml" xmlns:wp14="http://schemas.microsoft.com/office/word/2010/wordprocessingDrawing" xmlns:wp="http://schemas.openxmlformats.org/drawingml/2006/wordprocessingDrawing" xmlns:w10="urn:schemas-microsoft-com:office:word" xmlns:w="http://schemas.openxmlformats.org/wordprocessingml/2006/main" xmlns:w14="http://schemas.microsoft.com/office/word/2010/wordml" xmlns:w15="http://schemas.microsoft.com/office/word/2012/wordml" xmlns:w16cex="http://schemas.microsoft.com/office/word/2018/wordml/cex" xmlns:w16cid="http://schemas.microsoft.com/office/word/2016/wordml/cid" xmlns:w16="http://schemas.microsoft.com/office/word/2018/wordml" xmlns:w16du="http://schemas.microsoft.com/office/word/2023/wordml/word16du" xmlns:w16sdtdh="http://schemas.microsoft.com/office/word/2020/wordml/sdtdatahash" xmlns:w16sdtfl="http://schemas.microsoft.com/office/word/2024/wordml/sdtformatlock" xmlns:w16se="http://schemas.microsoft.com/office/word/2015/wordml/symex" xmlns:wpg="http://schemas.microsoft.com/office/word/2010/wordprocessingGroup" xmlns:wpi="http://schemas.microsoft.com/office/word/2010/wordprocessingInk" xmlns:wne="http://schemas.microsoft.com/office/word/2006/wordml" xmlns:wps="http://schemas.microsoft.com/office/word/2010/wordprocessingShape" mc:Ignorable="w14 w15 w16se w16cid w16 w16cex w16sdtdh w16sdtfl w16du wp14">
-  <w:abstractNum w:abstractNumId="0" w15:restartNumberingAfterBreak="0">
+<w:numbering xmlns:wpc="http://schemas.microsoft.com/office/word/2010/wordprocessingCanvas" xmlns:mc="http://schemas.openxmlformats.org/markup-compatibility/2006" xmlns:o="urn:schemas-microsoft-com:office:office" xmlns:r="http://schemas.openxmlformats.org/officeDocument/2006/relationships" xmlns:m="http://schemas.openxmlformats.org/officeDocument/2006/math" xmlns:v="urn:schemas-microsoft-com:vml" xmlns:wp14="http://schemas.microsoft.com/office/word/2010/wordprocessingDrawing" xmlns:wp="http://schemas.openxmlformats.org/drawingml/2006/wordprocessingDrawing" xmlns:w10="urn:schemas-microsoft-com:office:word" xmlns:w="http://schemas.openxmlformats.org/wordprocessingml/2006/main" xmlns:w14="http://schemas.microsoft.com/office/word/2010/wordml" xmlns:wpg="http://schemas.microsoft.com/office/word/2010/wordprocessingGroup" xmlns:wpi="http://schemas.microsoft.com/office/word/2010/wordprocessingInk" xmlns:wne="http://schemas.microsoft.com/office/word/2006/wordml" xmlns:wps="http://schemas.microsoft.com/office/word/2010/wordprocessingShape" xmlns:wpsCustomData="http://www.wps.cn/officeDocument/2013/wpsCustomData" mc:Ignorable="w14 wp14">
+  <w:abstractNum w:abstractNumId="0">
     <w:nsid w:val="16CC4349"/>
-    <w:multiLevelType w:val="hybridMultilevel"/>
-    <w:tmpl w:val="3372E668"/>
-    <w:lvl w:ilvl="0" w:tplc="E6D656F2">
+    <w:multiLevelType w:val="multilevel"/>
+    <w:tmpl w:val="16CC4349"/>
+    <w:lvl w:ilvl="0" w:tentative="0">
       <w:start w:val="1"/>
       <w:numFmt w:val="bullet"/>
       <w:lvlText w:val="•"/>
@@ -989,7 +2696,7 @@
         <w:ind w:left="538"/>
       </w:pPr>
       <w:rPr>
-        <w:rFonts w:ascii="Garamond" w:eastAsia="Garamond" w:hAnsi="Garamond" w:cs="Garamond"/>
+        <w:rFonts w:ascii="Garamond" w:hAnsi="Garamond" w:eastAsia="Garamond" w:cs="Garamond"/>
         <w:b w:val="0"/>
         <w:i w:val="0"/>
         <w:strike w:val="0"/>
@@ -998,12 +2705,11 @@
         <w:sz w:val="21"/>
         <w:szCs w:val="21"/>
         <w:u w:val="none" w:color="000000"/>
-        <w:bdr w:val="none" w:sz="0" w:space="0" w:color="auto"/>
         <w:shd w:val="clear" w:color="auto" w:fill="auto"/>
         <w:vertAlign w:val="baseline"/>
       </w:rPr>
     </w:lvl>
-    <w:lvl w:ilvl="1" w:tplc="08AC2F78">
+    <w:lvl w:ilvl="1" w:tentative="0">
       <w:start w:val="1"/>
       <w:numFmt w:val="bullet"/>
       <w:lvlText w:val="o"/>
@@ -1012,7 +2718,7 @@
         <w:ind w:left="1336"/>
       </w:pPr>
       <w:rPr>
-        <w:rFonts w:ascii="Garamond" w:eastAsia="Garamond" w:hAnsi="Garamond" w:cs="Garamond"/>
+        <w:rFonts w:ascii="Garamond" w:hAnsi="Garamond" w:eastAsia="Garamond" w:cs="Garamond"/>
         <w:b w:val="0"/>
         <w:i w:val="0"/>
         <w:strike w:val="0"/>
@@ -1021,12 +2727,11 @@
         <w:sz w:val="21"/>
         <w:szCs w:val="21"/>
         <w:u w:val="none" w:color="000000"/>
-        <w:bdr w:val="none" w:sz="0" w:space="0" w:color="auto"/>
         <w:shd w:val="clear" w:color="auto" w:fill="auto"/>
         <w:vertAlign w:val="baseline"/>
       </w:rPr>
     </w:lvl>
-    <w:lvl w:ilvl="2" w:tplc="6B421C00">
+    <w:lvl w:ilvl="2" w:tentative="0">
       <w:start w:val="1"/>
       <w:numFmt w:val="bullet"/>
       <w:lvlText w:val="▪"/>
@@ -1035,7 +2740,7 @@
         <w:ind w:left="2056"/>
       </w:pPr>
       <w:rPr>
-        <w:rFonts w:ascii="Garamond" w:eastAsia="Garamond" w:hAnsi="Garamond" w:cs="Garamond"/>
+        <w:rFonts w:ascii="Garamond" w:hAnsi="Garamond" w:eastAsia="Garamond" w:cs="Garamond"/>
         <w:b w:val="0"/>
         <w:i w:val="0"/>
         <w:strike w:val="0"/>
@@ -1044,12 +2749,11 @@
         <w:sz w:val="21"/>
         <w:szCs w:val="21"/>
         <w:u w:val="none" w:color="000000"/>
-        <w:bdr w:val="none" w:sz="0" w:space="0" w:color="auto"/>
         <w:shd w:val="clear" w:color="auto" w:fill="auto"/>
         <w:vertAlign w:val="baseline"/>
       </w:rPr>
     </w:lvl>
-    <w:lvl w:ilvl="3" w:tplc="A0928E18">
+    <w:lvl w:ilvl="3" w:tentative="0">
       <w:start w:val="1"/>
       <w:numFmt w:val="bullet"/>
       <w:lvlText w:val="•"/>
@@ -1058,7 +2762,7 @@
         <w:ind w:left="2776"/>
       </w:pPr>
       <w:rPr>
-        <w:rFonts w:ascii="Garamond" w:eastAsia="Garamond" w:hAnsi="Garamond" w:cs="Garamond"/>
+        <w:rFonts w:ascii="Garamond" w:hAnsi="Garamond" w:eastAsia="Garamond" w:cs="Garamond"/>
         <w:b w:val="0"/>
         <w:i w:val="0"/>
         <w:strike w:val="0"/>
@@ -1067,12 +2771,11 @@
         <w:sz w:val="21"/>
         <w:szCs w:val="21"/>
         <w:u w:val="none" w:color="000000"/>
-        <w:bdr w:val="none" w:sz="0" w:space="0" w:color="auto"/>
         <w:shd w:val="clear" w:color="auto" w:fill="auto"/>
         <w:vertAlign w:val="baseline"/>
       </w:rPr>
     </w:lvl>
-    <w:lvl w:ilvl="4" w:tplc="A5E48756">
+    <w:lvl w:ilvl="4" w:tentative="0">
       <w:start w:val="1"/>
       <w:numFmt w:val="bullet"/>
       <w:lvlText w:val="o"/>
@@ -1081,7 +2784,7 @@
         <w:ind w:left="3496"/>
       </w:pPr>
       <w:rPr>
-        <w:rFonts w:ascii="Garamond" w:eastAsia="Garamond" w:hAnsi="Garamond" w:cs="Garamond"/>
+        <w:rFonts w:ascii="Garamond" w:hAnsi="Garamond" w:eastAsia="Garamond" w:cs="Garamond"/>
         <w:b w:val="0"/>
         <w:i w:val="0"/>
         <w:strike w:val="0"/>
@@ -1090,12 +2793,11 @@
         <w:sz w:val="21"/>
         <w:szCs w:val="21"/>
         <w:u w:val="none" w:color="000000"/>
-        <w:bdr w:val="none" w:sz="0" w:space="0" w:color="auto"/>
         <w:shd w:val="clear" w:color="auto" w:fill="auto"/>
         <w:vertAlign w:val="baseline"/>
       </w:rPr>
     </w:lvl>
-    <w:lvl w:ilvl="5" w:tplc="5218FCE6">
+    <w:lvl w:ilvl="5" w:tentative="0">
       <w:start w:val="1"/>
       <w:numFmt w:val="bullet"/>
       <w:lvlText w:val="▪"/>
@@ -1104,7 +2806,7 @@
         <w:ind w:left="4216"/>
       </w:pPr>
       <w:rPr>
-        <w:rFonts w:ascii="Garamond" w:eastAsia="Garamond" w:hAnsi="Garamond" w:cs="Garamond"/>
+        <w:rFonts w:ascii="Garamond" w:hAnsi="Garamond" w:eastAsia="Garamond" w:cs="Garamond"/>
         <w:b w:val="0"/>
         <w:i w:val="0"/>
         <w:strike w:val="0"/>
@@ -1113,12 +2815,11 @@
         <w:sz w:val="21"/>
         <w:szCs w:val="21"/>
         <w:u w:val="none" w:color="000000"/>
-        <w:bdr w:val="none" w:sz="0" w:space="0" w:color="auto"/>
         <w:shd w:val="clear" w:color="auto" w:fill="auto"/>
         <w:vertAlign w:val="baseline"/>
       </w:rPr>
     </w:lvl>
-    <w:lvl w:ilvl="6" w:tplc="BAC22DB4">
+    <w:lvl w:ilvl="6" w:tentative="0">
       <w:start w:val="1"/>
       <w:numFmt w:val="bullet"/>
       <w:lvlText w:val="•"/>
@@ -1127,7 +2828,7 @@
         <w:ind w:left="4936"/>
       </w:pPr>
       <w:rPr>
-        <w:rFonts w:ascii="Garamond" w:eastAsia="Garamond" w:hAnsi="Garamond" w:cs="Garamond"/>
+        <w:rFonts w:ascii="Garamond" w:hAnsi="Garamond" w:eastAsia="Garamond" w:cs="Garamond"/>
         <w:b w:val="0"/>
         <w:i w:val="0"/>
         <w:strike w:val="0"/>
@@ -1136,12 +2837,11 @@
         <w:sz w:val="21"/>
         <w:szCs w:val="21"/>
         <w:u w:val="none" w:color="000000"/>
-        <w:bdr w:val="none" w:sz="0" w:space="0" w:color="auto"/>
         <w:shd w:val="clear" w:color="auto" w:fill="auto"/>
         <w:vertAlign w:val="baseline"/>
       </w:rPr>
     </w:lvl>
-    <w:lvl w:ilvl="7" w:tplc="E24AB3E6">
+    <w:lvl w:ilvl="7" w:tentative="0">
       <w:start w:val="1"/>
       <w:numFmt w:val="bullet"/>
       <w:lvlText w:val="o"/>
@@ -1150,7 +2850,7 @@
         <w:ind w:left="5656"/>
       </w:pPr>
       <w:rPr>
-        <w:rFonts w:ascii="Garamond" w:eastAsia="Garamond" w:hAnsi="Garamond" w:cs="Garamond"/>
+        <w:rFonts w:ascii="Garamond" w:hAnsi="Garamond" w:eastAsia="Garamond" w:cs="Garamond"/>
         <w:b w:val="0"/>
         <w:i w:val="0"/>
         <w:strike w:val="0"/>
@@ -1159,12 +2859,11 @@
         <w:sz w:val="21"/>
         <w:szCs w:val="21"/>
         <w:u w:val="none" w:color="000000"/>
-        <w:bdr w:val="none" w:sz="0" w:space="0" w:color="auto"/>
         <w:shd w:val="clear" w:color="auto" w:fill="auto"/>
         <w:vertAlign w:val="baseline"/>
       </w:rPr>
     </w:lvl>
-    <w:lvl w:ilvl="8" w:tplc="FB08000A">
+    <w:lvl w:ilvl="8" w:tentative="0">
       <w:start w:val="1"/>
       <w:numFmt w:val="bullet"/>
       <w:lvlText w:val="▪"/>
@@ -1173,7 +2872,7 @@
         <w:ind w:left="6376"/>
       </w:pPr>
       <w:rPr>
-        <w:rFonts w:ascii="Garamond" w:eastAsia="Garamond" w:hAnsi="Garamond" w:cs="Garamond"/>
+        <w:rFonts w:ascii="Garamond" w:hAnsi="Garamond" w:eastAsia="Garamond" w:cs="Garamond"/>
         <w:b w:val="0"/>
         <w:i w:val="0"/>
         <w:strike w:val="0"/>
@@ -1182,17 +2881,16 @@
         <w:sz w:val="21"/>
         <w:szCs w:val="21"/>
         <w:u w:val="none" w:color="000000"/>
-        <w:bdr w:val="none" w:sz="0" w:space="0" w:color="auto"/>
         <w:shd w:val="clear" w:color="auto" w:fill="auto"/>
         <w:vertAlign w:val="baseline"/>
       </w:rPr>
     </w:lvl>
   </w:abstractNum>
-  <w:abstractNum w:abstractNumId="1" w15:restartNumberingAfterBreak="0">
+  <w:abstractNum w:abstractNumId="1">
     <w:nsid w:val="1ED8021E"/>
-    <w:multiLevelType w:val="hybridMultilevel"/>
-    <w:tmpl w:val="EB628DE6"/>
-    <w:lvl w:ilvl="0" w:tplc="55680220">
+    <w:multiLevelType w:val="multilevel"/>
+    <w:tmpl w:val="1ED8021E"/>
+    <w:lvl w:ilvl="0" w:tentative="0">
       <w:start w:val="1"/>
       <w:numFmt w:val="bullet"/>
       <w:lvlText w:val="•"/>
@@ -1201,7 +2899,7 @@
         <w:ind w:left="538"/>
       </w:pPr>
       <w:rPr>
-        <w:rFonts w:ascii="Garamond" w:eastAsia="Garamond" w:hAnsi="Garamond" w:cs="Garamond"/>
+        <w:rFonts w:ascii="Garamond" w:hAnsi="Garamond" w:eastAsia="Garamond" w:cs="Garamond"/>
         <w:b w:val="0"/>
         <w:i w:val="0"/>
         <w:strike w:val="0"/>
@@ -1210,12 +2908,11 @@
         <w:sz w:val="21"/>
         <w:szCs w:val="21"/>
         <w:u w:val="none" w:color="000000"/>
-        <w:bdr w:val="none" w:sz="0" w:space="0" w:color="auto"/>
         <w:shd w:val="clear" w:color="auto" w:fill="auto"/>
         <w:vertAlign w:val="baseline"/>
       </w:rPr>
     </w:lvl>
-    <w:lvl w:ilvl="1" w:tplc="07580090">
+    <w:lvl w:ilvl="1" w:tentative="0">
       <w:start w:val="1"/>
       <w:numFmt w:val="bullet"/>
       <w:lvlText w:val="o"/>
@@ -1224,7 +2921,7 @@
         <w:ind w:left="1400"/>
       </w:pPr>
       <w:rPr>
-        <w:rFonts w:ascii="Garamond" w:eastAsia="Garamond" w:hAnsi="Garamond" w:cs="Garamond"/>
+        <w:rFonts w:ascii="Garamond" w:hAnsi="Garamond" w:eastAsia="Garamond" w:cs="Garamond"/>
         <w:b w:val="0"/>
         <w:i w:val="0"/>
         <w:strike w:val="0"/>
@@ -1233,12 +2930,11 @@
         <w:sz w:val="21"/>
         <w:szCs w:val="21"/>
         <w:u w:val="none" w:color="000000"/>
-        <w:bdr w:val="none" w:sz="0" w:space="0" w:color="auto"/>
         <w:shd w:val="clear" w:color="auto" w:fill="auto"/>
         <w:vertAlign w:val="baseline"/>
       </w:rPr>
     </w:lvl>
-    <w:lvl w:ilvl="2" w:tplc="D284A43E">
+    <w:lvl w:ilvl="2" w:tentative="0">
       <w:start w:val="1"/>
       <w:numFmt w:val="bullet"/>
       <w:lvlText w:val="▪"/>
@@ -1247,7 +2943,7 @@
         <w:ind w:left="2120"/>
       </w:pPr>
       <w:rPr>
-        <w:rFonts w:ascii="Garamond" w:eastAsia="Garamond" w:hAnsi="Garamond" w:cs="Garamond"/>
+        <w:rFonts w:ascii="Garamond" w:hAnsi="Garamond" w:eastAsia="Garamond" w:cs="Garamond"/>
         <w:b w:val="0"/>
         <w:i w:val="0"/>
         <w:strike w:val="0"/>
@@ -1256,12 +2952,11 @@
         <w:sz w:val="21"/>
         <w:szCs w:val="21"/>
         <w:u w:val="none" w:color="000000"/>
-        <w:bdr w:val="none" w:sz="0" w:space="0" w:color="auto"/>
         <w:shd w:val="clear" w:color="auto" w:fill="auto"/>
         <w:vertAlign w:val="baseline"/>
       </w:rPr>
     </w:lvl>
-    <w:lvl w:ilvl="3" w:tplc="797ACA46">
+    <w:lvl w:ilvl="3" w:tentative="0">
       <w:start w:val="1"/>
       <w:numFmt w:val="bullet"/>
       <w:lvlText w:val="•"/>
@@ -1270,7 +2965,7 @@
         <w:ind w:left="2840"/>
       </w:pPr>
       <w:rPr>
-        <w:rFonts w:ascii="Garamond" w:eastAsia="Garamond" w:hAnsi="Garamond" w:cs="Garamond"/>
+        <w:rFonts w:ascii="Garamond" w:hAnsi="Garamond" w:eastAsia="Garamond" w:cs="Garamond"/>
         <w:b w:val="0"/>
         <w:i w:val="0"/>
         <w:strike w:val="0"/>
@@ -1279,12 +2974,11 @@
         <w:sz w:val="21"/>
         <w:szCs w:val="21"/>
         <w:u w:val="none" w:color="000000"/>
-        <w:bdr w:val="none" w:sz="0" w:space="0" w:color="auto"/>
         <w:shd w:val="clear" w:color="auto" w:fill="auto"/>
         <w:vertAlign w:val="baseline"/>
       </w:rPr>
     </w:lvl>
-    <w:lvl w:ilvl="4" w:tplc="5B621382">
+    <w:lvl w:ilvl="4" w:tentative="0">
       <w:start w:val="1"/>
       <w:numFmt w:val="bullet"/>
       <w:lvlText w:val="o"/>
@@ -1293,7 +2987,7 @@
         <w:ind w:left="3560"/>
       </w:pPr>
       <w:rPr>
-        <w:rFonts w:ascii="Garamond" w:eastAsia="Garamond" w:hAnsi="Garamond" w:cs="Garamond"/>
+        <w:rFonts w:ascii="Garamond" w:hAnsi="Garamond" w:eastAsia="Garamond" w:cs="Garamond"/>
         <w:b w:val="0"/>
         <w:i w:val="0"/>
         <w:strike w:val="0"/>
@@ -1302,12 +2996,11 @@
         <w:sz w:val="21"/>
         <w:szCs w:val="21"/>
         <w:u w:val="none" w:color="000000"/>
-        <w:bdr w:val="none" w:sz="0" w:space="0" w:color="auto"/>
         <w:shd w:val="clear" w:color="auto" w:fill="auto"/>
         <w:vertAlign w:val="baseline"/>
       </w:rPr>
     </w:lvl>
-    <w:lvl w:ilvl="5" w:tplc="CBC82F6A">
+    <w:lvl w:ilvl="5" w:tentative="0">
       <w:start w:val="1"/>
       <w:numFmt w:val="bullet"/>
       <w:lvlText w:val="▪"/>
@@ -1316,7 +3009,7 @@
         <w:ind w:left="4280"/>
       </w:pPr>
       <w:rPr>
-        <w:rFonts w:ascii="Garamond" w:eastAsia="Garamond" w:hAnsi="Garamond" w:cs="Garamond"/>
+        <w:rFonts w:ascii="Garamond" w:hAnsi="Garamond" w:eastAsia="Garamond" w:cs="Garamond"/>
         <w:b w:val="0"/>
         <w:i w:val="0"/>
         <w:strike w:val="0"/>
@@ -1325,12 +3018,11 @@
         <w:sz w:val="21"/>
         <w:szCs w:val="21"/>
         <w:u w:val="none" w:color="000000"/>
-        <w:bdr w:val="none" w:sz="0" w:space="0" w:color="auto"/>
         <w:shd w:val="clear" w:color="auto" w:fill="auto"/>
         <w:vertAlign w:val="baseline"/>
       </w:rPr>
     </w:lvl>
-    <w:lvl w:ilvl="6" w:tplc="46E640CE">
+    <w:lvl w:ilvl="6" w:tentative="0">
       <w:start w:val="1"/>
       <w:numFmt w:val="bullet"/>
       <w:lvlText w:val="•"/>
@@ -1339,7 +3031,7 @@
         <w:ind w:left="5000"/>
       </w:pPr>
       <w:rPr>
-        <w:rFonts w:ascii="Garamond" w:eastAsia="Garamond" w:hAnsi="Garamond" w:cs="Garamond"/>
+        <w:rFonts w:ascii="Garamond" w:hAnsi="Garamond" w:eastAsia="Garamond" w:cs="Garamond"/>
         <w:b w:val="0"/>
         <w:i w:val="0"/>
         <w:strike w:val="0"/>
@@ -1348,12 +3040,11 @@
         <w:sz w:val="21"/>
         <w:szCs w:val="21"/>
         <w:u w:val="none" w:color="000000"/>
-        <w:bdr w:val="none" w:sz="0" w:space="0" w:color="auto"/>
         <w:shd w:val="clear" w:color="auto" w:fill="auto"/>
         <w:vertAlign w:val="baseline"/>
       </w:rPr>
     </w:lvl>
-    <w:lvl w:ilvl="7" w:tplc="B4DE1FBC">
+    <w:lvl w:ilvl="7" w:tentative="0">
       <w:start w:val="1"/>
       <w:numFmt w:val="bullet"/>
       <w:lvlText w:val="o"/>
@@ -1362,7 +3053,7 @@
         <w:ind w:left="5720"/>
       </w:pPr>
       <w:rPr>
-        <w:rFonts w:ascii="Garamond" w:eastAsia="Garamond" w:hAnsi="Garamond" w:cs="Garamond"/>
+        <w:rFonts w:ascii="Garamond" w:hAnsi="Garamond" w:eastAsia="Garamond" w:cs="Garamond"/>
         <w:b w:val="0"/>
         <w:i w:val="0"/>
         <w:strike w:val="0"/>
@@ -1371,12 +3062,11 @@
         <w:sz w:val="21"/>
         <w:szCs w:val="21"/>
         <w:u w:val="none" w:color="000000"/>
-        <w:bdr w:val="none" w:sz="0" w:space="0" w:color="auto"/>
         <w:shd w:val="clear" w:color="auto" w:fill="auto"/>
         <w:vertAlign w:val="baseline"/>
       </w:rPr>
     </w:lvl>
-    <w:lvl w:ilvl="8" w:tplc="E130A616">
+    <w:lvl w:ilvl="8" w:tentative="0">
       <w:start w:val="1"/>
       <w:numFmt w:val="bullet"/>
       <w:lvlText w:val="▪"/>
@@ -1385,7 +3075,7 @@
         <w:ind w:left="6440"/>
       </w:pPr>
       <w:rPr>
-        <w:rFonts w:ascii="Garamond" w:eastAsia="Garamond" w:hAnsi="Garamond" w:cs="Garamond"/>
+        <w:rFonts w:ascii="Garamond" w:hAnsi="Garamond" w:eastAsia="Garamond" w:cs="Garamond"/>
         <w:b w:val="0"/>
         <w:i w:val="0"/>
         <w:strike w:val="0"/>
@@ -1394,17 +3084,16 @@
         <w:sz w:val="21"/>
         <w:szCs w:val="21"/>
         <w:u w:val="none" w:color="000000"/>
-        <w:bdr w:val="none" w:sz="0" w:space="0" w:color="auto"/>
         <w:shd w:val="clear" w:color="auto" w:fill="auto"/>
         <w:vertAlign w:val="baseline"/>
       </w:rPr>
     </w:lvl>
   </w:abstractNum>
-  <w:abstractNum w:abstractNumId="2" w15:restartNumberingAfterBreak="0">
+  <w:abstractNum w:abstractNumId="2">
     <w:nsid w:val="2D5E2A95"/>
-    <w:multiLevelType w:val="hybridMultilevel"/>
-    <w:tmpl w:val="A79A5914"/>
-    <w:lvl w:ilvl="0" w:tplc="E99221F4">
+    <w:multiLevelType w:val="multilevel"/>
+    <w:tmpl w:val="2D5E2A95"/>
+    <w:lvl w:ilvl="0" w:tentative="0">
       <w:start w:val="1"/>
       <w:numFmt w:val="bullet"/>
       <w:lvlText w:val="•"/>
@@ -1413,7 +3102,7 @@
         <w:ind w:left="538"/>
       </w:pPr>
       <w:rPr>
-        <w:rFonts w:ascii="Garamond" w:eastAsia="Garamond" w:hAnsi="Garamond" w:cs="Garamond"/>
+        <w:rFonts w:ascii="Garamond" w:hAnsi="Garamond" w:eastAsia="Garamond" w:cs="Garamond"/>
         <w:b w:val="0"/>
         <w:i w:val="0"/>
         <w:strike w:val="0"/>
@@ -1422,12 +3111,11 @@
         <w:sz w:val="21"/>
         <w:szCs w:val="21"/>
         <w:u w:val="none" w:color="000000"/>
-        <w:bdr w:val="none" w:sz="0" w:space="0" w:color="auto"/>
         <w:shd w:val="clear" w:color="auto" w:fill="auto"/>
         <w:vertAlign w:val="baseline"/>
       </w:rPr>
     </w:lvl>
-    <w:lvl w:ilvl="1" w:tplc="E7AEC4D0">
+    <w:lvl w:ilvl="1" w:tentative="0">
       <w:start w:val="1"/>
       <w:numFmt w:val="bullet"/>
       <w:lvlText w:val="o"/>
@@ -1436,7 +3124,7 @@
         <w:ind w:left="1400"/>
       </w:pPr>
       <w:rPr>
-        <w:rFonts w:ascii="Garamond" w:eastAsia="Garamond" w:hAnsi="Garamond" w:cs="Garamond"/>
+        <w:rFonts w:ascii="Garamond" w:hAnsi="Garamond" w:eastAsia="Garamond" w:cs="Garamond"/>
         <w:b w:val="0"/>
         <w:i w:val="0"/>
         <w:strike w:val="0"/>
@@ -1445,12 +3133,11 @@
         <w:sz w:val="21"/>
         <w:szCs w:val="21"/>
         <w:u w:val="none" w:color="000000"/>
-        <w:bdr w:val="none" w:sz="0" w:space="0" w:color="auto"/>
         <w:shd w:val="clear" w:color="auto" w:fill="auto"/>
         <w:vertAlign w:val="baseline"/>
       </w:rPr>
     </w:lvl>
-    <w:lvl w:ilvl="2" w:tplc="0B54E50C">
+    <w:lvl w:ilvl="2" w:tentative="0">
       <w:start w:val="1"/>
       <w:numFmt w:val="bullet"/>
       <w:lvlText w:val="▪"/>
@@ -1459,7 +3146,7 @@
         <w:ind w:left="2120"/>
       </w:pPr>
       <w:rPr>
-        <w:rFonts w:ascii="Garamond" w:eastAsia="Garamond" w:hAnsi="Garamond" w:cs="Garamond"/>
+        <w:rFonts w:ascii="Garamond" w:hAnsi="Garamond" w:eastAsia="Garamond" w:cs="Garamond"/>
         <w:b w:val="0"/>
         <w:i w:val="0"/>
         <w:strike w:val="0"/>
@@ -1468,12 +3155,11 @@
         <w:sz w:val="21"/>
         <w:szCs w:val="21"/>
         <w:u w:val="none" w:color="000000"/>
-        <w:bdr w:val="none" w:sz="0" w:space="0" w:color="auto"/>
         <w:shd w:val="clear" w:color="auto" w:fill="auto"/>
         <w:vertAlign w:val="baseline"/>
       </w:rPr>
     </w:lvl>
-    <w:lvl w:ilvl="3" w:tplc="9920FD38">
+    <w:lvl w:ilvl="3" w:tentative="0">
       <w:start w:val="1"/>
       <w:numFmt w:val="bullet"/>
       <w:lvlText w:val="•"/>
@@ -1482,7 +3168,7 @@
         <w:ind w:left="2840"/>
       </w:pPr>
       <w:rPr>
-        <w:rFonts w:ascii="Garamond" w:eastAsia="Garamond" w:hAnsi="Garamond" w:cs="Garamond"/>
+        <w:rFonts w:ascii="Garamond" w:hAnsi="Garamond" w:eastAsia="Garamond" w:cs="Garamond"/>
         <w:b w:val="0"/>
         <w:i w:val="0"/>
         <w:strike w:val="0"/>
@@ -1491,12 +3177,11 @@
         <w:sz w:val="21"/>
         <w:szCs w:val="21"/>
         <w:u w:val="none" w:color="000000"/>
-        <w:bdr w:val="none" w:sz="0" w:space="0" w:color="auto"/>
         <w:shd w:val="clear" w:color="auto" w:fill="auto"/>
         <w:vertAlign w:val="baseline"/>
       </w:rPr>
     </w:lvl>
-    <w:lvl w:ilvl="4" w:tplc="DE00284C">
+    <w:lvl w:ilvl="4" w:tentative="0">
       <w:start w:val="1"/>
       <w:numFmt w:val="bullet"/>
       <w:lvlText w:val="o"/>
@@ -1505,7 +3190,7 @@
         <w:ind w:left="3560"/>
       </w:pPr>
       <w:rPr>
-        <w:rFonts w:ascii="Garamond" w:eastAsia="Garamond" w:hAnsi="Garamond" w:cs="Garamond"/>
+        <w:rFonts w:ascii="Garamond" w:hAnsi="Garamond" w:eastAsia="Garamond" w:cs="Garamond"/>
         <w:b w:val="0"/>
         <w:i w:val="0"/>
         <w:strike w:val="0"/>
@@ -1514,12 +3199,11 @@
         <w:sz w:val="21"/>
         <w:szCs w:val="21"/>
         <w:u w:val="none" w:color="000000"/>
-        <w:bdr w:val="none" w:sz="0" w:space="0" w:color="auto"/>
         <w:shd w:val="clear" w:color="auto" w:fill="auto"/>
         <w:vertAlign w:val="baseline"/>
       </w:rPr>
     </w:lvl>
-    <w:lvl w:ilvl="5" w:tplc="35D0F190">
+    <w:lvl w:ilvl="5" w:tentative="0">
       <w:start w:val="1"/>
       <w:numFmt w:val="bullet"/>
       <w:lvlText w:val="▪"/>
@@ -1528,7 +3212,7 @@
         <w:ind w:left="4280"/>
       </w:pPr>
       <w:rPr>
-        <w:rFonts w:ascii="Garamond" w:eastAsia="Garamond" w:hAnsi="Garamond" w:cs="Garamond"/>
+        <w:rFonts w:ascii="Garamond" w:hAnsi="Garamond" w:eastAsia="Garamond" w:cs="Garamond"/>
         <w:b w:val="0"/>
         <w:i w:val="0"/>
         <w:strike w:val="0"/>
@@ -1537,12 +3221,11 @@
         <w:sz w:val="21"/>
         <w:szCs w:val="21"/>
         <w:u w:val="none" w:color="000000"/>
-        <w:bdr w:val="none" w:sz="0" w:space="0" w:color="auto"/>
         <w:shd w:val="clear" w:color="auto" w:fill="auto"/>
         <w:vertAlign w:val="baseline"/>
       </w:rPr>
     </w:lvl>
-    <w:lvl w:ilvl="6" w:tplc="E57C595E">
+    <w:lvl w:ilvl="6" w:tentative="0">
       <w:start w:val="1"/>
       <w:numFmt w:val="bullet"/>
       <w:lvlText w:val="•"/>
@@ -1551,7 +3234,7 @@
         <w:ind w:left="5000"/>
       </w:pPr>
       <w:rPr>
-        <w:rFonts w:ascii="Garamond" w:eastAsia="Garamond" w:hAnsi="Garamond" w:cs="Garamond"/>
+        <w:rFonts w:ascii="Garamond" w:hAnsi="Garamond" w:eastAsia="Garamond" w:cs="Garamond"/>
         <w:b w:val="0"/>
         <w:i w:val="0"/>
         <w:strike w:val="0"/>
@@ -1560,12 +3243,11 @@
         <w:sz w:val="21"/>
         <w:szCs w:val="21"/>
         <w:u w:val="none" w:color="000000"/>
-        <w:bdr w:val="none" w:sz="0" w:space="0" w:color="auto"/>
         <w:shd w:val="clear" w:color="auto" w:fill="auto"/>
         <w:vertAlign w:val="baseline"/>
       </w:rPr>
     </w:lvl>
-    <w:lvl w:ilvl="7" w:tplc="F120010C">
+    <w:lvl w:ilvl="7" w:tentative="0">
       <w:start w:val="1"/>
       <w:numFmt w:val="bullet"/>
       <w:lvlText w:val="o"/>
@@ -1574,7 +3256,7 @@
         <w:ind w:left="5720"/>
       </w:pPr>
       <w:rPr>
-        <w:rFonts w:ascii="Garamond" w:eastAsia="Garamond" w:hAnsi="Garamond" w:cs="Garamond"/>
+        <w:rFonts w:ascii="Garamond" w:hAnsi="Garamond" w:eastAsia="Garamond" w:cs="Garamond"/>
         <w:b w:val="0"/>
         <w:i w:val="0"/>
         <w:strike w:val="0"/>
@@ -1583,12 +3265,11 @@
         <w:sz w:val="21"/>
         <w:szCs w:val="21"/>
         <w:u w:val="none" w:color="000000"/>
-        <w:bdr w:val="none" w:sz="0" w:space="0" w:color="auto"/>
         <w:shd w:val="clear" w:color="auto" w:fill="auto"/>
         <w:vertAlign w:val="baseline"/>
       </w:rPr>
     </w:lvl>
-    <w:lvl w:ilvl="8" w:tplc="6FF4703A">
+    <w:lvl w:ilvl="8" w:tentative="0">
       <w:start w:val="1"/>
       <w:numFmt w:val="bullet"/>
       <w:lvlText w:val="▪"/>
@@ -1597,7 +3278,7 @@
         <w:ind w:left="6440"/>
       </w:pPr>
       <w:rPr>
-        <w:rFonts w:ascii="Garamond" w:eastAsia="Garamond" w:hAnsi="Garamond" w:cs="Garamond"/>
+        <w:rFonts w:ascii="Garamond" w:hAnsi="Garamond" w:eastAsia="Garamond" w:cs="Garamond"/>
         <w:b w:val="0"/>
         <w:i w:val="0"/>
         <w:strike w:val="0"/>
@@ -1606,441 +3287,308 @@
         <w:sz w:val="21"/>
         <w:szCs w:val="21"/>
         <w:u w:val="none" w:color="000000"/>
-        <w:bdr w:val="none" w:sz="0" w:space="0" w:color="auto"/>
         <w:shd w:val="clear" w:color="auto" w:fill="auto"/>
         <w:vertAlign w:val="baseline"/>
       </w:rPr>
     </w:lvl>
   </w:abstractNum>
-  <w:num w:numId="1" w16cid:durableId="1696496195">
+  <w:num w:numId="1">
     <w:abstractNumId w:val="2"/>
   </w:num>
-  <w:num w:numId="2" w16cid:durableId="508446994">
+  <w:num w:numId="2">
     <w:abstractNumId w:val="1"/>
   </w:num>
-  <w:num w:numId="3" w16cid:durableId="658464076">
+  <w:num w:numId="3">
     <w:abstractNumId w:val="0"/>
   </w:num>
 </w:numbering>
 </file>
 
 <file path=word/styles.xml><?xml version="1.0" encoding="utf-8"?>
-<w:styles xmlns:mc="http://schemas.openxmlformats.org/markup-compatibility/2006" xmlns:r="http://schemas.openxmlformats.org/officeDocument/2006/relationships" xmlns:w="http://schemas.openxmlformats.org/wordprocessingml/2006/main" xmlns:w14="http://schemas.microsoft.com/office/word/2010/wordml" xmlns:w15="http://schemas.microsoft.com/office/word/2012/wordml" xmlns:w16cex="http://schemas.microsoft.com/office/word/2018/wordml/cex" xmlns:w16cid="http://schemas.microsoft.com/office/word/2016/wordml/cid" xmlns:w16="http://schemas.microsoft.com/office/word/2018/wordml" xmlns:w16du="http://schemas.microsoft.com/office/word/2023/wordml/word16du" xmlns:w16sdtdh="http://schemas.microsoft.com/office/word/2020/wordml/sdtdatahash" xmlns:w16sdtfl="http://schemas.microsoft.com/office/word/2024/wordml/sdtformatlock" xmlns:w16se="http://schemas.microsoft.com/office/word/2015/wordml/symex" mc:Ignorable="w14 w15 w16se w16cid w16 w16cex w16sdtdh w16sdtfl w16du">
+<w:styles xmlns:mc="http://schemas.openxmlformats.org/markup-compatibility/2006" xmlns:o="urn:schemas-microsoft-com:office:office" xmlns:r="http://schemas.openxmlformats.org/officeDocument/2006/relationships" xmlns:m="http://schemas.openxmlformats.org/officeDocument/2006/math" xmlns:v="urn:schemas-microsoft-com:vml" xmlns:w="http://schemas.openxmlformats.org/wordprocessingml/2006/main" xmlns:w14="http://schemas.microsoft.com/office/word/2010/wordml" xmlns:w10="urn:schemas-microsoft-com:office:word" xmlns:sl="http://schemas.openxmlformats.org/schemaLibrary/2006/main" xmlns:wpsCustomData="http://www.wps.cn/officeDocument/2013/wpsCustomData" mc:Ignorable="w14">
   <w:docDefaults>
     <w:rPrDefault>
       <w:rPr>
-        <w:rFonts w:asciiTheme="minorHAnsi" w:eastAsiaTheme="minorEastAsia" w:hAnsiTheme="minorHAnsi" w:cstheme="minorBidi"/>
-        <w:kern w:val="2"/>
-        <w:sz w:val="24"/>
-        <w:szCs w:val="24"/>
-        <w:lang w:val="en-US" w:eastAsia="en-US" w:bidi="ar-SA"/>
-        <w14:ligatures w14:val="standardContextual"/>
+        <w:rFonts w:ascii="Calibri" w:hAnsi="Calibri" w:eastAsia="Calibri" w:cs="Calibri"/>
       </w:rPr>
     </w:rPrDefault>
-    <w:pPrDefault>
-      <w:pPr>
-        <w:spacing w:after="160" w:line="278" w:lineRule="auto"/>
-      </w:pPr>
-    </w:pPrDefault>
+    <w:pPrDefault/>
   </w:docDefaults>
-  <w:latentStyles w:defLockedState="0" w:defUIPriority="99" w:defSemiHidden="0" w:defUnhideWhenUsed="0" w:defQFormat="0" w:count="376">
-    <w:lsdException w:name="Normal" w:uiPriority="0" w:qFormat="1"/>
-    <w:lsdException w:name="heading 1" w:uiPriority="9" w:qFormat="1"/>
-    <w:lsdException w:name="heading 2" w:semiHidden="1" w:uiPriority="9" w:unhideWhenUsed="1" w:qFormat="1"/>
-    <w:lsdException w:name="heading 3" w:semiHidden="1" w:uiPriority="9" w:unhideWhenUsed="1" w:qFormat="1"/>
-    <w:lsdException w:name="heading 4" w:semiHidden="1" w:uiPriority="9" w:unhideWhenUsed="1" w:qFormat="1"/>
-    <w:lsdException w:name="heading 5" w:semiHidden="1" w:uiPriority="9" w:unhideWhenUsed="1" w:qFormat="1"/>
-    <w:lsdException w:name="heading 6" w:semiHidden="1" w:uiPriority="9" w:unhideWhenUsed="1" w:qFormat="1"/>
-    <w:lsdException w:name="heading 7" w:semiHidden="1" w:uiPriority="9" w:unhideWhenUsed="1" w:qFormat="1"/>
-    <w:lsdException w:name="heading 8" w:semiHidden="1" w:uiPriority="9" w:unhideWhenUsed="1" w:qFormat="1"/>
-    <w:lsdException w:name="heading 9" w:semiHidden="1" w:uiPriority="9" w:unhideWhenUsed="1" w:qFormat="1"/>
-    <w:lsdException w:name="index 1" w:semiHidden="1" w:unhideWhenUsed="1"/>
-    <w:lsdException w:name="index 2" w:semiHidden="1" w:unhideWhenUsed="1"/>
-    <w:lsdException w:name="index 3" w:semiHidden="1" w:unhideWhenUsed="1"/>
-    <w:lsdException w:name="index 4" w:semiHidden="1" w:unhideWhenUsed="1"/>
-    <w:lsdException w:name="index 5" w:semiHidden="1" w:unhideWhenUsed="1"/>
-    <w:lsdException w:name="index 6" w:semiHidden="1" w:unhideWhenUsed="1"/>
-    <w:lsdException w:name="index 7" w:semiHidden="1" w:unhideWhenUsed="1"/>
-    <w:lsdException w:name="index 8" w:semiHidden="1" w:unhideWhenUsed="1"/>
-    <w:lsdException w:name="index 9" w:semiHidden="1" w:unhideWhenUsed="1"/>
-    <w:lsdException w:name="toc 1" w:semiHidden="1" w:uiPriority="39" w:unhideWhenUsed="1"/>
-    <w:lsdException w:name="toc 2" w:semiHidden="1" w:uiPriority="39" w:unhideWhenUsed="1"/>
-    <w:lsdException w:name="toc 3" w:semiHidden="1" w:uiPriority="39" w:unhideWhenUsed="1"/>
-    <w:lsdException w:name="toc 4" w:semiHidden="1" w:uiPriority="39" w:unhideWhenUsed="1"/>
-    <w:lsdException w:name="toc 5" w:semiHidden="1" w:uiPriority="39" w:unhideWhenUsed="1"/>
-    <w:lsdException w:name="toc 6" w:semiHidden="1" w:uiPriority="39" w:unhideWhenUsed="1"/>
-    <w:lsdException w:name="toc 7" w:semiHidden="1" w:uiPriority="39" w:unhideWhenUsed="1"/>
-    <w:lsdException w:name="toc 8" w:semiHidden="1" w:uiPriority="39" w:unhideWhenUsed="1"/>
-    <w:lsdException w:name="toc 9" w:semiHidden="1" w:uiPriority="39" w:unhideWhenUsed="1"/>
-    <w:lsdException w:name="Normal Indent" w:semiHidden="1" w:unhideWhenUsed="1"/>
-    <w:lsdException w:name="footnote text" w:semiHidden="1" w:unhideWhenUsed="1"/>
-    <w:lsdException w:name="annotation text" w:semiHidden="1" w:unhideWhenUsed="1"/>
-    <w:lsdException w:name="header" w:semiHidden="1" w:unhideWhenUsed="1"/>
-    <w:lsdException w:name="footer" w:semiHidden="1" w:unhideWhenUsed="1"/>
-    <w:lsdException w:name="index heading" w:semiHidden="1" w:unhideWhenUsed="1"/>
-    <w:lsdException w:name="caption" w:semiHidden="1" w:uiPriority="35" w:unhideWhenUsed="1" w:qFormat="1"/>
-    <w:lsdException w:name="table of figures" w:semiHidden="1" w:unhideWhenUsed="1"/>
-    <w:lsdException w:name="envelope address" w:semiHidden="1" w:unhideWhenUsed="1"/>
-    <w:lsdException w:name="envelope return" w:semiHidden="1" w:unhideWhenUsed="1"/>
-    <w:lsdException w:name="footnote reference" w:semiHidden="1" w:unhideWhenUsed="1"/>
-    <w:lsdException w:name="annotation reference" w:semiHidden="1" w:unhideWhenUsed="1"/>
-    <w:lsdException w:name="line number" w:semiHidden="1" w:unhideWhenUsed="1"/>
-    <w:lsdException w:name="page number" w:semiHidden="1" w:unhideWhenUsed="1"/>
-    <w:lsdException w:name="endnote reference" w:semiHidden="1" w:unhideWhenUsed="1"/>
-    <w:lsdException w:name="endnote text" w:semiHidden="1" w:unhideWhenUsed="1"/>
-    <w:lsdException w:name="table of authorities" w:semiHidden="1" w:unhideWhenUsed="1"/>
-    <w:lsdException w:name="macro" w:semiHidden="1" w:unhideWhenUsed="1"/>
-    <w:lsdException w:name="toa heading" w:semiHidden="1" w:unhideWhenUsed="1"/>
-    <w:lsdException w:name="List" w:semiHidden="1" w:unhideWhenUsed="1"/>
-    <w:lsdException w:name="List Bullet" w:semiHidden="1" w:unhideWhenUsed="1"/>
-    <w:lsdException w:name="List Number" w:semiHidden="1" w:unhideWhenUsed="1"/>
-    <w:lsdException w:name="List 2" w:semiHidden="1" w:unhideWhenUsed="1"/>
-    <w:lsdException w:name="List 3" w:semiHidden="1" w:unhideWhenUsed="1"/>
-    <w:lsdException w:name="List 4" w:semiHidden="1" w:unhideWhenUsed="1"/>
-    <w:lsdException w:name="List 5" w:semiHidden="1" w:unhideWhenUsed="1"/>
-    <w:lsdException w:name="List Bullet 2" w:semiHidden="1" w:unhideWhenUsed="1"/>
-    <w:lsdException w:name="List Bullet 3" w:semiHidden="1" w:unhideWhenUsed="1"/>
-    <w:lsdException w:name="List Bullet 4" w:semiHidden="1" w:unhideWhenUsed="1"/>
-    <w:lsdException w:name="List Bullet 5" w:semiHidden="1" w:unhideWhenUsed="1"/>
-    <w:lsdException w:name="List Number 2" w:semiHidden="1" w:unhideWhenUsed="1"/>
-    <w:lsdException w:name="List Number 3" w:semiHidden="1" w:unhideWhenUsed="1"/>
-    <w:lsdException w:name="List Number 4" w:semiHidden="1" w:unhideWhenUsed="1"/>
-    <w:lsdException w:name="List Number 5" w:semiHidden="1" w:unhideWhenUsed="1"/>
-    <w:lsdException w:name="Title" w:uiPriority="10" w:qFormat="1"/>
-    <w:lsdException w:name="Closing" w:semiHidden="1" w:unhideWhenUsed="1"/>
-    <w:lsdException w:name="Signature" w:semiHidden="1" w:unhideWhenUsed="1"/>
-    <w:lsdException w:name="Default Paragraph Font" w:semiHidden="1" w:uiPriority="1" w:unhideWhenUsed="1"/>
-    <w:lsdException w:name="Body Text" w:semiHidden="1" w:unhideWhenUsed="1"/>
-    <w:lsdException w:name="Body Text Indent" w:semiHidden="1" w:unhideWhenUsed="1"/>
-    <w:lsdException w:name="List Continue" w:semiHidden="1" w:unhideWhenUsed="1"/>
-    <w:lsdException w:name="List Continue 2" w:semiHidden="1" w:unhideWhenUsed="1"/>
-    <w:lsdException w:name="List Continue 3" w:semiHidden="1" w:unhideWhenUsed="1"/>
-    <w:lsdException w:name="List Continue 4" w:semiHidden="1" w:unhideWhenUsed="1"/>
-    <w:lsdException w:name="List Continue 5" w:semiHidden="1" w:unhideWhenUsed="1"/>
-    <w:lsdException w:name="Message Header" w:semiHidden="1" w:unhideWhenUsed="1"/>
-    <w:lsdException w:name="Subtitle" w:uiPriority="11" w:qFormat="1"/>
-    <w:lsdException w:name="Salutation" w:semiHidden="1" w:unhideWhenUsed="1"/>
-    <w:lsdException w:name="Date" w:semiHidden="1" w:unhideWhenUsed="1"/>
-    <w:lsdException w:name="Body Text First Indent" w:semiHidden="1" w:unhideWhenUsed="1"/>
-    <w:lsdException w:name="Body Text First Indent 2" w:semiHidden="1" w:unhideWhenUsed="1"/>
-    <w:lsdException w:name="Note Heading" w:semiHidden="1" w:unhideWhenUsed="1"/>
-    <w:lsdException w:name="Body Text 2" w:semiHidden="1" w:unhideWhenUsed="1"/>
-    <w:lsdException w:name="Body Text 3" w:semiHidden="1" w:unhideWhenUsed="1"/>
-    <w:lsdException w:name="Body Text Indent 2" w:semiHidden="1" w:unhideWhenUsed="1"/>
-    <w:lsdException w:name="Body Text Indent 3" w:semiHidden="1" w:unhideWhenUsed="1"/>
-    <w:lsdException w:name="Block Text" w:semiHidden="1" w:unhideWhenUsed="1"/>
-    <w:lsdException w:name="Hyperlink" w:semiHidden="1" w:unhideWhenUsed="1"/>
-    <w:lsdException w:name="FollowedHyperlink" w:semiHidden="1" w:unhideWhenUsed="1"/>
-    <w:lsdException w:name="Strong" w:uiPriority="22" w:qFormat="1"/>
-    <w:lsdException w:name="Emphasis" w:uiPriority="20" w:qFormat="1"/>
-    <w:lsdException w:name="Document Map" w:semiHidden="1" w:unhideWhenUsed="1"/>
-    <w:lsdException w:name="Plain Text" w:semiHidden="1" w:unhideWhenUsed="1"/>
-    <w:lsdException w:name="E-mail Signature" w:semiHidden="1" w:unhideWhenUsed="1"/>
-    <w:lsdException w:name="HTML Top of Form" w:semiHidden="1" w:unhideWhenUsed="1"/>
-    <w:lsdException w:name="HTML Bottom of Form" w:semiHidden="1" w:unhideWhenUsed="1"/>
-    <w:lsdException w:name="Normal (Web)" w:semiHidden="1" w:unhideWhenUsed="1"/>
-    <w:lsdException w:name="HTML Acronym" w:semiHidden="1" w:unhideWhenUsed="1"/>
-    <w:lsdException w:name="HTML Address" w:semiHidden="1" w:unhideWhenUsed="1"/>
-    <w:lsdException w:name="HTML Cite" w:semiHidden="1" w:unhideWhenUsed="1"/>
-    <w:lsdException w:name="HTML Code" w:semiHidden="1" w:unhideWhenUsed="1"/>
-    <w:lsdException w:name="HTML Definition" w:semiHidden="1" w:unhideWhenUsed="1"/>
-    <w:lsdException w:name="HTML Keyboard" w:semiHidden="1" w:unhideWhenUsed="1"/>
-    <w:lsdException w:name="HTML Preformatted" w:semiHidden="1" w:unhideWhenUsed="1"/>
-    <w:lsdException w:name="HTML Sample" w:semiHidden="1" w:unhideWhenUsed="1"/>
-    <w:lsdException w:name="HTML Typewriter" w:semiHidden="1" w:unhideWhenUsed="1"/>
-    <w:lsdException w:name="HTML Variable" w:semiHidden="1" w:unhideWhenUsed="1"/>
-    <w:lsdException w:name="Normal Table" w:semiHidden="1" w:unhideWhenUsed="1"/>
-    <w:lsdException w:name="annotation subject" w:semiHidden="1" w:unhideWhenUsed="1"/>
-    <w:lsdException w:name="No List" w:semiHidden="1" w:unhideWhenUsed="1"/>
-    <w:lsdException w:name="Outline List 1" w:semiHidden="1" w:unhideWhenUsed="1"/>
-    <w:lsdException w:name="Outline List 2" w:semiHidden="1" w:unhideWhenUsed="1"/>
-    <w:lsdException w:name="Outline List 3" w:semiHidden="1" w:unhideWhenUsed="1"/>
-    <w:lsdException w:name="Table Simple 1" w:semiHidden="1" w:unhideWhenUsed="1"/>
-    <w:lsdException w:name="Table Simple 2" w:semiHidden="1" w:unhideWhenUsed="1"/>
-    <w:lsdException w:name="Table Simple 3" w:semiHidden="1" w:unhideWhenUsed="1"/>
-    <w:lsdException w:name="Table Classic 1" w:semiHidden="1" w:unhideWhenUsed="1"/>
-    <w:lsdException w:name="Table Classic 2" w:semiHidden="1" w:unhideWhenUsed="1"/>
-    <w:lsdException w:name="Table Classic 3" w:semiHidden="1" w:unhideWhenUsed="1"/>
-    <w:lsdException w:name="Table Classic 4" w:semiHidden="1" w:unhideWhenUsed="1"/>
-    <w:lsdException w:name="Table Colorful 1" w:semiHidden="1" w:unhideWhenUsed="1"/>
-    <w:lsdException w:name="Table Colorful 2" w:semiHidden="1" w:unhideWhenUsed="1"/>
-    <w:lsdException w:name="Table Colorful 3" w:semiHidden="1" w:unhideWhenUsed="1"/>
-    <w:lsdException w:name="Table Columns 1" w:semiHidden="1" w:unhideWhenUsed="1"/>
-    <w:lsdException w:name="Table Columns 2" w:semiHidden="1" w:unhideWhenUsed="1"/>
-    <w:lsdException w:name="Table Columns 3" w:semiHidden="1" w:unhideWhenUsed="1"/>
-    <w:lsdException w:name="Table Columns 4" w:semiHidden="1" w:unhideWhenUsed="1"/>
-    <w:lsdException w:name="Table Columns 5" w:semiHidden="1" w:unhideWhenUsed="1"/>
-    <w:lsdException w:name="Table Grid 1" w:semiHidden="1" w:unhideWhenUsed="1"/>
-    <w:lsdException w:name="Table Grid 2" w:semiHidden="1" w:unhideWhenUsed="1"/>
-    <w:lsdException w:name="Table Grid 3" w:semiHidden="1" w:unhideWhenUsed="1"/>
-    <w:lsdException w:name="Table Grid 4" w:semiHidden="1" w:unhideWhenUsed="1"/>
-    <w:lsdException w:name="Table Grid 5" w:semiHidden="1" w:unhideWhenUsed="1"/>
-    <w:lsdException w:name="Table Grid 6" w:semiHidden="1" w:unhideWhenUsed="1"/>
-    <w:lsdException w:name="Table Grid 7" w:semiHidden="1" w:unhideWhenUsed="1"/>
-    <w:lsdException w:name="Table Grid 8" w:semiHidden="1" w:unhideWhenUsed="1"/>
-    <w:lsdException w:name="Table List 1" w:semiHidden="1" w:unhideWhenUsed="1"/>
-    <w:lsdException w:name="Table List 2" w:semiHidden="1" w:unhideWhenUsed="1"/>
-    <w:lsdException w:name="Table List 3" w:semiHidden="1" w:unhideWhenUsed="1"/>
-    <w:lsdException w:name="Table List 4" w:semiHidden="1" w:unhideWhenUsed="1"/>
-    <w:lsdException w:name="Table List 5" w:semiHidden="1" w:unhideWhenUsed="1"/>
-    <w:lsdException w:name="Table List 6" w:semiHidden="1" w:unhideWhenUsed="1"/>
-    <w:lsdException w:name="Table List 7" w:semiHidden="1" w:unhideWhenUsed="1"/>
-    <w:lsdException w:name="Table List 8" w:semiHidden="1" w:unhideWhenUsed="1"/>
-    <w:lsdException w:name="Table 3D effects 1" w:semiHidden="1" w:unhideWhenUsed="1"/>
-    <w:lsdException w:name="Table 3D effects 2" w:semiHidden="1" w:unhideWhenUsed="1"/>
-    <w:lsdException w:name="Table 3D effects 3" w:semiHidden="1" w:unhideWhenUsed="1"/>
-    <w:lsdException w:name="Table Contemporary" w:semiHidden="1" w:unhideWhenUsed="1"/>
-    <w:lsdException w:name="Table Elegant" w:semiHidden="1" w:unhideWhenUsed="1"/>
-    <w:lsdException w:name="Table Professional" w:semiHidden="1" w:unhideWhenUsed="1"/>
-    <w:lsdException w:name="Table Subtle 1" w:semiHidden="1" w:unhideWhenUsed="1"/>
-    <w:lsdException w:name="Table Subtle 2" w:semiHidden="1" w:unhideWhenUsed="1"/>
-    <w:lsdException w:name="Table Web 1" w:semiHidden="1" w:unhideWhenUsed="1"/>
-    <w:lsdException w:name="Table Web 2" w:semiHidden="1" w:unhideWhenUsed="1"/>
-    <w:lsdException w:name="Table Web 3" w:semiHidden="1" w:unhideWhenUsed="1"/>
-    <w:lsdException w:name="Balloon Text" w:semiHidden="1" w:unhideWhenUsed="1"/>
-    <w:lsdException w:name="Table Grid" w:uiPriority="39"/>
-    <w:lsdException w:name="Table Theme" w:semiHidden="1" w:unhideWhenUsed="1"/>
-    <w:lsdException w:name="Placeholder Text" w:semiHidden="1"/>
-    <w:lsdException w:name="No Spacing" w:uiPriority="1" w:qFormat="1"/>
-    <w:lsdException w:name="Light Shading" w:uiPriority="60"/>
-    <w:lsdException w:name="Light List" w:uiPriority="61"/>
-    <w:lsdException w:name="Light Grid" w:uiPriority="62"/>
-    <w:lsdException w:name="Medium Shading 1" w:uiPriority="63"/>
-    <w:lsdException w:name="Medium Shading 2" w:uiPriority="64"/>
-    <w:lsdException w:name="Medium List 1" w:uiPriority="65"/>
-    <w:lsdException w:name="Medium List 2" w:uiPriority="66"/>
-    <w:lsdException w:name="Medium Grid 1" w:uiPriority="67"/>
-    <w:lsdException w:name="Medium Grid 2" w:uiPriority="68"/>
-    <w:lsdException w:name="Medium Grid 3" w:uiPriority="69"/>
-    <w:lsdException w:name="Dark List" w:uiPriority="70"/>
-    <w:lsdException w:name="Colorful Shading" w:uiPriority="71"/>
-    <w:lsdException w:name="Colorful List" w:uiPriority="72"/>
-    <w:lsdException w:name="Colorful Grid" w:uiPriority="73"/>
-    <w:lsdException w:name="Light Shading Accent 1" w:uiPriority="60"/>
-    <w:lsdException w:name="Light List Accent 1" w:uiPriority="61"/>
-    <w:lsdException w:name="Light Grid Accent 1" w:uiPriority="62"/>
-    <w:lsdException w:name="Medium Shading 1 Accent 1" w:uiPriority="63"/>
-    <w:lsdException w:name="Medium Shading 2 Accent 1" w:uiPriority="64"/>
-    <w:lsdException w:name="Medium List 1 Accent 1" w:uiPriority="65"/>
-    <w:lsdException w:name="Revision" w:semiHidden="1"/>
-    <w:lsdException w:name="List Paragraph" w:uiPriority="34" w:qFormat="1"/>
-    <w:lsdException w:name="Quote" w:uiPriority="29" w:qFormat="1"/>
-    <w:lsdException w:name="Intense Quote" w:uiPriority="30" w:qFormat="1"/>
-    <w:lsdException w:name="Medium List 2 Accent 1" w:uiPriority="66"/>
-    <w:lsdException w:name="Medium Grid 1 Accent 1" w:uiPriority="67"/>
-    <w:lsdException w:name="Medium Grid 2 Accent 1" w:uiPriority="68"/>
-    <w:lsdException w:name="Medium Grid 3 Accent 1" w:uiPriority="69"/>
-    <w:lsdException w:name="Dark List Accent 1" w:uiPriority="70"/>
-    <w:lsdException w:name="Colorful Shading Accent 1" w:uiPriority="71"/>
-    <w:lsdException w:name="Colorful List Accent 1" w:uiPriority="72"/>
-    <w:lsdException w:name="Colorful Grid Accent 1" w:uiPriority="73"/>
-    <w:lsdException w:name="Light Shading Accent 2" w:uiPriority="60"/>
-    <w:lsdException w:name="Light List Accent 2" w:uiPriority="61"/>
-    <w:lsdException w:name="Light Grid Accent 2" w:uiPriority="62"/>
-    <w:lsdException w:name="Medium Shading 1 Accent 2" w:uiPriority="63"/>
-    <w:lsdException w:name="Medium Shading 2 Accent 2" w:uiPriority="64"/>
-    <w:lsdException w:name="Medium List 1 Accent 2" w:uiPriority="65"/>
-    <w:lsdException w:name="Medium List 2 Accent 2" w:uiPriority="66"/>
-    <w:lsdException w:name="Medium Grid 1 Accent 2" w:uiPriority="67"/>
-    <w:lsdException w:name="Medium Grid 2 Accent 2" w:uiPriority="68"/>
-    <w:lsdException w:name="Medium Grid 3 Accent 2" w:uiPriority="69"/>
-    <w:lsdException w:name="Dark List Accent 2" w:uiPriority="70"/>
-    <w:lsdException w:name="Colorful Shading Accent 2" w:uiPriority="71"/>
-    <w:lsdException w:name="Colorful List Accent 2" w:uiPriority="72"/>
-    <w:lsdException w:name="Colorful Grid Accent 2" w:uiPriority="73"/>
-    <w:lsdException w:name="Light Shading Accent 3" w:uiPriority="60"/>
-    <w:lsdException w:name="Light List Accent 3" w:uiPriority="61"/>
-    <w:lsdException w:name="Light Grid Accent 3" w:uiPriority="62"/>
-    <w:lsdException w:name="Medium Shading 1 Accent 3" w:uiPriority="63"/>
-    <w:lsdException w:name="Medium Shading 2 Accent 3" w:uiPriority="64"/>
-    <w:lsdException w:name="Medium List 1 Accent 3" w:uiPriority="65"/>
-    <w:lsdException w:name="Medium List 2 Accent 3" w:uiPriority="66"/>
-    <w:lsdException w:name="Medium Grid 1 Accent 3" w:uiPriority="67"/>
-    <w:lsdException w:name="Medium Grid 2 Accent 3" w:uiPriority="68"/>
-    <w:lsdException w:name="Medium Grid 3 Accent 3" w:uiPriority="69"/>
-    <w:lsdException w:name="Dark List Accent 3" w:uiPriority="70"/>
-    <w:lsdException w:name="Colorful Shading Accent 3" w:uiPriority="71"/>
-    <w:lsdException w:name="Colorful List Accent 3" w:uiPriority="72"/>
-    <w:lsdException w:name="Colorful Grid Accent 3" w:uiPriority="73"/>
-    <w:lsdException w:name="Light Shading Accent 4" w:uiPriority="60"/>
-    <w:lsdException w:name="Light List Accent 4" w:uiPriority="61"/>
-    <w:lsdException w:name="Light Grid Accent 4" w:uiPriority="62"/>
-    <w:lsdException w:name="Medium Shading 1 Accent 4" w:uiPriority="63"/>
-    <w:lsdException w:name="Medium Shading 2 Accent 4" w:uiPriority="64"/>
-    <w:lsdException w:name="Medium List 1 Accent 4" w:uiPriority="65"/>
-    <w:lsdException w:name="Medium List 2 Accent 4" w:uiPriority="66"/>
-    <w:lsdException w:name="Medium Grid 1 Accent 4" w:uiPriority="67"/>
-    <w:lsdException w:name="Medium Grid 2 Accent 4" w:uiPriority="68"/>
-    <w:lsdException w:name="Medium Grid 3 Accent 4" w:uiPriority="69"/>
-    <w:lsdException w:name="Dark List Accent 4" w:uiPriority="70"/>
-    <w:lsdException w:name="Colorful Shading Accent 4" w:uiPriority="71"/>
-    <w:lsdException w:name="Colorful List Accent 4" w:uiPriority="72"/>
-    <w:lsdException w:name="Colorful Grid Accent 4" w:uiPriority="73"/>
-    <w:lsdException w:name="Light Shading Accent 5" w:uiPriority="60"/>
-    <w:lsdException w:name="Light List Accent 5" w:uiPriority="61"/>
-    <w:lsdException w:name="Light Grid Accent 5" w:uiPriority="62"/>
-    <w:lsdException w:name="Medium Shading 1 Accent 5" w:uiPriority="63"/>
-    <w:lsdException w:name="Medium Shading 2 Accent 5" w:uiPriority="64"/>
-    <w:lsdException w:name="Medium List 1 Accent 5" w:uiPriority="65"/>
-    <w:lsdException w:name="Medium List 2 Accent 5" w:uiPriority="66"/>
-    <w:lsdException w:name="Medium Grid 1 Accent 5" w:uiPriority="67"/>
-    <w:lsdException w:name="Medium Grid 2 Accent 5" w:uiPriority="68"/>
-    <w:lsdException w:name="Medium Grid 3 Accent 5" w:uiPriority="69"/>
-    <w:lsdException w:name="Dark List Accent 5" w:uiPriority="70"/>
-    <w:lsdException w:name="Colorful Shading Accent 5" w:uiPriority="71"/>
-    <w:lsdException w:name="Colorful List Accent 5" w:uiPriority="72"/>
-    <w:lsdException w:name="Colorful Grid Accent 5" w:uiPriority="73"/>
-    <w:lsdException w:name="Light Shading Accent 6" w:uiPriority="60"/>
-    <w:lsdException w:name="Light List Accent 6" w:uiPriority="61"/>
-    <w:lsdException w:name="Light Grid Accent 6" w:uiPriority="62"/>
-    <w:lsdException w:name="Medium Shading 1 Accent 6" w:uiPriority="63"/>
-    <w:lsdException w:name="Medium Shading 2 Accent 6" w:uiPriority="64"/>
-    <w:lsdException w:name="Medium List 1 Accent 6" w:uiPriority="65"/>
-    <w:lsdException w:name="Medium List 2 Accent 6" w:uiPriority="66"/>
-    <w:lsdException w:name="Medium Grid 1 Accent 6" w:uiPriority="67"/>
-    <w:lsdException w:name="Medium Grid 2 Accent 6" w:uiPriority="68"/>
-    <w:lsdException w:name="Medium Grid 3 Accent 6" w:uiPriority="69"/>
-    <w:lsdException w:name="Dark List Accent 6" w:uiPriority="70"/>
-    <w:lsdException w:name="Colorful Shading Accent 6" w:uiPriority="71"/>
-    <w:lsdException w:name="Colorful List Accent 6" w:uiPriority="72"/>
-    <w:lsdException w:name="Colorful Grid Accent 6" w:uiPriority="73"/>
-    <w:lsdException w:name="Subtle Emphasis" w:uiPriority="19" w:qFormat="1"/>
-    <w:lsdException w:name="Intense Emphasis" w:uiPriority="21" w:qFormat="1"/>
-    <w:lsdException w:name="Subtle Reference" w:uiPriority="31" w:qFormat="1"/>
-    <w:lsdException w:name="Intense Reference" w:uiPriority="32" w:qFormat="1"/>
-    <w:lsdException w:name="Book Title" w:uiPriority="33" w:qFormat="1"/>
-    <w:lsdException w:name="Bibliography" w:semiHidden="1" w:uiPriority="37" w:unhideWhenUsed="1"/>
-    <w:lsdException w:name="TOC Heading" w:semiHidden="1" w:uiPriority="39" w:unhideWhenUsed="1" w:qFormat="1"/>
-    <w:lsdException w:name="Plain Table 1" w:uiPriority="41"/>
-    <w:lsdException w:name="Plain Table 2" w:uiPriority="42"/>
-    <w:lsdException w:name="Plain Table 3" w:uiPriority="43"/>
-    <w:lsdException w:name="Plain Table 4" w:uiPriority="44"/>
-    <w:lsdException w:name="Plain Table 5" w:uiPriority="45"/>
-    <w:lsdException w:name="Grid Table Light" w:uiPriority="40"/>
-    <w:lsdException w:name="Grid Table 1 Light" w:uiPriority="46"/>
-    <w:lsdException w:name="Grid Table 2" w:uiPriority="47"/>
-    <w:lsdException w:name="Grid Table 3" w:uiPriority="48"/>
-    <w:lsdException w:name="Grid Table 4" w:uiPriority="49"/>
-    <w:lsdException w:name="Grid Table 5 Dark" w:uiPriority="50"/>
-    <w:lsdException w:name="Grid Table 6 Colorful" w:uiPriority="51"/>
-    <w:lsdException w:name="Grid Table 7 Colorful" w:uiPriority="52"/>
-    <w:lsdException w:name="Grid Table 1 Light Accent 1" w:uiPriority="46"/>
-    <w:lsdException w:name="Grid Table 2 Accent 1" w:uiPriority="47"/>
-    <w:lsdException w:name="Grid Table 3 Accent 1" w:uiPriority="48"/>
-    <w:lsdException w:name="Grid Table 4 Accent 1" w:uiPriority="49"/>
-    <w:lsdException w:name="Grid Table 5 Dark Accent 1" w:uiPriority="50"/>
-    <w:lsdException w:name="Grid Table 6 Colorful Accent 1" w:uiPriority="51"/>
-    <w:lsdException w:name="Grid Table 7 Colorful Accent 1" w:uiPriority="52"/>
-    <w:lsdException w:name="Grid Table 1 Light Accent 2" w:uiPriority="46"/>
-    <w:lsdException w:name="Grid Table 2 Accent 2" w:uiPriority="47"/>
-    <w:lsdException w:name="Grid Table 3 Accent 2" w:uiPriority="48"/>
-    <w:lsdException w:name="Grid Table 4 Accent 2" w:uiPriority="49"/>
-    <w:lsdException w:name="Grid Table 5 Dark Accent 2" w:uiPriority="50"/>
-    <w:lsdException w:name="Grid Table 6 Colorful Accent 2" w:uiPriority="51"/>
-    <w:lsdException w:name="Grid Table 7 Colorful Accent 2" w:uiPriority="52"/>
-    <w:lsdException w:name="Grid Table 1 Light Accent 3" w:uiPriority="46"/>
-    <w:lsdException w:name="Grid Table 2 Accent 3" w:uiPriority="47"/>
-    <w:lsdException w:name="Grid Table 3 Accent 3" w:uiPriority="48"/>
-    <w:lsdException w:name="Grid Table 4 Accent 3" w:uiPriority="49"/>
-    <w:lsdException w:name="Grid Table 5 Dark Accent 3" w:uiPriority="50"/>
-    <w:lsdException w:name="Grid Table 6 Colorful Accent 3" w:uiPriority="51"/>
-    <w:lsdException w:name="Grid Table 7 Colorful Accent 3" w:uiPriority="52"/>
-    <w:lsdException w:name="Grid Table 1 Light Accent 4" w:uiPriority="46"/>
-    <w:lsdException w:name="Grid Table 2 Accent 4" w:uiPriority="47"/>
-    <w:lsdException w:name="Grid Table 3 Accent 4" w:uiPriority="48"/>
-    <w:lsdException w:name="Grid Table 4 Accent 4" w:uiPriority="49"/>
-    <w:lsdException w:name="Grid Table 5 Dark Accent 4" w:uiPriority="50"/>
-    <w:lsdException w:name="Grid Table 6 Colorful Accent 4" w:uiPriority="51"/>
-    <w:lsdException w:name="Grid Table 7 Colorful Accent 4" w:uiPriority="52"/>
-    <w:lsdException w:name="Grid Table 1 Light Accent 5" w:uiPriority="46"/>
-    <w:lsdException w:name="Grid Table 2 Accent 5" w:uiPriority="47"/>
-    <w:lsdException w:name="Grid Table 3 Accent 5" w:uiPriority="48"/>
-    <w:lsdException w:name="Grid Table 4 Accent 5" w:uiPriority="49"/>
-    <w:lsdException w:name="Grid Table 5 Dark Accent 5" w:uiPriority="50"/>
-    <w:lsdException w:name="Grid Table 6 Colorful Accent 5" w:uiPriority="51"/>
-    <w:lsdException w:name="Grid Table 7 Colorful Accent 5" w:uiPriority="52"/>
-    <w:lsdException w:name="Grid Table 1 Light Accent 6" w:uiPriority="46"/>
-    <w:lsdException w:name="Grid Table 2 Accent 6" w:uiPriority="47"/>
-    <w:lsdException w:name="Grid Table 3 Accent 6" w:uiPriority="48"/>
-    <w:lsdException w:name="Grid Table 4 Accent 6" w:uiPriority="49"/>
-    <w:lsdException w:name="Grid Table 5 Dark Accent 6" w:uiPriority="50"/>
-    <w:lsdException w:name="Grid Table 6 Colorful Accent 6" w:uiPriority="51"/>
-    <w:lsdException w:name="Grid Table 7 Colorful Accent 6" w:uiPriority="52"/>
-    <w:lsdException w:name="List Table 1 Light" w:uiPriority="46"/>
-    <w:lsdException w:name="List Table 2" w:uiPriority="47"/>
-    <w:lsdException w:name="List Table 3" w:uiPriority="48"/>
-    <w:lsdException w:name="List Table 4" w:uiPriority="49"/>
-    <w:lsdException w:name="List Table 5 Dark" w:uiPriority="50"/>
-    <w:lsdException w:name="List Table 6 Colorful" w:uiPriority="51"/>
-    <w:lsdException w:name="List Table 7 Colorful" w:uiPriority="52"/>
-    <w:lsdException w:name="List Table 1 Light Accent 1" w:uiPriority="46"/>
-    <w:lsdException w:name="List Table 2 Accent 1" w:uiPriority="47"/>
-    <w:lsdException w:name="List Table 3 Accent 1" w:uiPriority="48"/>
-    <w:lsdException w:name="List Table 4 Accent 1" w:uiPriority="49"/>
-    <w:lsdException w:name="List Table 5 Dark Accent 1" w:uiPriority="50"/>
-    <w:lsdException w:name="List Table 6 Colorful Accent 1" w:uiPriority="51"/>
-    <w:lsdException w:name="List Table 7 Colorful Accent 1" w:uiPriority="52"/>
-    <w:lsdException w:name="List Table 1 Light Accent 2" w:uiPriority="46"/>
-    <w:lsdException w:name="List Table 2 Accent 2" w:uiPriority="47"/>
-    <w:lsdException w:name="List Table 3 Accent 2" w:uiPriority="48"/>
-    <w:lsdException w:name="List Table 4 Accent 2" w:uiPriority="49"/>
-    <w:lsdException w:name="List Table 5 Dark Accent 2" w:uiPriority="50"/>
-    <w:lsdException w:name="List Table 6 Colorful Accent 2" w:uiPriority="51"/>
-    <w:lsdException w:name="List Table 7 Colorful Accent 2" w:uiPriority="52"/>
-    <w:lsdException w:name="List Table 1 Light Accent 3" w:uiPriority="46"/>
-    <w:lsdException w:name="List Table 2 Accent 3" w:uiPriority="47"/>
-    <w:lsdException w:name="List Table 3 Accent 3" w:uiPriority="48"/>
-    <w:lsdException w:name="List Table 4 Accent 3" w:uiPriority="49"/>
-    <w:lsdException w:name="List Table 5 Dark Accent 3" w:uiPriority="50"/>
-    <w:lsdException w:name="List Table 6 Colorful Accent 3" w:uiPriority="51"/>
-    <w:lsdException w:name="List Table 7 Colorful Accent 3" w:uiPriority="52"/>
-    <w:lsdException w:name="List Table 1 Light Accent 4" w:uiPriority="46"/>
-    <w:lsdException w:name="List Table 2 Accent 4" w:uiPriority="47"/>
-    <w:lsdException w:name="List Table 3 Accent 4" w:uiPriority="48"/>
-    <w:lsdException w:name="List Table 4 Accent 4" w:uiPriority="49"/>
-    <w:lsdException w:name="List Table 5 Dark Accent 4" w:uiPriority="50"/>
-    <w:lsdException w:name="List Table 6 Colorful Accent 4" w:uiPriority="51"/>
-    <w:lsdException w:name="List Table 7 Colorful Accent 4" w:uiPriority="52"/>
-    <w:lsdException w:name="List Table 1 Light Accent 5" w:uiPriority="46"/>
-    <w:lsdException w:name="List Table 2 Accent 5" w:uiPriority="47"/>
-    <w:lsdException w:name="List Table 3 Accent 5" w:uiPriority="48"/>
-    <w:lsdException w:name="List Table 4 Accent 5" w:uiPriority="49"/>
-    <w:lsdException w:name="List Table 5 Dark Accent 5" w:uiPriority="50"/>
-    <w:lsdException w:name="List Table 6 Colorful Accent 5" w:uiPriority="51"/>
-    <w:lsdException w:name="List Table 7 Colorful Accent 5" w:uiPriority="52"/>
-    <w:lsdException w:name="List Table 1 Light Accent 6" w:uiPriority="46"/>
-    <w:lsdException w:name="List Table 2 Accent 6" w:uiPriority="47"/>
-    <w:lsdException w:name="List Table 3 Accent 6" w:uiPriority="48"/>
-    <w:lsdException w:name="List Table 4 Accent 6" w:uiPriority="49"/>
-    <w:lsdException w:name="List Table 5 Dark Accent 6" w:uiPriority="50"/>
-    <w:lsdException w:name="List Table 6 Colorful Accent 6" w:uiPriority="51"/>
-    <w:lsdException w:name="List Table 7 Colorful Accent 6" w:uiPriority="52"/>
-    <w:lsdException w:name="Mention" w:semiHidden="1" w:unhideWhenUsed="1"/>
-    <w:lsdException w:name="Smart Hyperlink" w:semiHidden="1" w:unhideWhenUsed="1"/>
-    <w:lsdException w:name="Hashtag" w:semiHidden="1" w:unhideWhenUsed="1"/>
-    <w:lsdException w:name="Unresolved Mention" w:semiHidden="1" w:unhideWhenUsed="1"/>
-    <w:lsdException w:name="Smart Link" w:semiHidden="1" w:unhideWhenUsed="1"/>
+  <w:latentStyles w:count="260" w:defQFormat="0" w:defUnhideWhenUsed="1" w:defSemiHidden="1" w:defUIPriority="99" w:defLockedState="0">
+    <w:lsdException w:qFormat="1" w:unhideWhenUsed="0" w:uiPriority="0" w:semiHidden="0" w:name="Normal"/>
+    <w:lsdException w:qFormat="1" w:unhideWhenUsed="0" w:uiPriority="9" w:semiHidden="0" w:name="heading 1"/>
+    <w:lsdException w:qFormat="1" w:uiPriority="9" w:name="heading 2"/>
+    <w:lsdException w:qFormat="1" w:uiPriority="9" w:name="heading 3"/>
+    <w:lsdException w:qFormat="1" w:uiPriority="9" w:name="heading 4"/>
+    <w:lsdException w:qFormat="1" w:uiPriority="9" w:name="heading 5"/>
+    <w:lsdException w:qFormat="1" w:uiPriority="9" w:name="heading 6"/>
+    <w:lsdException w:qFormat="1" w:uiPriority="9" w:name="heading 7"/>
+    <w:lsdException w:qFormat="1" w:uiPriority="9" w:name="heading 8"/>
+    <w:lsdException w:qFormat="1" w:uiPriority="9" w:name="heading 9"/>
+    <w:lsdException w:uiPriority="99" w:name="index 1"/>
+    <w:lsdException w:uiPriority="99" w:name="index 2"/>
+    <w:lsdException w:uiPriority="99" w:name="index 3"/>
+    <w:lsdException w:uiPriority="99" w:name="index 4"/>
+    <w:lsdException w:uiPriority="99" w:name="index 5"/>
+    <w:lsdException w:uiPriority="99" w:name="index 6"/>
+    <w:lsdException w:uiPriority="99" w:name="index 7"/>
+    <w:lsdException w:uiPriority="99" w:name="index 8"/>
+    <w:lsdException w:uiPriority="99" w:name="index 9"/>
+    <w:lsdException w:uiPriority="39" w:name="toc 1"/>
+    <w:lsdException w:uiPriority="39" w:name="toc 2"/>
+    <w:lsdException w:uiPriority="39" w:name="toc 3"/>
+    <w:lsdException w:uiPriority="39" w:name="toc 4"/>
+    <w:lsdException w:uiPriority="39" w:name="toc 5"/>
+    <w:lsdException w:uiPriority="39" w:name="toc 6"/>
+    <w:lsdException w:uiPriority="39" w:name="toc 7"/>
+    <w:lsdException w:uiPriority="39" w:name="toc 8"/>
+    <w:lsdException w:uiPriority="39" w:name="toc 9"/>
+    <w:lsdException w:uiPriority="99" w:name="Normal Indent"/>
+    <w:lsdException w:uiPriority="99" w:name="footnote text"/>
+    <w:lsdException w:uiPriority="99" w:name="annotation text"/>
+    <w:lsdException w:uiPriority="99" w:name="header"/>
+    <w:lsdException w:uiPriority="99" w:name="footer"/>
+    <w:lsdException w:uiPriority="99" w:name="index heading"/>
+    <w:lsdException w:qFormat="1" w:uiPriority="35" w:name="caption"/>
+    <w:lsdException w:uiPriority="99" w:name="table of figures"/>
+    <w:lsdException w:uiPriority="99" w:name="envelope address"/>
+    <w:lsdException w:uiPriority="99" w:name="envelope return"/>
+    <w:lsdException w:uiPriority="99" w:name="footnote reference"/>
+    <w:lsdException w:uiPriority="99" w:name="annotation reference"/>
+    <w:lsdException w:uiPriority="99" w:name="line number"/>
+    <w:lsdException w:uiPriority="99" w:name="page number"/>
+    <w:lsdException w:uiPriority="99" w:name="endnote reference"/>
+    <w:lsdException w:uiPriority="99" w:name="endnote text"/>
+    <w:lsdException w:uiPriority="99" w:name="table of authorities"/>
+    <w:lsdException w:uiPriority="99" w:name="macro"/>
+    <w:lsdException w:uiPriority="99" w:name="toa heading"/>
+    <w:lsdException w:uiPriority="99" w:name="List"/>
+    <w:lsdException w:uiPriority="99" w:name="List Bullet"/>
+    <w:lsdException w:uiPriority="99" w:name="List Number"/>
+    <w:lsdException w:uiPriority="99" w:name="List 2"/>
+    <w:lsdException w:uiPriority="99" w:name="List 3"/>
+    <w:lsdException w:uiPriority="99" w:name="List 4"/>
+    <w:lsdException w:uiPriority="99" w:name="List 5"/>
+    <w:lsdException w:uiPriority="99" w:name="List Bullet 2"/>
+    <w:lsdException w:uiPriority="99" w:name="List Bullet 3"/>
+    <w:lsdException w:uiPriority="99" w:name="List Bullet 4"/>
+    <w:lsdException w:uiPriority="99" w:name="List Bullet 5"/>
+    <w:lsdException w:uiPriority="99" w:name="List Number 2"/>
+    <w:lsdException w:uiPriority="99" w:name="List Number 3"/>
+    <w:lsdException w:uiPriority="99" w:name="List Number 4"/>
+    <w:lsdException w:uiPriority="99" w:name="List Number 5"/>
+    <w:lsdException w:qFormat="1" w:unhideWhenUsed="0" w:uiPriority="10" w:semiHidden="0" w:name="Title"/>
+    <w:lsdException w:uiPriority="99" w:name="Closing"/>
+    <w:lsdException w:uiPriority="99" w:name="Signature"/>
+    <w:lsdException w:qFormat="1" w:uiPriority="1" w:name="Default Paragraph Font"/>
+    <w:lsdException w:uiPriority="99" w:name="Body Text"/>
+    <w:lsdException w:uiPriority="99" w:name="Body Text Indent"/>
+    <w:lsdException w:uiPriority="99" w:name="List Continue"/>
+    <w:lsdException w:uiPriority="99" w:name="List Continue 2"/>
+    <w:lsdException w:uiPriority="99" w:name="List Continue 3"/>
+    <w:lsdException w:uiPriority="99" w:name="List Continue 4"/>
+    <w:lsdException w:uiPriority="99" w:name="List Continue 5"/>
+    <w:lsdException w:uiPriority="99" w:name="Message Header"/>
+    <w:lsdException w:qFormat="1" w:unhideWhenUsed="0" w:uiPriority="11" w:semiHidden="0" w:name="Subtitle"/>
+    <w:lsdException w:uiPriority="99" w:name="Salutation"/>
+    <w:lsdException w:uiPriority="99" w:name="Date"/>
+    <w:lsdException w:uiPriority="99" w:name="Body Text First Indent"/>
+    <w:lsdException w:uiPriority="99" w:name="Body Text First Indent 2"/>
+    <w:lsdException w:uiPriority="99" w:name="Note Heading"/>
+    <w:lsdException w:uiPriority="99" w:name="Body Text 2"/>
+    <w:lsdException w:uiPriority="99" w:name="Body Text 3"/>
+    <w:lsdException w:uiPriority="99" w:name="Body Text Indent 2"/>
+    <w:lsdException w:uiPriority="99" w:name="Body Text Indent 3"/>
+    <w:lsdException w:uiPriority="99" w:name="Block Text"/>
+    <w:lsdException w:uiPriority="99" w:name="Hyperlink"/>
+    <w:lsdException w:uiPriority="99" w:name="FollowedHyperlink"/>
+    <w:lsdException w:qFormat="1" w:unhideWhenUsed="0" w:uiPriority="22" w:semiHidden="0" w:name="Strong"/>
+    <w:lsdException w:qFormat="1" w:unhideWhenUsed="0" w:uiPriority="20" w:semiHidden="0" w:name="Emphasis"/>
+    <w:lsdException w:uiPriority="99" w:name="Document Map"/>
+    <w:lsdException w:uiPriority="99" w:name="Plain Text"/>
+    <w:lsdException w:uiPriority="99" w:name="E-mail Signature"/>
+    <w:lsdException w:uiPriority="99" w:name="Normal (Web)"/>
+    <w:lsdException w:uiPriority="99" w:name="HTML Acronym"/>
+    <w:lsdException w:uiPriority="99" w:name="HTML Address"/>
+    <w:lsdException w:uiPriority="99" w:name="HTML Cite"/>
+    <w:lsdException w:uiPriority="99" w:name="HTML Code"/>
+    <w:lsdException w:uiPriority="99" w:name="HTML Definition"/>
+    <w:lsdException w:uiPriority="99" w:name="HTML Keyboard"/>
+    <w:lsdException w:uiPriority="99" w:name="HTML Preformatted"/>
+    <w:lsdException w:uiPriority="99" w:name="HTML Sample"/>
+    <w:lsdException w:uiPriority="99" w:name="HTML Typewriter"/>
+    <w:lsdException w:uiPriority="99" w:name="HTML Variable"/>
+    <w:lsdException w:qFormat="1" w:uiPriority="99" w:name="Normal Table"/>
+    <w:lsdException w:uiPriority="99" w:name="annotation subject"/>
+    <w:lsdException w:uiPriority="99" w:name="Table Simple 1"/>
+    <w:lsdException w:uiPriority="99" w:name="Table Simple 2"/>
+    <w:lsdException w:uiPriority="99" w:name="Table Simple 3"/>
+    <w:lsdException w:uiPriority="99" w:name="Table Classic 1"/>
+    <w:lsdException w:uiPriority="99" w:name="Table Classic 2"/>
+    <w:lsdException w:uiPriority="99" w:name="Table Classic 3"/>
+    <w:lsdException w:uiPriority="99" w:name="Table Classic 4"/>
+    <w:lsdException w:uiPriority="99" w:name="Table Colorful 1"/>
+    <w:lsdException w:uiPriority="99" w:name="Table Colorful 2"/>
+    <w:lsdException w:uiPriority="99" w:name="Table Colorful 3"/>
+    <w:lsdException w:uiPriority="99" w:name="Table Columns 1"/>
+    <w:lsdException w:uiPriority="99" w:name="Table Columns 2"/>
+    <w:lsdException w:uiPriority="99" w:name="Table Columns 3"/>
+    <w:lsdException w:uiPriority="99" w:name="Table Columns 4"/>
+    <w:lsdException w:uiPriority="99" w:name="Table Columns 5"/>
+    <w:lsdException w:uiPriority="99" w:name="Table Grid 1"/>
+    <w:lsdException w:uiPriority="99" w:name="Table Grid 2"/>
+    <w:lsdException w:uiPriority="99" w:name="Table Grid 3"/>
+    <w:lsdException w:uiPriority="99" w:name="Table Grid 4"/>
+    <w:lsdException w:uiPriority="99" w:name="Table Grid 5"/>
+    <w:lsdException w:uiPriority="99" w:name="Table Grid 6"/>
+    <w:lsdException w:uiPriority="99" w:name="Table Grid 7"/>
+    <w:lsdException w:uiPriority="99" w:name="Table Grid 8"/>
+    <w:lsdException w:uiPriority="99" w:name="Table List 1"/>
+    <w:lsdException w:uiPriority="99" w:name="Table List 2"/>
+    <w:lsdException w:uiPriority="99" w:name="Table List 3"/>
+    <w:lsdException w:uiPriority="99" w:name="Table List 4"/>
+    <w:lsdException w:uiPriority="99" w:name="Table List 5"/>
+    <w:lsdException w:uiPriority="99" w:name="Table List 6"/>
+    <w:lsdException w:uiPriority="99" w:name="Table List 7"/>
+    <w:lsdException w:uiPriority="99" w:name="Table List 8"/>
+    <w:lsdException w:uiPriority="99" w:name="Table 3D effects 1"/>
+    <w:lsdException w:uiPriority="99" w:name="Table 3D effects 2"/>
+    <w:lsdException w:uiPriority="99" w:name="Table 3D effects 3"/>
+    <w:lsdException w:uiPriority="99" w:name="Table Contemporary"/>
+    <w:lsdException w:uiPriority="99" w:name="Table Elegant"/>
+    <w:lsdException w:uiPriority="99" w:name="Table Professional"/>
+    <w:lsdException w:uiPriority="99" w:name="Table Subtle 1"/>
+    <w:lsdException w:uiPriority="99" w:name="Table Subtle 2"/>
+    <w:lsdException w:uiPriority="99" w:name="Table Web 1"/>
+    <w:lsdException w:uiPriority="99" w:name="Table Web 2"/>
+    <w:lsdException w:uiPriority="99" w:name="Table Web 3"/>
+    <w:lsdException w:uiPriority="99" w:name="Balloon Text"/>
+    <w:lsdException w:unhideWhenUsed="0" w:uiPriority="39" w:semiHidden="0" w:name="Table Grid"/>
+    <w:lsdException w:uiPriority="99" w:name="Table Theme"/>
+    <w:lsdException w:unhideWhenUsed="0" w:uiPriority="60" w:semiHidden="0" w:name="Light Shading"/>
+    <w:lsdException w:unhideWhenUsed="0" w:uiPriority="61" w:semiHidden="0" w:name="Light List"/>
+    <w:lsdException w:unhideWhenUsed="0" w:uiPriority="62" w:semiHidden="0" w:name="Light Grid"/>
+    <w:lsdException w:unhideWhenUsed="0" w:uiPriority="63" w:semiHidden="0" w:name="Medium Shading 1"/>
+    <w:lsdException w:unhideWhenUsed="0" w:uiPriority="64" w:semiHidden="0" w:name="Medium Shading 2"/>
+    <w:lsdException w:unhideWhenUsed="0" w:uiPriority="65" w:semiHidden="0" w:name="Medium List 1"/>
+    <w:lsdException w:unhideWhenUsed="0" w:uiPriority="66" w:semiHidden="0" w:name="Medium List 2"/>
+    <w:lsdException w:unhideWhenUsed="0" w:uiPriority="67" w:semiHidden="0" w:name="Medium Grid 1"/>
+    <w:lsdException w:unhideWhenUsed="0" w:uiPriority="68" w:semiHidden="0" w:name="Medium Grid 2"/>
+    <w:lsdException w:unhideWhenUsed="0" w:uiPriority="69" w:semiHidden="0" w:name="Medium Grid 3"/>
+    <w:lsdException w:unhideWhenUsed="0" w:uiPriority="70" w:semiHidden="0" w:name="Dark List"/>
+    <w:lsdException w:unhideWhenUsed="0" w:uiPriority="71" w:semiHidden="0" w:name="Colorful Shading"/>
+    <w:lsdException w:unhideWhenUsed="0" w:uiPriority="72" w:semiHidden="0" w:name="Colorful List"/>
+    <w:lsdException w:unhideWhenUsed="0" w:uiPriority="73" w:semiHidden="0" w:name="Colorful Grid"/>
+    <w:lsdException w:unhideWhenUsed="0" w:uiPriority="60" w:semiHidden="0" w:name="Light Shading Accent 1"/>
+    <w:lsdException w:unhideWhenUsed="0" w:uiPriority="61" w:semiHidden="0" w:name="Light List Accent 1"/>
+    <w:lsdException w:unhideWhenUsed="0" w:uiPriority="62" w:semiHidden="0" w:name="Light Grid Accent 1"/>
+    <w:lsdException w:unhideWhenUsed="0" w:uiPriority="63" w:semiHidden="0" w:name="Medium Shading 1 Accent 1"/>
+    <w:lsdException w:unhideWhenUsed="0" w:uiPriority="64" w:semiHidden="0" w:name="Medium Shading 2 Accent 1"/>
+    <w:lsdException w:unhideWhenUsed="0" w:uiPriority="65" w:semiHidden="0" w:name="Medium List 1 Accent 1"/>
+    <w:lsdException w:unhideWhenUsed="0" w:uiPriority="66" w:semiHidden="0" w:name="Medium List 2 Accent 1"/>
+    <w:lsdException w:unhideWhenUsed="0" w:uiPriority="67" w:semiHidden="0" w:name="Medium Grid 1 Accent 1"/>
+    <w:lsdException w:unhideWhenUsed="0" w:uiPriority="68" w:semiHidden="0" w:name="Medium Grid 2 Accent 1"/>
+    <w:lsdException w:unhideWhenUsed="0" w:uiPriority="69" w:semiHidden="0" w:name="Medium Grid 3 Accent 1"/>
+    <w:lsdException w:unhideWhenUsed="0" w:uiPriority="70" w:semiHidden="0" w:name="Dark List Accent 1"/>
+    <w:lsdException w:unhideWhenUsed="0" w:uiPriority="71" w:semiHidden="0" w:name="Colorful Shading Accent 1"/>
+    <w:lsdException w:unhideWhenUsed="0" w:uiPriority="72" w:semiHidden="0" w:name="Colorful List Accent 1"/>
+    <w:lsdException w:unhideWhenUsed="0" w:uiPriority="73" w:semiHidden="0" w:name="Colorful Grid Accent 1"/>
+    <w:lsdException w:unhideWhenUsed="0" w:uiPriority="60" w:semiHidden="0" w:name="Light Shading Accent 2"/>
+    <w:lsdException w:unhideWhenUsed="0" w:uiPriority="61" w:semiHidden="0" w:name="Light List Accent 2"/>
+    <w:lsdException w:unhideWhenUsed="0" w:uiPriority="62" w:semiHidden="0" w:name="Light Grid Accent 2"/>
+    <w:lsdException w:unhideWhenUsed="0" w:uiPriority="63" w:semiHidden="0" w:name="Medium Shading 1 Accent 2"/>
+    <w:lsdException w:unhideWhenUsed="0" w:uiPriority="64" w:semiHidden="0" w:name="Medium Shading 2 Accent 2"/>
+    <w:lsdException w:unhideWhenUsed="0" w:uiPriority="65" w:semiHidden="0" w:name="Medium List 1 Accent 2"/>
+    <w:lsdException w:unhideWhenUsed="0" w:uiPriority="66" w:semiHidden="0" w:name="Medium List 2 Accent 2"/>
+    <w:lsdException w:unhideWhenUsed="0" w:uiPriority="67" w:semiHidden="0" w:name="Medium Grid 1 Accent 2"/>
+    <w:lsdException w:unhideWhenUsed="0" w:uiPriority="68" w:semiHidden="0" w:name="Medium Grid 2 Accent 2"/>
+    <w:lsdException w:unhideWhenUsed="0" w:uiPriority="69" w:semiHidden="0" w:name="Medium Grid 3 Accent 2"/>
+    <w:lsdException w:unhideWhenUsed="0" w:uiPriority="70" w:semiHidden="0" w:name="Dark List Accent 2"/>
+    <w:lsdException w:unhideWhenUsed="0" w:uiPriority="71" w:semiHidden="0" w:name="Colorful Shading Accent 2"/>
+    <w:lsdException w:unhideWhenUsed="0" w:uiPriority="72" w:semiHidden="0" w:name="Colorful List Accent 2"/>
+    <w:lsdException w:unhideWhenUsed="0" w:uiPriority="73" w:semiHidden="0" w:name="Colorful Grid Accent 2"/>
+    <w:lsdException w:unhideWhenUsed="0" w:uiPriority="60" w:semiHidden="0" w:name="Light Shading Accent 3"/>
+    <w:lsdException w:unhideWhenUsed="0" w:uiPriority="61" w:semiHidden="0" w:name="Light List Accent 3"/>
+    <w:lsdException w:unhideWhenUsed="0" w:uiPriority="62" w:semiHidden="0" w:name="Light Grid Accent 3"/>
+    <w:lsdException w:unhideWhenUsed="0" w:uiPriority="63" w:semiHidden="0" w:name="Medium Shading 1 Accent 3"/>
+    <w:lsdException w:unhideWhenUsed="0" w:uiPriority="64" w:semiHidden="0" w:name="Medium Shading 2 Accent 3"/>
+    <w:lsdException w:unhideWhenUsed="0" w:uiPriority="65" w:semiHidden="0" w:name="Medium List 1 Accent 3"/>
+    <w:lsdException w:unhideWhenUsed="0" w:uiPriority="66" w:semiHidden="0" w:name="Medium List 2 Accent 3"/>
+    <w:lsdException w:unhideWhenUsed="0" w:uiPriority="67" w:semiHidden="0" w:name="Medium Grid 1 Accent 3"/>
+    <w:lsdException w:unhideWhenUsed="0" w:uiPriority="68" w:semiHidden="0" w:name="Medium Grid 2 Accent 3"/>
+    <w:lsdException w:unhideWhenUsed="0" w:uiPriority="69" w:semiHidden="0" w:name="Medium Grid 3 Accent 3"/>
+    <w:lsdException w:unhideWhenUsed="0" w:uiPriority="70" w:semiHidden="0" w:name="Dark List Accent 3"/>
+    <w:lsdException w:unhideWhenUsed="0" w:uiPriority="71" w:semiHidden="0" w:name="Colorful Shading Accent 3"/>
+    <w:lsdException w:unhideWhenUsed="0" w:uiPriority="72" w:semiHidden="0" w:name="Colorful List Accent 3"/>
+    <w:lsdException w:unhideWhenUsed="0" w:uiPriority="73" w:semiHidden="0" w:name="Colorful Grid Accent 3"/>
+    <w:lsdException w:unhideWhenUsed="0" w:uiPriority="60" w:semiHidden="0" w:name="Light Shading Accent 4"/>
+    <w:lsdException w:unhideWhenUsed="0" w:uiPriority="61" w:semiHidden="0" w:name="Light List Accent 4"/>
+    <w:lsdException w:unhideWhenUsed="0" w:uiPriority="62" w:semiHidden="0" w:name="Light Grid Accent 4"/>
+    <w:lsdException w:unhideWhenUsed="0" w:uiPriority="63" w:semiHidden="0" w:name="Medium Shading 1 Accent 4"/>
+    <w:lsdException w:unhideWhenUsed="0" w:uiPriority="64" w:semiHidden="0" w:name="Medium Shading 2 Accent 4"/>
+    <w:lsdException w:unhideWhenUsed="0" w:uiPriority="65" w:semiHidden="0" w:name="Medium List 1 Accent 4"/>
+    <w:lsdException w:unhideWhenUsed="0" w:uiPriority="66" w:semiHidden="0" w:name="Medium List 2 Accent 4"/>
+    <w:lsdException w:unhideWhenUsed="0" w:uiPriority="67" w:semiHidden="0" w:name="Medium Grid 1 Accent 4"/>
+    <w:lsdException w:unhideWhenUsed="0" w:uiPriority="68" w:semiHidden="0" w:name="Medium Grid 2 Accent 4"/>
+    <w:lsdException w:unhideWhenUsed="0" w:uiPriority="69" w:semiHidden="0" w:name="Medium Grid 3 Accent 4"/>
+    <w:lsdException w:unhideWhenUsed="0" w:uiPriority="70" w:semiHidden="0" w:name="Dark List Accent 4"/>
+    <w:lsdException w:unhideWhenUsed="0" w:uiPriority="71" w:semiHidden="0" w:name="Colorful Shading Accent 4"/>
+    <w:lsdException w:unhideWhenUsed="0" w:uiPriority="72" w:semiHidden="0" w:name="Colorful List Accent 4"/>
+    <w:lsdException w:unhideWhenUsed="0" w:uiPriority="73" w:semiHidden="0" w:name="Colorful Grid Accent 4"/>
+    <w:lsdException w:unhideWhenUsed="0" w:uiPriority="60" w:semiHidden="0" w:name="Light Shading Accent 5"/>
+    <w:lsdException w:unhideWhenUsed="0" w:uiPriority="61" w:semiHidden="0" w:name="Light List Accent 5"/>
+    <w:lsdException w:unhideWhenUsed="0" w:uiPriority="62" w:semiHidden="0" w:name="Light Grid Accent 5"/>
+    <w:lsdException w:unhideWhenUsed="0" w:uiPriority="63" w:semiHidden="0" w:name="Medium Shading 1 Accent 5"/>
+    <w:lsdException w:unhideWhenUsed="0" w:uiPriority="64" w:semiHidden="0" w:name="Medium Shading 2 Accent 5"/>
+    <w:lsdException w:unhideWhenUsed="0" w:uiPriority="65" w:semiHidden="0" w:name="Medium List 1 Accent 5"/>
+    <w:lsdException w:unhideWhenUsed="0" w:uiPriority="66" w:semiHidden="0" w:name="Medium List 2 Accent 5"/>
+    <w:lsdException w:unhideWhenUsed="0" w:uiPriority="67" w:semiHidden="0" w:name="Medium Grid 1 Accent 5"/>
+    <w:lsdException w:unhideWhenUsed="0" w:uiPriority="68" w:semiHidden="0" w:name="Medium Grid 2 Accent 5"/>
+    <w:lsdException w:unhideWhenUsed="0" w:uiPriority="69" w:semiHidden="0" w:name="Medium Grid 3 Accent 5"/>
+    <w:lsdException w:unhideWhenUsed="0" w:uiPriority="70" w:semiHidden="0" w:name="Dark List Accent 5"/>
+    <w:lsdException w:unhideWhenUsed="0" w:uiPriority="71" w:semiHidden="0" w:name="Colorful Shading Accent 5"/>
+    <w:lsdException w:unhideWhenUsed="0" w:uiPriority="72" w:semiHidden="0" w:name="Colorful List Accent 5"/>
+    <w:lsdException w:unhideWhenUsed="0" w:uiPriority="73" w:semiHidden="0" w:name="Colorful Grid Accent 5"/>
+    <w:lsdException w:unhideWhenUsed="0" w:uiPriority="60" w:semiHidden="0" w:name="Light Shading Accent 6"/>
+    <w:lsdException w:unhideWhenUsed="0" w:uiPriority="61" w:semiHidden="0" w:name="Light List Accent 6"/>
+    <w:lsdException w:unhideWhenUsed="0" w:uiPriority="62" w:semiHidden="0" w:name="Light Grid Accent 6"/>
+    <w:lsdException w:unhideWhenUsed="0" w:uiPriority="63" w:semiHidden="0" w:name="Medium Shading 1 Accent 6"/>
+    <w:lsdException w:unhideWhenUsed="0" w:uiPriority="64" w:semiHidden="0" w:name="Medium Shading 2 Accent 6"/>
+    <w:lsdException w:unhideWhenUsed="0" w:uiPriority="65" w:semiHidden="0" w:name="Medium List 1 Accent 6"/>
+    <w:lsdException w:unhideWhenUsed="0" w:uiPriority="66" w:semiHidden="0" w:name="Medium List 2 Accent 6"/>
+    <w:lsdException w:unhideWhenUsed="0" w:uiPriority="67" w:semiHidden="0" w:name="Medium Grid 1 Accent 6"/>
+    <w:lsdException w:unhideWhenUsed="0" w:uiPriority="68" w:semiHidden="0" w:name="Medium Grid 2 Accent 6"/>
+    <w:lsdException w:unhideWhenUsed="0" w:uiPriority="69" w:semiHidden="0" w:name="Medium Grid 3 Accent 6"/>
+    <w:lsdException w:unhideWhenUsed="0" w:uiPriority="70" w:semiHidden="0" w:name="Dark List Accent 6"/>
+    <w:lsdException w:unhideWhenUsed="0" w:uiPriority="71" w:semiHidden="0" w:name="Colorful Shading Accent 6"/>
+    <w:lsdException w:unhideWhenUsed="0" w:uiPriority="72" w:semiHidden="0" w:name="Colorful List Accent 6"/>
+    <w:lsdException w:unhideWhenUsed="0" w:uiPriority="73" w:semiHidden="0" w:name="Colorful Grid Accent 6"/>
   </w:latentStyles>
-  <w:style w:type="paragraph" w:default="1" w:styleId="Normal">
+  <w:style w:type="paragraph" w:default="1" w:styleId="1">
     <w:name w:val="Normal"/>
     <w:qFormat/>
+    <w:uiPriority w:val="0"/>
     <w:pPr>
       <w:spacing w:after="48" w:line="268" w:lineRule="auto"/>
       <w:ind w:left="10" w:hanging="10"/>
       <w:jc w:val="both"/>
     </w:pPr>
     <w:rPr>
-      <w:rFonts w:ascii="Garamond" w:eastAsia="Garamond" w:hAnsi="Garamond" w:cs="Garamond"/>
+      <w:rFonts w:ascii="Garamond" w:hAnsi="Garamond" w:eastAsia="Garamond" w:cs="Garamond"/>
       <w:color w:val="000000"/>
+      <w:kern w:val="2"/>
       <w:sz w:val="21"/>
+      <w:szCs w:val="24"/>
+      <w:lang w:val="en-US" w:eastAsia="en-US" w:bidi="ar-SA"/>
+      <w14:ligatures w14:val="standardContextual"/>
     </w:rPr>
   </w:style>
-  <w:style w:type="paragraph" w:styleId="Heading1">
+  <w:style w:type="paragraph" w:styleId="2">
     <w:name w:val="heading 1"/>
-    <w:next w:val="Normal"/>
-    <w:link w:val="Heading1Char"/>
+    <w:next w:val="1"/>
+    <w:link w:val="7"/>
+    <w:qFormat/>
     <w:uiPriority w:val="9"/>
-    <w:qFormat/>
     <w:pPr>
       <w:keepNext/>
       <w:keepLines/>
@@ -2049,25 +3597,43 @@
       <w:outlineLvl w:val="0"/>
     </w:pPr>
     <w:rPr>
-      <w:rFonts w:ascii="Garamond" w:eastAsia="Garamond" w:hAnsi="Garamond" w:cs="Garamond"/>
+      <w:rFonts w:ascii="Garamond" w:hAnsi="Garamond" w:eastAsia="Garamond" w:cs="Garamond"/>
       <w:b/>
       <w:color w:val="000000"/>
+      <w:kern w:val="2"/>
       <w:sz w:val="21"/>
+      <w:szCs w:val="24"/>
+      <w:lang w:val="en-US" w:eastAsia="en-US" w:bidi="ar-SA"/>
+      <w14:ligatures w14:val="standardContextual"/>
     </w:rPr>
   </w:style>
-  <w:style w:type="character" w:default="1" w:styleId="DefaultParagraphFont">
+  <w:style w:type="character" w:default="1" w:styleId="3">
     <w:name w:val="Default Paragraph Font"/>
-    <w:uiPriority w:val="1"/>
     <w:semiHidden/>
     <w:unhideWhenUsed/>
+    <w:qFormat/>
+    <w:uiPriority w:val="1"/>
   </w:style>
-  <w:style w:type="table" w:default="1" w:styleId="TableNormal">
+  <w:style w:type="table" w:default="1" w:styleId="4">
     <w:name w:val="Normal Table"/>
-    <w:uiPriority w:val="99"/>
     <w:semiHidden/>
     <w:unhideWhenUsed/>
+    <w:qFormat/>
+    <w:uiPriority w:val="99"/>
+    <w:pPr>
+      <w:keepNext w:val="0"/>
+      <w:keepLines w:val="0"/>
+      <w:widowControl/>
+      <w:suppressLineNumbers w:val="0"/>
+      <w:spacing w:before="0" w:beforeAutospacing="0" w:after="160" w:afterAutospacing="0" w:line="256" w:lineRule="auto"/>
+      <w:ind w:left="0" w:right="0"/>
+    </w:pPr>
+    <w:rPr>
+      <w:rFonts w:hint="eastAsia" w:ascii="Calibri" w:hAnsi="Calibri" w:cs="Times New Roman"/>
+      <w:sz w:val="22"/>
+      <w:szCs w:val="22"/>
+    </w:rPr>
     <w:tblPr>
-      <w:tblInd w:w="0" w:type="dxa"/>
       <w:tblCellMar>
         <w:top w:w="0" w:type="dxa"/>
         <w:left w:w="108" w:type="dxa"/>
@@ -2076,17 +3642,33 @@
       </w:tblCellMar>
     </w:tblPr>
   </w:style>
-  <w:style w:type="numbering" w:default="1" w:styleId="NoList">
-    <w:name w:val="No List"/>
-    <w:uiPriority w:val="99"/>
+  <w:style w:type="character" w:styleId="5">
+    <w:name w:val="FollowedHyperlink"/>
     <w:semiHidden/>
     <w:unhideWhenUsed/>
+    <w:uiPriority w:val="99"/>
+    <w:rPr>
+      <w:color w:val="954F72"/>
+      <w:u w:val="single"/>
+    </w:rPr>
   </w:style>
-  <w:style w:type="character" w:customStyle="1" w:styleId="Heading1Char">
+  <w:style w:type="character" w:styleId="6">
+    <w:name w:val="Hyperlink"/>
+    <w:semiHidden/>
+    <w:unhideWhenUsed/>
+    <w:uiPriority w:val="99"/>
+    <w:rPr>
+      <w:color w:val="0563C1"/>
+      <w:u w:val="single"/>
+    </w:rPr>
+  </w:style>
+  <w:style w:type="character" w:customStyle="1" w:styleId="7">
     <w:name w:val="Heading 1 Char"/>
-    <w:link w:val="Heading1"/>
+    <w:link w:val="2"/>
+    <w:qFormat/>
+    <w:uiPriority w:val="0"/>
     <w:rPr>
-      <w:rFonts w:ascii="Garamond" w:eastAsia="Garamond" w:hAnsi="Garamond" w:cs="Garamond"/>
+      <w:rFonts w:ascii="Garamond" w:hAnsi="Garamond" w:eastAsia="Garamond" w:cs="Garamond"/>
       <w:b/>
       <w:color w:val="000000"/>
       <w:sz w:val="21"/>
@@ -2138,7 +3720,7 @@
     </a:clrScheme>
     <a:fontScheme name="Office">
       <a:majorFont>
-        <a:latin typeface="Calibri Light" panose="020F0302020204030204"/>
+        <a:latin typeface="Calibri Light"/>
         <a:ea typeface=""/>
         <a:cs typeface=""/>
         <a:font script="Jpan" typeface="游ゴシック Light"/>
@@ -2171,26 +3753,9 @@
         <a:font script="Viet" typeface="Times New Roman"/>
         <a:font script="Uigh" typeface="Microsoft Uighur"/>
         <a:font script="Geor" typeface="Sylfaen"/>
-        <a:font script="Armn" typeface="Arial"/>
-        <a:font script="Bugi" typeface="Leelawadee UI"/>
-        <a:font script="Bopo" typeface="Microsoft JhengHei"/>
-        <a:font script="Java" typeface="Javanese Text"/>
-        <a:font script="Lisu" typeface="Segoe UI"/>
-        <a:font script="Mymr" typeface="Myanmar Text"/>
-        <a:font script="Nkoo" typeface="Ebrima"/>
-        <a:font script="Olck" typeface="Nirmala UI"/>
-        <a:font script="Osma" typeface="Ebrima"/>
-        <a:font script="Phag" typeface="Phagspa"/>
-        <a:font script="Syrn" typeface="Estrangelo Edessa"/>
-        <a:font script="Syrj" typeface="Estrangelo Edessa"/>
-        <a:font script="Syre" typeface="Estrangelo Edessa"/>
-        <a:font script="Sora" typeface="Nirmala UI"/>
-        <a:font script="Tale" typeface="Microsoft Tai Le"/>
-        <a:font script="Talu" typeface="Microsoft New Tai Lue"/>
-        <a:font script="Tfng" typeface="Ebrima"/>
       </a:majorFont>
       <a:minorFont>
-        <a:latin typeface="Calibri" panose="020F0502020204030204"/>
+        <a:latin typeface="Calibri"/>
         <a:ea typeface=""/>
         <a:cs typeface=""/>
         <a:font script="Jpan" typeface="游明朝"/>
@@ -2223,23 +3788,6 @@
         <a:font script="Viet" typeface="Arial"/>
         <a:font script="Uigh" typeface="Microsoft Uighur"/>
         <a:font script="Geor" typeface="Sylfaen"/>
-        <a:font script="Armn" typeface="Arial"/>
-        <a:font script="Bugi" typeface="Leelawadee UI"/>
-        <a:font script="Bopo" typeface="Microsoft JhengHei"/>
-        <a:font script="Java" typeface="Javanese Text"/>
-        <a:font script="Lisu" typeface="Segoe UI"/>
-        <a:font script="Mymr" typeface="Myanmar Text"/>
-        <a:font script="Nkoo" typeface="Ebrima"/>
-        <a:font script="Olck" typeface="Nirmala UI"/>
-        <a:font script="Osma" typeface="Ebrima"/>
-        <a:font script="Phag" typeface="Phagspa"/>
-        <a:font script="Syrn" typeface="Estrangelo Edessa"/>
-        <a:font script="Syrj" typeface="Estrangelo Edessa"/>
-        <a:font script="Syre" typeface="Estrangelo Edessa"/>
-        <a:font script="Sora" typeface="Nirmala UI"/>
-        <a:font script="Tale" typeface="Microsoft Tai Le"/>
-        <a:font script="Talu" typeface="Microsoft New Tai Lue"/>
-        <a:font script="Tfng" typeface="Ebrima"/>
       </a:minorFont>
     </a:fontScheme>
     <a:fmtScheme name="Office">
@@ -2381,11 +3929,22 @@
     </a:fmtScheme>
   </a:themeElements>
   <a:objectDefaults/>
-  <a:extraClrSchemeLst/>
-  <a:extLst>
-    <a:ext uri="{05A4C25C-085E-4340-85A3-A5531E510DB2}">
-      <thm15:themeFamily xmlns:thm15="http://schemas.microsoft.com/office/thememl/2012/main" name="Office Theme" id="{62F939B6-93AF-4DB8-9C6B-D6C7DFDC589F}" vid="{4A3C46E8-61CC-4603-A589-7422A47A8E4A}"/>
-    </a:ext>
-  </a:extLst>
 </a:theme>
+</file>
+
+<file path=customXml/item1.xml><?xml version="1.0" encoding="utf-8"?>
+<s:customData xmlns="http://www.wps.cn/officeDocument/2013/wpsCustomData" xmlns:s="http://www.wps.cn/officeDocument/2013/wpsCustomData">
+  <customSectProps/>
+  <customShpExts>
+    <customShpInfo spid="_x0000_s1026" textRotate="1"/>
+  </customShpExts>
+</s:customData>
+</file>
+
+<file path=customXml/itemProps1.xml><?xml version="1.0" encoding="utf-8"?>
+<ds:datastoreItem xmlns:ds="http://schemas.openxmlformats.org/officeDocument/2006/customXml" ds:itemID="{B1977F7D-205B-4081-913C-38D41E755F92}">
+  <ds:schemaRefs>
+    <ds:schemaRef ds:uri="http://www.wps.cn/officeDocument/2013/wpsCustomData"/>
+  </ds:schemaRefs>
+</ds:datastoreItem>
 </file>
</xml_diff>